<commit_message>
Add Mistral sentiment evaluation artifacts
</commit_message>
<xml_diff>
--- a/Doc/Reaserch Paper.docx
+++ b/Doc/Reaserch Paper.docx
@@ -1,6 +1,6 @@
 
 <file path=word/document.xml><?xml version="1.0" encoding="utf-8"?>
-<w:document xmlns:wpc="http://schemas.microsoft.com/office/word/2010/wordprocessingCanvas" xmlns:cx="http://schemas.microsoft.com/office/drawing/2014/chartex" xmlns:cx1="http://schemas.microsoft.com/office/drawing/2015/9/8/chartex" xmlns:cx2="http://schemas.microsoft.com/office/drawing/2015/10/21/chartex" xmlns:cx3="http://schemas.microsoft.com/office/drawing/2016/5/9/chartex" xmlns:cx4="http://schemas.microsoft.com/office/drawing/2016/5/10/chartex" xmlns:cx5="http://schemas.microsoft.com/office/drawing/2016/5/11/chartex" xmlns:cx6="http://schemas.microsoft.com/office/drawing/2016/5/12/chartex" xmlns:cx7="http://schemas.microsoft.com/office/drawing/2016/5/13/chartex" xmlns:cx8="http://schemas.microsoft.com/office/drawing/2016/5/14/chartex" xmlns:mc="http://schemas.openxmlformats.org/markup-compatibility/2006" xmlns:aink="http://schemas.microsoft.com/office/drawing/2016/ink" xmlns:am3d="http://schemas.microsoft.com/office/drawing/2017/model3d" xmlns:o="urn:schemas-microsoft-com:office:office" xmlns:oel="http://schemas.microsoft.com/office/2019/extlst" xmlns:r="http://schemas.openxmlformats.org/officeDocument/2006/relationships" xmlns:m="http://schemas.openxmlformats.org/officeDocument/2006/math" xmlns:v="urn:schemas-microsoft-com:vml" xmlns:wp14="http://schemas.microsoft.com/office/word/2010/wordprocessingDrawing" xmlns:wp="http://schemas.openxmlformats.org/drawingml/2006/wordprocessingDrawing" xmlns:w10="urn:schemas-microsoft-com:office:word" xmlns:w="http://schemas.openxmlformats.org/wordprocessingml/2006/main" xmlns:w14="http://schemas.microsoft.com/office/word/2010/wordml" xmlns:w15="http://schemas.microsoft.com/office/word/2012/wordml" xmlns:w16cex="http://schemas.microsoft.com/office/word/2018/wordml/cex" xmlns:w16cid="http://schemas.microsoft.com/office/word/2016/wordml/cid" xmlns:w16="http://schemas.microsoft.com/office/word/2018/wordml" xmlns:w16sdtdh="http://schemas.microsoft.com/office/word/2020/wordml/sdtdatahash" xmlns:w16se="http://schemas.microsoft.com/office/word/2015/wordml/symex" xmlns:wpg="http://schemas.microsoft.com/office/word/2010/wordprocessingGroup" xmlns:wpi="http://schemas.microsoft.com/office/word/2010/wordprocessingInk" xmlns:wne="http://schemas.microsoft.com/office/word/2006/wordml" xmlns:wps="http://schemas.microsoft.com/office/word/2010/wordprocessingShape" mc:Ignorable="w14 w15 w16se w16cid w16 w16cex w16sdtdh wp14">
+<w:document xmlns:wpc="http://schemas.microsoft.com/office/word/2010/wordprocessingCanvas" xmlns:cx="http://schemas.microsoft.com/office/drawing/2014/chartex" xmlns:cx1="http://schemas.microsoft.com/office/drawing/2015/9/8/chartex" xmlns:cx2="http://schemas.microsoft.com/office/drawing/2015/10/21/chartex" xmlns:cx3="http://schemas.microsoft.com/office/drawing/2016/5/9/chartex" xmlns:cx4="http://schemas.microsoft.com/office/drawing/2016/5/10/chartex" xmlns:cx5="http://schemas.microsoft.com/office/drawing/2016/5/11/chartex" xmlns:cx6="http://schemas.microsoft.com/office/drawing/2016/5/12/chartex" xmlns:cx7="http://schemas.microsoft.com/office/drawing/2016/5/13/chartex" xmlns:cx8="http://schemas.microsoft.com/office/drawing/2016/5/14/chartex" xmlns:mc="http://schemas.openxmlformats.org/markup-compatibility/2006" xmlns:aink="http://schemas.microsoft.com/office/drawing/2016/ink" xmlns:am3d="http://schemas.microsoft.com/office/drawing/2017/model3d" xmlns:o="urn:schemas-microsoft-com:office:office" xmlns:oel="http://schemas.microsoft.com/office/2019/extlst" xmlns:r="http://schemas.openxmlformats.org/officeDocument/2006/relationships" xmlns:m="http://schemas.openxmlformats.org/officeDocument/2006/math" xmlns:v="urn:schemas-microsoft-com:vml" xmlns:wp14="http://schemas.microsoft.com/office/word/2010/wordprocessingDrawing" xmlns:wp="http://schemas.openxmlformats.org/drawingml/2006/wordprocessingDrawing" xmlns:w10="urn:schemas-microsoft-com:office:word" xmlns:w="http://schemas.openxmlformats.org/wordprocessingml/2006/main" xmlns:w14="http://schemas.microsoft.com/office/word/2010/wordml" xmlns:w15="http://schemas.microsoft.com/office/word/2012/wordml" xmlns:w16cex="http://schemas.microsoft.com/office/word/2018/wordml/cex" xmlns:w16cid="http://schemas.microsoft.com/office/word/2016/wordml/cid" xmlns:w16="http://schemas.microsoft.com/office/word/2018/wordml" xmlns:w16du="http://schemas.microsoft.com/office/word/2023/wordml/word16du" xmlns:w16sdtdh="http://schemas.microsoft.com/office/word/2020/wordml/sdtdatahash" xmlns:w16se="http://schemas.microsoft.com/office/word/2015/wordml/symex" xmlns:wpg="http://schemas.microsoft.com/office/word/2010/wordprocessingGroup" xmlns:wpi="http://schemas.microsoft.com/office/word/2010/wordprocessingInk" xmlns:wne="http://schemas.microsoft.com/office/word/2006/wordml" xmlns:wps="http://schemas.microsoft.com/office/word/2010/wordprocessingShape" mc:Ignorable="w14 w15 w16se w16cid w16 w16cex w16sdtdh w16du wp14">
   <w:body>
     <w:p>
       <w:pPr>
@@ -57,41 +57,13 @@
         <w:rPr>
           <w:lang w:val="en-GB"/>
         </w:rPr>
-        <w:t xml:space="preserve">This study introduces the creation of a synthetic evaluation dataset for Serbian </w:t>
-      </w:r>
-      <w:proofErr w:type="spellStart"/>
-      <w:r>
-        <w:rPr>
-          <w:lang w:val="en-GB"/>
-        </w:rPr>
-        <w:t>SentiWordNet</w:t>
-      </w:r>
-      <w:proofErr w:type="spellEnd"/>
-      <w:r>
-        <w:rPr>
-          <w:lang w:val="en-GB"/>
-        </w:rPr>
-        <w:t xml:space="preserve"> through the application of Large Language Models (LLMs), with a focus on the Mistral model. Confronting the significant scarcity of sentiment analysis resources for the Serbian language, this research endeavours to bridge this gap by generating a dataset that supports the evaluation and improvement of sentiment analysis tools tailored to Serbian. </w:t>
-      </w:r>
-      <w:r>
-        <w:rPr>
-          <w:lang w:val="en-GB"/>
-        </w:rPr>
-        <w:t xml:space="preserve">Within Serbian WordNet, sentiment polarity values were automatically mapped from the English </w:t>
-      </w:r>
-      <w:proofErr w:type="spellStart"/>
-      <w:r>
-        <w:rPr>
-          <w:lang w:val="en-GB"/>
-        </w:rPr>
-        <w:t>SentiWordNet</w:t>
-      </w:r>
-      <w:proofErr w:type="spellEnd"/>
-      <w:r>
-        <w:rPr>
-          <w:lang w:val="en-GB"/>
-        </w:rPr>
-        <w:t xml:space="preserve"> using the Inter-Lingual Index (ILI). To refine these values for better alignment with the Serbian language context, an evaluation set was created.</w:t>
+        <w:t xml:space="preserve">This study introduces the creation of a synthetic evaluation dataset for Serbian SentiWordNet through the application of Large Language Models (LLMs), with a focus on the Mistral model. Confronting the significant scarcity of sentiment analysis resources for the Serbian language, this research endeavours to bridge this gap by generating a dataset that supports the evaluation and improvement of sentiment analysis tools tailored to Serbian. </w:t>
+      </w:r>
+      <w:r>
+        <w:rPr>
+          <w:lang w:val="en-GB"/>
+        </w:rPr>
+        <w:t>Within Serbian WordNet, sentiment polarity values were automatically mapped from the English SentiWordNet using the Inter-Lingual Index (ILI). To refine these values for better alignment with the Serbian language context, an evaluation set was created.</w:t>
       </w:r>
       <w:r>
         <w:rPr>
@@ -105,34 +77,14 @@
         </w:rPr>
         <w:t xml:space="preserve">Employing a rigorous methodology, 500 synsets were initially selected from Serbian WordNet based on their alignment with the </w:t>
       </w:r>
-      <w:proofErr w:type="spellStart"/>
       <w:r>
         <w:rPr>
           <w:i/>
           <w:iCs/>
           <w:lang w:val="en-GB"/>
         </w:rPr>
-        <w:t>senti</w:t>
-      </w:r>
-      <w:proofErr w:type="spellEnd"/>
-      <w:r>
-        <w:rPr>
-          <w:i/>
-          <w:iCs/>
-          <w:lang w:val="en-GB"/>
-        </w:rPr>
-        <w:t>-pol-</w:t>
-      </w:r>
-      <w:proofErr w:type="spellStart"/>
-      <w:r>
-        <w:rPr>
-          <w:i/>
-          <w:iCs/>
-          <w:lang w:val="en-GB"/>
-        </w:rPr>
-        <w:t>sr</w:t>
-      </w:r>
-      <w:proofErr w:type="spellEnd"/>
+        <w:t>senti-pol-sr</w:t>
+      </w:r>
       <w:r>
         <w:rPr>
           <w:lang w:val="en-GB"/>
@@ -145,14 +97,12 @@
         </w:rPr>
         <w:t xml:space="preserve"> and values mapped from </w:t>
       </w:r>
-      <w:proofErr w:type="spellStart"/>
       <w:r>
         <w:rPr>
           <w:lang w:val="en-GB"/>
         </w:rPr>
         <w:t>SentiWordNet</w:t>
       </w:r>
-      <w:proofErr w:type="spellEnd"/>
       <w:r>
         <w:rPr>
           <w:lang w:val="en-GB"/>
@@ -405,21 +355,7 @@
         <w:rPr>
           <w:lang w:val="en-GB"/>
         </w:rPr>
-        <w:t xml:space="preserve">Synsets containing the same meanings in different languages are interconnected through the Inter-Lingual Index (ILI), enabling these associations in various languages' </w:t>
-      </w:r>
-      <w:proofErr w:type="spellStart"/>
-      <w:r>
-        <w:rPr>
-          <w:lang w:val="en-GB"/>
-        </w:rPr>
-        <w:t>WordNets</w:t>
-      </w:r>
-      <w:proofErr w:type="spellEnd"/>
-      <w:r>
-        <w:rPr>
-          <w:lang w:val="en-GB"/>
-        </w:rPr>
-        <w:t>.</w:t>
+        <w:t>Synsets containing the same meanings in different languages are interconnected through the Inter-Lingual Index (ILI), enabling these associations in various languages' WordNets.</w:t>
       </w:r>
     </w:p>
     <w:p>
@@ -1027,21 +963,7 @@
         <w:rPr>
           <w:lang w:val="en-GB"/>
         </w:rPr>
-        <w:t xml:space="preserve">The proposed solution entails the creation of a synthetic dataset comprising synsets annotated by </w:t>
-      </w:r>
-      <w:proofErr w:type="gramStart"/>
-      <w:r>
-        <w:rPr>
-          <w:lang w:val="en-GB"/>
-        </w:rPr>
-        <w:t>a</w:t>
-      </w:r>
-      <w:proofErr w:type="gramEnd"/>
-      <w:r>
-        <w:rPr>
-          <w:lang w:val="en-GB"/>
-        </w:rPr>
-        <w:t xml:space="preserve"> LLM. The primary motivation behind this approach is to enhance the existing sentiment values in Serbian WordNet, particularly targeting synsets whose corresponding words are identified with specific polarity in a sentiment lexicon derived from Serbian corpora but are mapped as purely objective in sentiment.</w:t>
+        <w:t>The proposed solution entails the creation of a synthetic dataset comprising synsets annotated by a LLM. The primary motivation behind this approach is to enhance the existing sentiment values in Serbian WordNet, particularly targeting synsets whose corresponding words are identified with specific polarity in a sentiment lexicon derived from Serbian corpora but are mapped as purely objective in sentiment.</w:t>
       </w:r>
     </w:p>
     <w:p>
@@ -1074,21 +996,7 @@
         <w:rPr>
           <w:lang w:val="en-GB"/>
         </w:rPr>
-        <w:t xml:space="preserve">The results underwent a manual annotation process, where each synset, along with the values returned by the LLM, was </w:t>
-      </w:r>
-      <w:proofErr w:type="gramStart"/>
-      <w:r>
-        <w:rPr>
-          <w:lang w:val="en-GB"/>
-        </w:rPr>
-        <w:t>assessed</w:t>
-      </w:r>
-      <w:proofErr w:type="gramEnd"/>
-      <w:r>
-        <w:rPr>
-          <w:lang w:val="en-GB"/>
-        </w:rPr>
-        <w:t xml:space="preserve"> and assigned a simple 'pass' or 'fail' grade based on their alignment with the expected sentiment annotations.</w:t>
+        <w:t>The results underwent a manual annotation process, where each synset, along with the values returned by the LLM, was assessed and assigned a simple 'pass' or 'fail' grade based on their alignment with the expected sentiment annotations.</w:t>
       </w:r>
     </w:p>
     <w:p>
@@ -1163,21 +1071,7 @@
         <w:rPr>
           <w:lang w:val="en-GB"/>
         </w:rPr>
-        <w:t xml:space="preserve">That </w:t>
-      </w:r>
-      <w:proofErr w:type="spellStart"/>
-      <w:r>
-        <w:rPr>
-          <w:lang w:val="en-GB"/>
-        </w:rPr>
-        <w:t>fine tuned</w:t>
-      </w:r>
-      <w:proofErr w:type="spellEnd"/>
-      <w:r>
-        <w:rPr>
-          <w:lang w:val="en-GB"/>
-        </w:rPr>
-        <w:t xml:space="preserve"> variant of </w:t>
+        <w:t xml:space="preserve">That fine tuned variant of </w:t>
       </w:r>
       <w:r>
         <w:rPr>
@@ -1185,35 +1079,45 @@
           <w:bCs/>
           <w:lang w:val="en-GB"/>
         </w:rPr>
-        <w:t>Mistral 7</w:t>
-      </w:r>
-      <w:proofErr w:type="gramStart"/>
+        <w:t>Mistral 7B</w:t>
+      </w:r>
+      <w:r>
+        <w:rPr>
+          <w:lang w:val="en-GB"/>
+        </w:rPr>
+        <w:t>,</w:t>
+      </w:r>
+      <w:r>
+        <w:rPr>
+          <w:lang w:val="en-GB"/>
+        </w:rPr>
+        <w:t xml:space="preserve">  a 7-billion-parameter language model designed for superior performance and efficiency.</w:t>
+      </w:r>
+      <w:r>
+        <w:rPr>
+          <w:lang w:val="en-GB"/>
+        </w:rPr>
+        <w:t xml:space="preserve"> </w:t>
+      </w:r>
+      <w:r>
+        <w:rPr>
+          <w:lang w:val="en-GB"/>
+        </w:rPr>
+        <w:t xml:space="preserve">It outperforms the </w:t>
+      </w:r>
       <w:r>
         <w:rPr>
           <w:b/>
           <w:bCs/>
           <w:lang w:val="en-GB"/>
         </w:rPr>
-        <w:t>B</w:t>
-      </w:r>
-      <w:r>
-        <w:rPr>
-          <w:lang w:val="en-GB"/>
-        </w:rPr>
-        <w:t>,</w:t>
-      </w:r>
-      <w:r>
-        <w:rPr>
-          <w:lang w:val="en-GB"/>
-        </w:rPr>
-        <w:t xml:space="preserve">  a</w:t>
-      </w:r>
-      <w:proofErr w:type="gramEnd"/>
-      <w:r>
-        <w:rPr>
-          <w:lang w:val="en-GB"/>
-        </w:rPr>
-        <w:t xml:space="preserve"> 7-billion-parameter language model designed for superior performance and efficiency.</w:t>
+        <w:t>Llama 2 13B</w:t>
+      </w:r>
+      <w:r>
+        <w:rPr>
+          <w:lang w:val="en-GB"/>
+        </w:rPr>
+        <w:t xml:space="preserve"> model across various benchmarks.</w:t>
       </w:r>
       <w:r>
         <w:rPr>
@@ -1225,7 +1129,7 @@
         <w:rPr>
           <w:lang w:val="en-GB"/>
         </w:rPr>
-        <w:t xml:space="preserve">It outperforms the </w:t>
+        <w:t xml:space="preserve">Notably, it surpasses </w:t>
       </w:r>
       <w:r>
         <w:rPr>
@@ -1233,13 +1137,13 @@
           <w:bCs/>
           <w:lang w:val="en-GB"/>
         </w:rPr>
-        <w:t>Llama 2 13B</w:t>
-      </w:r>
-      <w:r>
-        <w:rPr>
-          <w:lang w:val="en-GB"/>
-        </w:rPr>
-        <w:t xml:space="preserve"> model across various benchmarks.</w:t>
+        <w:t>Llama 1 34B</w:t>
+      </w:r>
+      <w:r>
+        <w:rPr>
+          <w:lang w:val="en-GB"/>
+        </w:rPr>
+        <w:t xml:space="preserve"> in reasoning, mathematics, and code generation</w:t>
       </w:r>
       <w:r>
         <w:rPr>
@@ -1251,7 +1155,50 @@
         <w:rPr>
           <w:lang w:val="en-GB"/>
         </w:rPr>
-        <w:t xml:space="preserve">Notably, it surpasses </w:t>
+        <w:fldChar w:fldCharType="begin"/>
+      </w:r>
+      <w:r>
+        <w:rPr>
+          <w:lang w:val="en-GB"/>
+        </w:rPr>
+        <w:instrText xml:space="preserve"> ADDIN ZOTERO_ITEM CSL_CITATION {"citationID":"wN2Gqb2s","properties":{"formattedCitation":"(Jiang et al., 2023)","plainCitation":"(Jiang et al., 2023)","noteIndex":0},"citationItems":[{"id":144,"uris":["http://zotero.org/users/11870508/items/9HVKF5CE"],"itemData":{"id":144,"type":"document","note":"_eprint: 2310.06825","title":"Mistral 7B","author":[{"family":"Jiang","given":"Albert Q."},{"family":"Sablayrolles","given":"Alexandre"},{"family":"Mensch","given":"Arthur"},{"family":"Bamford","given":"Chris"},{"family":"Chaplot","given":"Devendra Singh"},{"family":"Casas","given":"Diego","dropping-particle":"de las"},{"family":"Bressand","given":"Florian"},{"family":"Lengyel","given":"Gianna"},{"family":"Lample","given":"Guillaume"},{"family":"Saulnier","given":"Lucile"},{"family":"Lavaud","given":"Lélio Renard"},{"family":"Lachaux","given":"Marie-Anne"},{"family":"Stock","given":"Pierre"},{"family":"Scao","given":"Teven Le"},{"family":"Lavril","given":"Thibaut"},{"family":"Wang","given":"Thomas"},{"family":"Lacroix","given":"Timothée"},{"family":"Sayed","given":"William El"}],"issued":{"date-parts":[["2023"]]}}}],"schema":"https://github.com/citation-style-language/schema/raw/master/csl-citation.json"} </w:instrText>
+      </w:r>
+      <w:r>
+        <w:rPr>
+          <w:lang w:val="en-GB"/>
+        </w:rPr>
+        <w:fldChar w:fldCharType="separate"/>
+      </w:r>
+      <w:r>
+        <w:rPr>
+          <w:rFonts w:ascii="Calibri" w:hAnsi="Calibri" w:cs="Calibri"/>
+        </w:rPr>
+        <w:t>(Jiang et al., 2023)</w:t>
+      </w:r>
+      <w:r>
+        <w:rPr>
+          <w:lang w:val="en-GB"/>
+        </w:rPr>
+        <w:fldChar w:fldCharType="end"/>
+      </w:r>
+      <w:r>
+        <w:rPr>
+          <w:lang w:val="en-GB"/>
+        </w:rPr>
+        <w:t>.</w:t>
+      </w:r>
+    </w:p>
+    <w:p>
+      <w:pPr>
+        <w:rPr>
+          <w:lang w:val="en-GB"/>
+        </w:rPr>
+      </w:pPr>
+      <w:r>
+        <w:rPr>
+          <w:lang w:val="en-GB"/>
+        </w:rPr>
+        <w:t xml:space="preserve">The variant used here, </w:t>
       </w:r>
       <w:r>
         <w:rPr>
@@ -1259,68 +1206,7 @@
           <w:bCs/>
           <w:lang w:val="en-GB"/>
         </w:rPr>
-        <w:t>Llama 1 34B</w:t>
-      </w:r>
-      <w:r>
-        <w:rPr>
-          <w:lang w:val="en-GB"/>
-        </w:rPr>
-        <w:t xml:space="preserve"> in reasoning, mathematics, and code generation</w:t>
-      </w:r>
-      <w:r>
-        <w:rPr>
-          <w:lang w:val="en-GB"/>
-        </w:rPr>
-        <w:t xml:space="preserve"> </w:t>
-      </w:r>
-      <w:r>
-        <w:rPr>
-          <w:lang w:val="en-GB"/>
-        </w:rPr>
-        <w:fldChar w:fldCharType="begin"/>
-      </w:r>
-      <w:r>
-        <w:rPr>
-          <w:lang w:val="en-GB"/>
-        </w:rPr>
-        <w:instrText xml:space="preserve"> ADDIN ZOTERO_ITEM CSL_CITATION {"citationID":"wN2Gqb2s","properties":{"formattedCitation":"(Jiang et al., 2023)","plainCitation":"(Jiang et al., 2023)","noteIndex":0},"citationItems":[{"id":144,"uris":["http://zotero.org/users/11870508/items/9HVKF5CE"],"itemData":{"id":144,"type":"document","note":"_eprint: 2310.06825","title":"Mistral 7B","author":[{"family":"Jiang","given":"Albert Q."},{"family":"Sablayrolles","given":"Alexandre"},{"family":"Mensch","given":"Arthur"},{"family":"Bamford","given":"Chris"},{"family":"Chaplot","given":"Devendra Singh"},{"family":"Casas","given":"Diego","dropping-particle":"de las"},{"family":"Bressand","given":"Florian"},{"family":"Lengyel","given":"Gianna"},{"family":"Lample","given":"Guillaume"},{"family":"Saulnier","given":"Lucile"},{"family":"Lavaud","given":"Lélio Renard"},{"family":"Lachaux","given":"Marie-Anne"},{"family":"Stock","given":"Pierre"},{"family":"Scao","given":"Teven Le"},{"family":"Lavril","given":"Thibaut"},{"family":"Wang","given":"Thomas"},{"family":"Lacroix","given":"Timothée"},{"family":"Sayed","given":"William El"}],"issued":{"date-parts":[["2023"]]}}}],"schema":"https://github.com/citation-style-language/schema/raw/master/csl-citation.json"} </w:instrText>
-      </w:r>
-      <w:r>
-        <w:rPr>
-          <w:lang w:val="en-GB"/>
-        </w:rPr>
-        <w:fldChar w:fldCharType="separate"/>
-      </w:r>
-      <w:r>
-        <w:rPr>
-          <w:rFonts w:ascii="Calibri" w:hAnsi="Calibri" w:cs="Calibri"/>
-        </w:rPr>
-        <w:t>(Jiang et al., 2023)</w:t>
-      </w:r>
-      <w:r>
-        <w:rPr>
-          <w:lang w:val="en-GB"/>
-        </w:rPr>
-        <w:fldChar w:fldCharType="end"/>
-      </w:r>
-      <w:r>
-        <w:rPr>
-          <w:lang w:val="en-GB"/>
-        </w:rPr>
-        <w:t>.</w:t>
-      </w:r>
-    </w:p>
-    <w:p>
-      <w:pPr>
-        <w:rPr>
-          <w:lang w:val="en-GB"/>
-        </w:rPr>
-      </w:pPr>
-      <w:r>
-        <w:rPr>
-          <w:lang w:val="en-GB"/>
-        </w:rPr>
-        <w:t xml:space="preserve">The variant used here, </w:t>
+        <w:t>Mistral 7B – Instruct</w:t>
       </w:r>
       <w:r>
         <w:rPr>
@@ -1328,7 +1214,19 @@
           <w:bCs/>
           <w:lang w:val="en-GB"/>
         </w:rPr>
-        <w:t>Mistral 7B – Instruct</w:t>
+        <w:t>,</w:t>
+      </w:r>
+      <w:r>
+        <w:rPr>
+          <w:lang w:val="en-GB"/>
+        </w:rPr>
+        <w:t xml:space="preserve"> also outperforms </w:t>
+      </w:r>
+      <w:r>
+        <w:rPr>
+          <w:lang w:val="en-GB"/>
+        </w:rPr>
+        <w:t xml:space="preserve">the </w:t>
       </w:r>
       <w:r>
         <w:rPr>
@@ -1336,19 +1234,144 @@
           <w:bCs/>
           <w:lang w:val="en-GB"/>
         </w:rPr>
-        <w:t>,</w:t>
-      </w:r>
-      <w:r>
-        <w:rPr>
-          <w:lang w:val="en-GB"/>
-        </w:rPr>
-        <w:t xml:space="preserve"> also outperforms </w:t>
-      </w:r>
-      <w:r>
-        <w:rPr>
-          <w:lang w:val="en-GB"/>
-        </w:rPr>
-        <w:t xml:space="preserve">the </w:t>
+        <w:t>Llama 2 13B – Chat</w:t>
+      </w:r>
+      <w:r>
+        <w:rPr>
+          <w:lang w:val="en-GB"/>
+        </w:rPr>
+        <w:t xml:space="preserve"> model on both human and automated benchmarks</w:t>
+      </w:r>
+      <w:r>
+        <w:rPr>
+          <w:lang w:val="en-GB"/>
+        </w:rPr>
+        <w:t xml:space="preserve"> </w:t>
+      </w:r>
+      <w:r>
+        <w:rPr>
+          <w:lang w:val="en-GB"/>
+        </w:rPr>
+        <w:fldChar w:fldCharType="begin"/>
+      </w:r>
+      <w:r>
+        <w:rPr>
+          <w:lang w:val="en-GB"/>
+        </w:rPr>
+        <w:instrText xml:space="preserve"> ADDIN ZOTERO_ITEM CSL_CITATION {"citationID":"5hOYkBd8","properties":{"formattedCitation":"(Jiang et al., 2023)","plainCitation":"(Jiang et al., 2023)","noteIndex":0},"citationItems":[{"id":144,"uris":["http://zotero.org/users/11870508/items/9HVKF5CE"],"itemData":{"id":144,"type":"document","note":"_eprint: 2310.06825","title":"Mistral 7B","author":[{"family":"Jiang","given":"Albert Q."},{"family":"Sablayrolles","given":"Alexandre"},{"family":"Mensch","given":"Arthur"},{"family":"Bamford","given":"Chris"},{"family":"Chaplot","given":"Devendra Singh"},{"family":"Casas","given":"Diego","dropping-particle":"de las"},{"family":"Bressand","given":"Florian"},{"family":"Lengyel","given":"Gianna"},{"family":"Lample","given":"Guillaume"},{"family":"Saulnier","given":"Lucile"},{"family":"Lavaud","given":"Lélio Renard"},{"family":"Lachaux","given":"Marie-Anne"},{"family":"Stock","given":"Pierre"},{"family":"Scao","given":"Teven Le"},{"family":"Lavril","given":"Thibaut"},{"family":"Wang","given":"Thomas"},{"family":"Lacroix","given":"Timothée"},{"family":"Sayed","given":"William El"}],"issued":{"date-parts":[["2023"]]}}}],"schema":"https://github.com/citation-style-language/schema/raw/master/csl-citation.json"} </w:instrText>
+      </w:r>
+      <w:r>
+        <w:rPr>
+          <w:lang w:val="en-GB"/>
+        </w:rPr>
+        <w:fldChar w:fldCharType="separate"/>
+      </w:r>
+      <w:r>
+        <w:rPr>
+          <w:rFonts w:ascii="Calibri" w:hAnsi="Calibri" w:cs="Calibri"/>
+        </w:rPr>
+        <w:t>(Jiang et al., 2023)</w:t>
+      </w:r>
+      <w:r>
+        <w:rPr>
+          <w:lang w:val="en-GB"/>
+        </w:rPr>
+        <w:fldChar w:fldCharType="end"/>
+      </w:r>
+      <w:r>
+        <w:rPr>
+          <w:lang w:val="en-GB"/>
+        </w:rPr>
+        <w:t>.</w:t>
+      </w:r>
+    </w:p>
+    <w:p>
+      <w:pPr>
+        <w:rPr>
+          <w:lang w:val="en-GB"/>
+        </w:rPr>
+      </w:pPr>
+      <w:r>
+        <w:rPr>
+          <w:lang w:val="en-GB"/>
+        </w:rPr>
+        <w:t>Released under the Apache 2.0 license, the model offers a flexible tool for researchers, with the capability of being run locally without incurring costs</w:t>
+      </w:r>
+      <w:r>
+        <w:rPr>
+          <w:lang w:val="en-GB"/>
+        </w:rPr>
+        <w:t xml:space="preserve"> </w:t>
+      </w:r>
+      <w:r>
+        <w:rPr>
+          <w:lang w:val="en-GB"/>
+        </w:rPr>
+        <w:fldChar w:fldCharType="begin"/>
+      </w:r>
+      <w:r>
+        <w:rPr>
+          <w:lang w:val="en-GB"/>
+        </w:rPr>
+        <w:instrText xml:space="preserve"> ADDIN ZOTERO_ITEM CSL_CITATION {"citationID":"ebTJBTvL","properties":{"formattedCitation":"(Jiang et al., 2023)","plainCitation":"(Jiang et al., 2023)","noteIndex":0},"citationItems":[{"id":144,"uris":["http://zotero.org/users/11870508/items/9HVKF5CE"],"itemData":{"id":144,"type":"document","note":"_eprint: 2310.06825","title":"Mistral 7B","author":[{"family":"Jiang","given":"Albert Q."},{"family":"Sablayrolles","given":"Alexandre"},{"family":"Mensch","given":"Arthur"},{"family":"Bamford","given":"Chris"},{"family":"Chaplot","given":"Devendra Singh"},{"family":"Casas","given":"Diego","dropping-particle":"de las"},{"family":"Bressand","given":"Florian"},{"family":"Lengyel","given":"Gianna"},{"family":"Lample","given":"Guillaume"},{"family":"Saulnier","given":"Lucile"},{"family":"Lavaud","given":"Lélio Renard"},{"family":"Lachaux","given":"Marie-Anne"},{"family":"Stock","given":"Pierre"},{"family":"Scao","given":"Teven Le"},{"family":"Lavril","given":"Thibaut"},{"family":"Wang","given":"Thomas"},{"family":"Lacroix","given":"Timothée"},{"family":"Sayed","given":"William El"}],"issued":{"date-parts":[["2023"]]}}}],"schema":"https://github.com/citation-style-language/schema/raw/master/csl-citation.json"} </w:instrText>
+      </w:r>
+      <w:r>
+        <w:rPr>
+          <w:lang w:val="en-GB"/>
+        </w:rPr>
+        <w:fldChar w:fldCharType="separate"/>
+      </w:r>
+      <w:r>
+        <w:rPr>
+          <w:rFonts w:ascii="Calibri" w:hAnsi="Calibri" w:cs="Calibri"/>
+        </w:rPr>
+        <w:t>(Jiang et al., 2023)</w:t>
+      </w:r>
+      <w:r>
+        <w:rPr>
+          <w:lang w:val="en-GB"/>
+        </w:rPr>
+        <w:fldChar w:fldCharType="end"/>
+      </w:r>
+      <w:r>
+        <w:rPr>
+          <w:lang w:val="en-GB"/>
+        </w:rPr>
+        <w:t>.</w:t>
+      </w:r>
+    </w:p>
+    <w:p>
+      <w:pPr>
+        <w:rPr>
+          <w:lang w:val="en-GB"/>
+        </w:rPr>
+      </w:pPr>
+    </w:p>
+    <w:p>
+      <w:pPr>
+        <w:pStyle w:val="Heading1"/>
+        <w:rPr>
+          <w:lang w:val="en-GB"/>
+        </w:rPr>
+      </w:pPr>
+      <w:r>
+        <w:rPr>
+          <w:lang w:val="en-GB"/>
+        </w:rPr>
+        <w:t>Methodology</w:t>
+      </w:r>
+    </w:p>
+    <w:p>
+      <w:pPr>
+        <w:rPr>
+          <w:lang w:val="en-GB"/>
+        </w:rPr>
+      </w:pPr>
+      <w:r>
+        <w:rPr>
+          <w:lang w:val="en-GB"/>
+        </w:rPr>
+        <w:t xml:space="preserve">The </w:t>
       </w:r>
       <w:r>
         <w:rPr>
@@ -1356,19 +1379,13 @@
           <w:bCs/>
           <w:lang w:val="en-GB"/>
         </w:rPr>
-        <w:t>Llama 2 13B – Chat</w:t>
-      </w:r>
-      <w:r>
-        <w:rPr>
-          <w:lang w:val="en-GB"/>
-        </w:rPr>
-        <w:t xml:space="preserve"> model on both human and automated benchmarks</w:t>
-      </w:r>
-      <w:r>
-        <w:rPr>
-          <w:lang w:val="en-GB"/>
-        </w:rPr>
-        <w:t xml:space="preserve"> </w:t>
+        <w:t>senti-pol-sr</w:t>
+      </w:r>
+      <w:r>
+        <w:rPr>
+          <w:lang w:val="en-GB"/>
+        </w:rPr>
+        <w:t xml:space="preserve"> is a polarity lexicon for the Serbian language, annotated at the word level rather than by senses</w:t>
       </w:r>
       <w:r>
         <w:rPr>
@@ -1380,7 +1397,7 @@
         <w:rPr>
           <w:lang w:val="en-GB"/>
         </w:rPr>
-        <w:instrText xml:space="preserve"> ADDIN ZOTERO_ITEM CSL_CITATION {"citationID":"5hOYkBd8","properties":{"formattedCitation":"(Jiang et al., 2023)","plainCitation":"(Jiang et al., 2023)","noteIndex":0},"citationItems":[{"id":144,"uris":["http://zotero.org/users/11870508/items/9HVKF5CE"],"itemData":{"id":144,"type":"document","note":"_eprint: 2310.06825","title":"Mistral 7B","author":[{"family":"Jiang","given":"Albert Q."},{"family":"Sablayrolles","given":"Alexandre"},{"family":"Mensch","given":"Arthur"},{"family":"Bamford","given":"Chris"},{"family":"Chaplot","given":"Devendra Singh"},{"family":"Casas","given":"Diego","dropping-particle":"de las"},{"family":"Bressand","given":"Florian"},{"family":"Lengyel","given":"Gianna"},{"family":"Lample","given":"Guillaume"},{"family":"Saulnier","given":"Lucile"},{"family":"Lavaud","given":"Lélio Renard"},{"family":"Lachaux","given":"Marie-Anne"},{"family":"Stock","given":"Pierre"},{"family":"Scao","given":"Teven Le"},{"family":"Lavril","given":"Thibaut"},{"family":"Wang","given":"Thomas"},{"family":"Lacroix","given":"Timothée"},{"family":"Sayed","given":"William El"}],"issued":{"date-parts":[["2023"]]}}}],"schema":"https://github.com/citation-style-language/schema/raw/master/csl-citation.json"} </w:instrText>
+        <w:instrText xml:space="preserve"> ADDIN ZOTERO_ITEM CSL_CITATION {"citationID":"3eTKqVGe","properties":{"formattedCitation":"(Stankovi\\uc0\\u263{} et al., 2022)","plainCitation":"(Stanković et al., 2022)","noteIndex":0},"citationItems":[{"id":55,"uris":["http://zotero.org/users/11870508/items/RA5ZYR82"],"itemData":{"id":55,"type":"paper-conference","abstract":"In this paper we present first study of Sentiment Analysis (SA) of Serbian novels from the 1840-1920 period. The preparation of sentiment lexicon was based on three existing lexicons: NRC, AFFIN and Bing with additional extensive corrections. The first phase of dataset refinement included filtering the word that are not found in Serbian morphological dictionary and in second automatic POS tagging and lemma were manually corrected. The polarity lexicon was extracted and transformed into ontolex-lemon and published as initial version. The complex inflection system of Serbian language required expansion of sentiment lexicon with inflected forms from Serbian morphological dictionaries. Set of sentences for SA was extracted from 120 novels of Serbian part of ELTeC collection, labelled for polarity and used for several model training. Several approaches for SA are compared, starting with for variation of lexicon based and followed by Logistic Regression, Naive Bayes, Decision Tree, Random Forest, SVN and k-NN. The comparison with models trained on labelled movie reviews dataset indicates that it can not successfully be used for sentiment analysis of sentences in old novels.","container-title":"Proceedings of the 2nd Workshop on Sentiment Analysis and Linguistic Linked Data","event-place":"Marseille, France","event-title":"SALLD 2022","page":"31–38","publisher":"European Language Resources Association","publisher-place":"Marseille, France","source":"ACLWeb","title":"Sentiment Analysis of Serbian Old Novels","URL":"https://aclanthology.org/2022.salld-1.6","author":[{"family":"Stanković","given":"Ranka"},{"family":"Košprdić","given":"Miloš"},{"family":"Ikonić Nešić","given":"Milica"},{"family":"Radović","given":"Tijana"}],"accessed":{"date-parts":[["2023",8,21]]},"issued":{"date-parts":[["2022",6]]}}}],"schema":"https://github.com/citation-style-language/schema/raw/master/csl-citation.json"} </w:instrText>
       </w:r>
       <w:r>
         <w:rPr>
@@ -1391,8 +1408,9 @@
       <w:r>
         <w:rPr>
           <w:rFonts w:ascii="Calibri" w:hAnsi="Calibri" w:cs="Calibri"/>
-        </w:rPr>
-        <w:t>(Jiang et al., 2023)</w:t>
+          <w:kern w:val="0"/>
+        </w:rPr>
+        <w:t>(Stanković et al., 2022)</w:t>
       </w:r>
       <w:r>
         <w:rPr>
@@ -1404,130 +1422,153 @@
         <w:rPr>
           <w:lang w:val="en-GB"/>
         </w:rPr>
-        <w:t>.</w:t>
-      </w:r>
-    </w:p>
-    <w:p>
-      <w:pPr>
-        <w:rPr>
-          <w:lang w:val="en-GB"/>
-        </w:rPr>
-      </w:pPr>
-      <w:r>
-        <w:rPr>
-          <w:lang w:val="en-GB"/>
-        </w:rPr>
-        <w:t>Released under the Apache 2.0 license, the model offers a flexible tool for researchers, with the capability of being run locally without incurring costs</w:t>
-      </w:r>
-      <w:r>
-        <w:rPr>
-          <w:lang w:val="en-GB"/>
-        </w:rPr>
-        <w:t xml:space="preserve"> </w:t>
-      </w:r>
-      <w:r>
-        <w:rPr>
-          <w:lang w:val="en-GB"/>
-        </w:rPr>
-        <w:fldChar w:fldCharType="begin"/>
-      </w:r>
-      <w:r>
-        <w:rPr>
-          <w:lang w:val="en-GB"/>
-        </w:rPr>
-        <w:instrText xml:space="preserve"> ADDIN ZOTERO_ITEM CSL_CITATION {"citationID":"ebTJBTvL","properties":{"formattedCitation":"(Jiang et al., 2023)","plainCitation":"(Jiang et al., 2023)","noteIndex":0},"citationItems":[{"id":144,"uris":["http://zotero.org/users/11870508/items/9HVKF5CE"],"itemData":{"id":144,"type":"document","note":"_eprint: 2310.06825","title":"Mistral 7B","author":[{"family":"Jiang","given":"Albert Q."},{"family":"Sablayrolles","given":"Alexandre"},{"family":"Mensch","given":"Arthur"},{"family":"Bamford","given":"Chris"},{"family":"Chaplot","given":"Devendra Singh"},{"family":"Casas","given":"Diego","dropping-particle":"de las"},{"family":"Bressand","given":"Florian"},{"family":"Lengyel","given":"Gianna"},{"family":"Lample","given":"Guillaume"},{"family":"Saulnier","given":"Lucile"},{"family":"Lavaud","given":"Lélio Renard"},{"family":"Lachaux","given":"Marie-Anne"},{"family":"Stock","given":"Pierre"},{"family":"Scao","given":"Teven Le"},{"family":"Lavril","given":"Thibaut"},{"family":"Wang","given":"Thomas"},{"family":"Lacroix","given":"Timothée"},{"family":"Sayed","given":"William El"}],"issued":{"date-parts":[["2023"]]}}}],"schema":"https://github.com/citation-style-language/schema/raw/master/csl-citation.json"} </w:instrText>
-      </w:r>
-      <w:r>
-        <w:rPr>
-          <w:lang w:val="en-GB"/>
-        </w:rPr>
-        <w:fldChar w:fldCharType="separate"/>
-      </w:r>
-      <w:r>
-        <w:rPr>
-          <w:rFonts w:ascii="Calibri" w:hAnsi="Calibri" w:cs="Calibri"/>
-        </w:rPr>
-        <w:t>(Jiang et al., 2023)</w:t>
-      </w:r>
-      <w:r>
-        <w:rPr>
-          <w:lang w:val="en-GB"/>
-        </w:rPr>
-        <w:fldChar w:fldCharType="end"/>
-      </w:r>
-      <w:r>
-        <w:rPr>
-          <w:lang w:val="en-GB"/>
-        </w:rPr>
-        <w:t>.</w:t>
-      </w:r>
-    </w:p>
-    <w:p>
-      <w:pPr>
-        <w:rPr>
-          <w:lang w:val="en-GB"/>
-        </w:rPr>
-      </w:pPr>
-    </w:p>
-    <w:p>
-      <w:pPr>
-        <w:pStyle w:val="Heading1"/>
-        <w:rPr>
-          <w:lang w:val="en-GB"/>
-        </w:rPr>
-      </w:pPr>
-      <w:r>
-        <w:rPr>
-          <w:lang w:val="en-GB"/>
-        </w:rPr>
-        <w:t>Methodology</w:t>
-      </w:r>
-    </w:p>
-    <w:p>
-      <w:pPr>
-        <w:rPr>
-          <w:lang w:val="en-GB"/>
-        </w:rPr>
-      </w:pPr>
-      <w:r>
-        <w:rPr>
-          <w:lang w:val="en-GB"/>
-        </w:rPr>
-        <w:t xml:space="preserve">The </w:t>
-      </w:r>
-      <w:proofErr w:type="spellStart"/>
+        <w:t xml:space="preserve">. </w:t>
+      </w:r>
+      <w:r>
+        <w:rPr>
+          <w:lang w:val="en-GB"/>
+        </w:rPr>
+        <w:t>It includes words that exhibit clear polarity, categorized as either positive or negative, and does not contain words considered to be objective.</w:t>
+      </w:r>
+    </w:p>
+    <w:p>
+      <w:pPr>
+        <w:rPr>
+          <w:lang w:val="en-GB"/>
+        </w:rPr>
+      </w:pPr>
+      <w:r>
+        <w:rPr>
+          <w:lang w:val="en-GB"/>
+        </w:rPr>
+        <w:t>In this research, the lexicon was employed to select a sample suitable for annotation</w:t>
+      </w:r>
+      <w:r>
+        <w:rPr>
+          <w:lang w:val="en-GB"/>
+        </w:rPr>
+        <w:t xml:space="preserve"> by LMM</w:t>
+      </w:r>
+      <w:r>
+        <w:rPr>
+          <w:lang w:val="en-GB"/>
+        </w:rPr>
+        <w:t xml:space="preserve">. This was achieved by identifying all synsets from the Serbian WordNet containing literals (words) present in the </w:t>
+      </w:r>
       <w:r>
         <w:rPr>
           <w:b/>
           <w:bCs/>
           <w:lang w:val="en-GB"/>
         </w:rPr>
-        <w:t>senti</w:t>
-      </w:r>
-      <w:proofErr w:type="spellEnd"/>
+        <w:t xml:space="preserve">senti-pol-sr </w:t>
+      </w:r>
+      <w:r>
+        <w:rPr>
+          <w:lang w:val="en-GB"/>
+        </w:rPr>
+        <w:t>lexicon and simultaneously having a neutral sentiment value (0,0) as mapped from SWN.</w:t>
+      </w:r>
+    </w:p>
+    <w:p>
+      <w:pPr>
+        <w:rPr>
+          <w:lang w:val="en-GB"/>
+        </w:rPr>
+      </w:pPr>
+      <w:r>
+        <w:rPr>
+          <w:lang w:val="en-GB"/>
+        </w:rPr>
+        <w:t>Three primary reasons are posited for discrepancies between the sentiment values in Serbian and those derived from SWN. Firstly, while a word may convey a polarizing sentiment, the actual sense it is used in may not. Secondly, the sentiment values in SWN, generated through machine learning methods, may be inaccurate. Thirdly, and most pertinent to this study, is the possibility that while a sense is considered objective in English, it carries sentiment in Serbian.</w:t>
+      </w:r>
+      <w:r>
+        <w:rPr>
+          <w:lang w:val="en-GB"/>
+        </w:rPr>
+        <w:t xml:space="preserve"> </w:t>
+      </w:r>
+    </w:p>
+    <w:p>
+      <w:pPr>
+        <w:rPr>
+          <w:lang w:val="en-GB"/>
+        </w:rPr>
+      </w:pPr>
+      <w:r>
+        <w:rPr>
+          <w:lang w:val="en-GB"/>
+        </w:rPr>
+        <w:t xml:space="preserve">The initial analysis identified 2,956 synsets within the Serbian WordNet that contained literals annotated with clear polarity in the </w:t>
+      </w:r>
       <w:r>
         <w:rPr>
           <w:b/>
           <w:bCs/>
           <w:lang w:val="en-GB"/>
         </w:rPr>
-        <w:t>-pol-</w:t>
-      </w:r>
-      <w:proofErr w:type="spellStart"/>
-      <w:r>
-        <w:rPr>
-          <w:b/>
-          <w:bCs/>
-          <w:lang w:val="en-GB"/>
-        </w:rPr>
-        <w:t>sr</w:t>
-      </w:r>
-      <w:proofErr w:type="spellEnd"/>
-      <w:r>
-        <w:rPr>
-          <w:lang w:val="en-GB"/>
-        </w:rPr>
-        <w:t xml:space="preserve"> is a polarity lexicon for the Serbian language, annotated at the word level rather than by senses</w:t>
+        <w:t>senti-pol-sr</w:t>
+      </w:r>
+      <w:r>
+        <w:rPr>
+          <w:lang w:val="en-GB"/>
+        </w:rPr>
+        <w:t xml:space="preserve"> lexicon, with 1,511 exhibiting positive sentiment and 1,445 negative. Given the substantial volume, processing all these synsets with LLM was deemed impractical. Consequently, a random sample of 500 synsets was selected for further investigation.</w:t>
+      </w:r>
+    </w:p>
+    <w:p>
+      <w:pPr>
+        <w:rPr>
+          <w:lang w:val="en-GB"/>
+        </w:rPr>
+      </w:pPr>
+      <w:r>
+        <w:rPr>
+          <w:lang w:val="en-GB"/>
+        </w:rPr>
+        <w:t xml:space="preserve">For the sake of creating balanced set of samples, </w:t>
+      </w:r>
+      <w:r>
+        <w:rPr>
+          <w:lang w:val="en-GB"/>
+        </w:rPr>
+        <w:t xml:space="preserve">definitions from </w:t>
+      </w:r>
+      <w:r>
+        <w:rPr>
+          <w:lang w:val="en-GB"/>
+        </w:rPr>
+        <w:t>random sample of 500 synsets</w:t>
+      </w:r>
+      <w:r>
+        <w:rPr>
+          <w:lang w:val="en-GB"/>
+        </w:rPr>
+        <w:t xml:space="preserve"> </w:t>
+      </w:r>
+      <w:r>
+        <w:rPr>
+          <w:lang w:val="en-GB"/>
+        </w:rPr>
+        <w:t>were</w:t>
+      </w:r>
+      <w:r>
+        <w:rPr>
+          <w:lang w:val="en-GB"/>
+        </w:rPr>
+        <w:t xml:space="preserve"> processed using L</w:t>
+      </w:r>
+      <w:r>
+        <w:rPr>
+          <w:lang w:val="en-GB"/>
+        </w:rPr>
+        <w:t>angChain Python library, a powerful tool for creating, experimenting with, and analysing language models and agents</w:t>
+      </w:r>
+      <w:r>
+        <w:rPr>
+          <w:lang w:val="en-GB"/>
+        </w:rPr>
+        <w:t xml:space="preserve"> </w:t>
       </w:r>
       <w:r>
         <w:rPr>
@@ -1539,7 +1580,7 @@
         <w:rPr>
           <w:lang w:val="en-GB"/>
         </w:rPr>
-        <w:instrText xml:space="preserve"> ADDIN ZOTERO_ITEM CSL_CITATION {"citationID":"3eTKqVGe","properties":{"formattedCitation":"(Stankovi\\uc0\\u263{} et al., 2022)","plainCitation":"(Stanković et al., 2022)","noteIndex":0},"citationItems":[{"id":55,"uris":["http://zotero.org/users/11870508/items/RA5ZYR82"],"itemData":{"id":55,"type":"paper-conference","abstract":"In this paper we present first study of Sentiment Analysis (SA) of Serbian novels from the 1840-1920 period. The preparation of sentiment lexicon was based on three existing lexicons: NRC, AFFIN and Bing with additional extensive corrections. The first phase of dataset refinement included filtering the word that are not found in Serbian morphological dictionary and in second automatic POS tagging and lemma were manually corrected. The polarity lexicon was extracted and transformed into ontolex-lemon and published as initial version. The complex inflection system of Serbian language required expansion of sentiment lexicon with inflected forms from Serbian morphological dictionaries. Set of sentences for SA was extracted from 120 novels of Serbian part of ELTeC collection, labelled for polarity and used for several model training. Several approaches for SA are compared, starting with for variation of lexicon based and followed by Logistic Regression, Naive Bayes, Decision Tree, Random Forest, SVN and k-NN. The comparison with models trained on labelled movie reviews dataset indicates that it can not successfully be used for sentiment analysis of sentences in old novels.","container-title":"Proceedings of the 2nd Workshop on Sentiment Analysis and Linguistic Linked Data","event-place":"Marseille, France","event-title":"SALLD 2022","page":"31–38","publisher":"European Language Resources Association","publisher-place":"Marseille, France","source":"ACLWeb","title":"Sentiment Analysis of Serbian Old Novels","URL":"https://aclanthology.org/2022.salld-1.6","author":[{"family":"Stanković","given":"Ranka"},{"family":"Košprdić","given":"Miloš"},{"family":"Ikonić Nešić","given":"Milica"},{"family":"Radović","given":"Tijana"}],"accessed":{"date-parts":[["2023",8,21]]},"issued":{"date-parts":[["2022",6]]}}}],"schema":"https://github.com/citation-style-language/schema/raw/master/csl-citation.json"} </w:instrText>
+        <w:instrText xml:space="preserve"> ADDIN ZOTERO_ITEM CSL_CITATION {"citationID":"HirWKRpw","properties":{"formattedCitation":"(Chase, 2022)","plainCitation":"(Chase, 2022)","noteIndex":0},"citationItems":[{"id":128,"uris":["http://zotero.org/users/11870508/items/3J5JDS46"],"itemData":{"id":128,"type":"software","title":"LangChain","URL":"https://github.com/langchain-ai/langchain","author":[{"family":"Chase","given":"Harrison"}],"issued":{"date-parts":[["2022",10]]}}}],"schema":"https://github.com/citation-style-language/schema/raw/master/csl-citation.json"} </w:instrText>
       </w:r>
       <w:r>
         <w:rPr>
@@ -1550,9 +1591,8 @@
       <w:r>
         <w:rPr>
           <w:rFonts w:ascii="Calibri" w:hAnsi="Calibri" w:cs="Calibri"/>
-          <w:kern w:val="0"/>
-        </w:rPr>
-        <w:t>(Stanković et al., 2022)</w:t>
+        </w:rPr>
+        <w:t>(Chase, 2022)</w:t>
       </w:r>
       <w:r>
         <w:rPr>
@@ -1564,226 +1604,22 @@
         <w:rPr>
           <w:lang w:val="en-GB"/>
         </w:rPr>
-        <w:t xml:space="preserve">. </w:t>
-      </w:r>
-      <w:r>
-        <w:rPr>
-          <w:lang w:val="en-GB"/>
-        </w:rPr>
-        <w:t>It includes words that exhibit clear polarity, categorized as either positive or negative, and does not contain words considered to be objective.</w:t>
-      </w:r>
-    </w:p>
-    <w:p>
-      <w:pPr>
-        <w:rPr>
-          <w:lang w:val="en-GB"/>
-        </w:rPr>
-      </w:pPr>
-      <w:r>
-        <w:rPr>
-          <w:lang w:val="en-GB"/>
-        </w:rPr>
-        <w:t>In this research, the lexicon was employed to select a sample suitable for annotation</w:t>
-      </w:r>
-      <w:r>
-        <w:rPr>
-          <w:lang w:val="en-GB"/>
-        </w:rPr>
-        <w:t xml:space="preserve"> by LMM</w:t>
-      </w:r>
-      <w:r>
-        <w:rPr>
-          <w:lang w:val="en-GB"/>
-        </w:rPr>
-        <w:t xml:space="preserve">. This was achieved by identifying all synsets from the Serbian WordNet containing literals (words) present in the </w:t>
-      </w:r>
-      <w:proofErr w:type="spellStart"/>
-      <w:r>
-        <w:rPr>
-          <w:b/>
-          <w:bCs/>
-          <w:lang w:val="en-GB"/>
-        </w:rPr>
-        <w:t>senti</w:t>
-      </w:r>
-      <w:proofErr w:type="spellEnd"/>
-      <w:r>
-        <w:rPr>
-          <w:b/>
-          <w:bCs/>
-          <w:lang w:val="en-GB"/>
-        </w:rPr>
-        <w:t>-pol-</w:t>
-      </w:r>
-      <w:proofErr w:type="spellStart"/>
-      <w:r>
-        <w:rPr>
-          <w:b/>
-          <w:bCs/>
-          <w:lang w:val="en-GB"/>
-        </w:rPr>
-        <w:t>sr</w:t>
-      </w:r>
-      <w:proofErr w:type="spellEnd"/>
-      <w:r>
-        <w:rPr>
-          <w:b/>
-          <w:bCs/>
-          <w:lang w:val="en-GB"/>
-        </w:rPr>
-        <w:t xml:space="preserve"> </w:t>
-      </w:r>
-      <w:r>
-        <w:rPr>
-          <w:lang w:val="en-GB"/>
-        </w:rPr>
-        <w:t>lexicon and simultaneously having a neutral sentiment value (0,0) as mapped from SWN.</w:t>
-      </w:r>
-    </w:p>
-    <w:p>
-      <w:pPr>
-        <w:rPr>
-          <w:lang w:val="en-GB"/>
-        </w:rPr>
-      </w:pPr>
-      <w:r>
-        <w:rPr>
-          <w:lang w:val="en-GB"/>
-        </w:rPr>
-        <w:t xml:space="preserve">Three primary reasons are posited for discrepancies between the sentiment values in Serbian and those derived from SWN. Firstly, while a word may convey a polarizing sentiment, the actual sense it is used in </w:t>
-      </w:r>
-      <w:proofErr w:type="gramStart"/>
-      <w:r>
-        <w:rPr>
-          <w:lang w:val="en-GB"/>
-        </w:rPr>
-        <w:t>may</w:t>
-      </w:r>
-      <w:proofErr w:type="gramEnd"/>
-      <w:r>
-        <w:rPr>
-          <w:lang w:val="en-GB"/>
-        </w:rPr>
-        <w:t xml:space="preserve"> not. Secondly, the sentiment values in SWN, generated through machine learning </w:t>
-      </w:r>
-      <w:r>
-        <w:rPr>
-          <w:lang w:val="en-GB"/>
-        </w:rPr>
-        <w:lastRenderedPageBreak/>
-        <w:t>methods, may be inaccurate. Thirdly, and most pertinent to this study, is the possibility that while a sense is considered objective in English, it carries sentiment in Serbian.</w:t>
-      </w:r>
-      <w:r>
-        <w:rPr>
-          <w:lang w:val="en-GB"/>
-        </w:rPr>
-        <w:t xml:space="preserve"> </w:t>
-      </w:r>
-    </w:p>
-    <w:p>
-      <w:pPr>
-        <w:rPr>
-          <w:lang w:val="en-GB"/>
-        </w:rPr>
-      </w:pPr>
-      <w:r>
-        <w:rPr>
-          <w:lang w:val="en-GB"/>
-        </w:rPr>
-        <w:t xml:space="preserve">The initial analysis identified 2,956 synsets within the Serbian WordNet that contained literals annotated with clear polarity in the </w:t>
-      </w:r>
-      <w:proofErr w:type="spellStart"/>
-      <w:r>
-        <w:rPr>
-          <w:b/>
-          <w:bCs/>
-          <w:lang w:val="en-GB"/>
-        </w:rPr>
-        <w:t>senti</w:t>
-      </w:r>
-      <w:proofErr w:type="spellEnd"/>
-      <w:r>
-        <w:rPr>
-          <w:b/>
-          <w:bCs/>
-          <w:lang w:val="en-GB"/>
-        </w:rPr>
-        <w:t>-pol-</w:t>
-      </w:r>
-      <w:proofErr w:type="spellStart"/>
-      <w:r>
-        <w:rPr>
-          <w:b/>
-          <w:bCs/>
-          <w:lang w:val="en-GB"/>
-        </w:rPr>
-        <w:t>sr</w:t>
-      </w:r>
-      <w:proofErr w:type="spellEnd"/>
-      <w:r>
-        <w:rPr>
-          <w:lang w:val="en-GB"/>
-        </w:rPr>
-        <w:t xml:space="preserve"> lexicon, with 1,511 exhibiting positive sentiment and 1,445 </w:t>
-      </w:r>
-      <w:proofErr w:type="gramStart"/>
-      <w:r>
-        <w:rPr>
-          <w:lang w:val="en-GB"/>
-        </w:rPr>
-        <w:t>negative</w:t>
-      </w:r>
-      <w:proofErr w:type="gramEnd"/>
-      <w:r>
-        <w:rPr>
-          <w:lang w:val="en-GB"/>
-        </w:rPr>
-        <w:t>. Given the substantial volume, processing all these synsets with LLM was deemed impractical. Consequently, a random sample of 500 synsets was selected for further investigation.</w:t>
-      </w:r>
-    </w:p>
-    <w:p>
-      <w:pPr>
-        <w:rPr>
-          <w:lang w:val="en-GB"/>
-        </w:rPr>
-      </w:pPr>
-      <w:r>
-        <w:rPr>
-          <w:lang w:val="en-GB"/>
-        </w:rPr>
-        <w:t xml:space="preserve">For the sake of creating balanced set of samples, </w:t>
-      </w:r>
-      <w:r>
-        <w:rPr>
-          <w:lang w:val="en-GB"/>
-        </w:rPr>
-        <w:t xml:space="preserve">definitions from </w:t>
-      </w:r>
-      <w:r>
-        <w:rPr>
-          <w:lang w:val="en-GB"/>
-        </w:rPr>
-        <w:t>random sample of 500 synsets</w:t>
-      </w:r>
-      <w:r>
-        <w:rPr>
-          <w:lang w:val="en-GB"/>
-        </w:rPr>
-        <w:t xml:space="preserve"> </w:t>
-      </w:r>
-      <w:r>
-        <w:rPr>
-          <w:lang w:val="en-GB"/>
-        </w:rPr>
-        <w:t>were</w:t>
-      </w:r>
-      <w:r>
-        <w:rPr>
-          <w:lang w:val="en-GB"/>
-        </w:rPr>
-        <w:t xml:space="preserve"> processed using </w:t>
-      </w:r>
-      <w:proofErr w:type="spellStart"/>
+        <w:t>.</w:t>
+      </w:r>
+    </w:p>
+    <w:p>
+      <w:pPr>
+        <w:rPr>
+          <w:lang w:val="en-GB"/>
+        </w:rPr>
+      </w:pPr>
+      <w:r>
+        <w:rPr>
+          <w:lang w:val="en-GB"/>
+        </w:rPr>
+        <w:t xml:space="preserve">The </w:t>
+      </w:r>
+      <w:bookmarkStart w:id="5" w:name="_Hlk161319374"/>
       <w:r>
         <w:rPr>
           <w:lang w:val="en-GB"/>
@@ -1794,56 +1630,51 @@
         <w:rPr>
           <w:lang w:val="en-GB"/>
         </w:rPr>
-        <w:t>angChain</w:t>
-      </w:r>
-      <w:proofErr w:type="spellEnd"/>
-      <w:r>
-        <w:rPr>
-          <w:lang w:val="en-GB"/>
-        </w:rPr>
-        <w:t xml:space="preserve"> Python library, a powerful tool for creating, experimenting with, and analysing language models and agents</w:t>
-      </w:r>
-      <w:r>
-        <w:rPr>
-          <w:lang w:val="en-GB"/>
-        </w:rPr>
-        <w:t xml:space="preserve"> </w:t>
-      </w:r>
-      <w:r>
-        <w:rPr>
-          <w:lang w:val="en-GB"/>
-        </w:rPr>
-        <w:fldChar w:fldCharType="begin"/>
-      </w:r>
-      <w:r>
-        <w:rPr>
-          <w:lang w:val="en-GB"/>
-        </w:rPr>
-        <w:instrText xml:space="preserve"> ADDIN ZOTERO_ITEM CSL_CITATION {"citationID":"HirWKRpw","properties":{"formattedCitation":"(Chase, 2022)","plainCitation":"(Chase, 2022)","noteIndex":0},"citationItems":[{"id":128,"uris":["http://zotero.org/users/11870508/items/3J5JDS46"],"itemData":{"id":128,"type":"software","title":"LangChain","URL":"https://github.com/langchain-ai/langchain","author":[{"family":"Chase","given":"Harrison"}],"issued":{"date-parts":[["2022",10]]}}}],"schema":"https://github.com/citation-style-language/schema/raw/master/csl-citation.json"} </w:instrText>
-      </w:r>
-      <w:r>
-        <w:rPr>
-          <w:lang w:val="en-GB"/>
-        </w:rPr>
-        <w:fldChar w:fldCharType="separate"/>
-      </w:r>
-      <w:r>
-        <w:rPr>
-          <w:rFonts w:ascii="Calibri" w:hAnsi="Calibri" w:cs="Calibri"/>
-        </w:rPr>
-        <w:t>(Chase, 2022)</w:t>
-      </w:r>
-      <w:r>
-        <w:rPr>
-          <w:lang w:val="en-GB"/>
-        </w:rPr>
-        <w:fldChar w:fldCharType="end"/>
-      </w:r>
-      <w:r>
-        <w:rPr>
-          <w:lang w:val="en-GB"/>
-        </w:rPr>
-        <w:t>.</w:t>
+        <w:t xml:space="preserve">angChain </w:t>
+      </w:r>
+      <w:bookmarkEnd w:id="5"/>
+      <w:r>
+        <w:rPr>
+          <w:lang w:val="en-GB"/>
+        </w:rPr>
+        <w:t>Python library</w:t>
+      </w:r>
+      <w:r>
+        <w:rPr>
+          <w:lang w:val="en-GB"/>
+        </w:rPr>
+        <w:t xml:space="preserve"> serves as wrapper for several LLM modules. In this work this Hugging Fade Hub and Transformer.</w:t>
+      </w:r>
+    </w:p>
+    <w:p>
+      <w:pPr>
+        <w:rPr>
+          <w:lang w:val="en-GB"/>
+        </w:rPr>
+      </w:pPr>
+      <w:r>
+        <w:rPr>
+          <w:lang w:val="en-GB"/>
+        </w:rPr>
+        <w:t>The chain used in this research was simple containing of just one prompt template with one input variable – the definition of synset</w:t>
+      </w:r>
+      <w:r>
+        <w:rPr>
+          <w:lang w:val="en-GB"/>
+        </w:rPr>
+        <w:t xml:space="preserve">, and </w:t>
+      </w:r>
+      <w:r>
+        <w:rPr>
+          <w:lang w:val="en-GB"/>
+        </w:rPr>
+        <w:t>Mistral 7B – Instruct</w:t>
+      </w:r>
+      <w:r>
+        <w:rPr>
+          <w:lang w:val="en-GB"/>
+        </w:rPr>
+        <w:t xml:space="preserve"> model downloaded from Hugging Face Hub. The model was executed on local machine. </w:t>
       </w:r>
     </w:p>
     <w:p>
@@ -1858,97 +1689,11 @@
         </w:rPr>
         <w:t xml:space="preserve">The </w:t>
       </w:r>
-      <w:bookmarkStart w:id="5" w:name="_Hlk161319374"/>
-      <w:proofErr w:type="spellStart"/>
-      <w:r>
-        <w:rPr>
-          <w:lang w:val="en-GB"/>
-        </w:rPr>
-        <w:t>L</w:t>
-      </w:r>
-      <w:r>
-        <w:rPr>
-          <w:lang w:val="en-GB"/>
-        </w:rPr>
-        <w:t>angChain</w:t>
-      </w:r>
-      <w:proofErr w:type="spellEnd"/>
-      <w:r>
-        <w:rPr>
-          <w:lang w:val="en-GB"/>
-        </w:rPr>
-        <w:t xml:space="preserve"> </w:t>
-      </w:r>
-      <w:bookmarkEnd w:id="5"/>
-      <w:r>
-        <w:rPr>
-          <w:lang w:val="en-GB"/>
-        </w:rPr>
-        <w:t>Python library</w:t>
-      </w:r>
-      <w:r>
-        <w:rPr>
-          <w:lang w:val="en-GB"/>
-        </w:rPr>
-        <w:t xml:space="preserve"> serves as wrapper for several LLM modules. In this work this Hugging Fade Hub and Transformer.</w:t>
-      </w:r>
-    </w:p>
-    <w:p>
-      <w:pPr>
-        <w:rPr>
-          <w:lang w:val="en-GB"/>
-        </w:rPr>
-      </w:pPr>
-      <w:r>
-        <w:rPr>
-          <w:lang w:val="en-GB"/>
-        </w:rPr>
-        <w:t>The chain used in this research was simple containing of just one prompt template with one input variable – the definition of synset</w:t>
-      </w:r>
-      <w:r>
-        <w:rPr>
-          <w:lang w:val="en-GB"/>
-        </w:rPr>
-        <w:t xml:space="preserve">, and </w:t>
-      </w:r>
-      <w:r>
-        <w:rPr>
-          <w:lang w:val="en-GB"/>
-        </w:rPr>
-        <w:t>Mistral 7B – Instruct</w:t>
-      </w:r>
-      <w:r>
-        <w:rPr>
-          <w:lang w:val="en-GB"/>
-        </w:rPr>
-        <w:t xml:space="preserve"> model downloaded from Hugging Face Hub. The model was executed on local machine. </w:t>
-      </w:r>
-    </w:p>
-    <w:p>
-      <w:pPr>
-        <w:rPr>
-          <w:lang w:val="en-GB"/>
-        </w:rPr>
-      </w:pPr>
-      <w:r>
-        <w:rPr>
-          <w:lang w:val="en-GB"/>
-        </w:rPr>
-        <w:t xml:space="preserve">The </w:t>
-      </w:r>
-      <w:proofErr w:type="spellStart"/>
-      <w:r>
-        <w:rPr>
-          <w:lang w:val="en-GB"/>
-        </w:rPr>
-        <w:t>LangChain</w:t>
-      </w:r>
-      <w:proofErr w:type="spellEnd"/>
-      <w:r>
-        <w:rPr>
-          <w:lang w:val="en-GB"/>
-        </w:rPr>
-        <w:t xml:space="preserve"> </w:t>
+      <w:r>
+        <w:rPr>
+          <w:lang w:val="en-GB"/>
+        </w:rPr>
+        <w:t xml:space="preserve">LangChain </w:t>
       </w:r>
       <w:r>
         <w:rPr>
@@ -2068,33 +1813,7 @@
         <w:rPr>
           <w:lang w:val="en-GB"/>
         </w:rPr>
-        <w:t xml:space="preserve">: The essence of effective communication with an LLM lies in the clarity of instructions. The prompt explicitly details the task at hand, guiding the LLM to identify and </w:t>
-      </w:r>
-      <w:r>
-        <w:rPr>
-          <w:lang w:val="en-GB"/>
-        </w:rPr>
-        <w:t>analyse</w:t>
-      </w:r>
-      <w:r>
-        <w:rPr>
-          <w:lang w:val="en-GB"/>
-        </w:rPr>
-        <w:t xml:space="preserve"> the sentiment expressed </w:t>
-      </w:r>
-      <w:proofErr w:type="gramStart"/>
-      <w:r>
-        <w:rPr>
-          <w:lang w:val="en-GB"/>
-        </w:rPr>
-        <w:t>in a given</w:t>
-      </w:r>
-      <w:proofErr w:type="gramEnd"/>
-      <w:r>
-        <w:rPr>
-          <w:lang w:val="en-GB"/>
-        </w:rPr>
-        <w:t xml:space="preserve"> piece of text</w:t>
+        <w:t>: The essence of effective communication with an LLM lies in the clarity of instructions. The prompt explicitly details the task at hand, guiding the LLM to identify and analyse the sentiment expressed in a given piece of text</w:t>
       </w:r>
       <w:r>
         <w:rPr>
@@ -2190,7 +1909,6 @@
         <w:rPr>
           <w:lang w:val="en-GB"/>
         </w:rPr>
-        <w:lastRenderedPageBreak/>
         <w:t>Further examination had shown that duplicates exist within the set, du</w:t>
       </w:r>
       <w:r>
@@ -2215,21 +1933,7 @@
         <w:rPr>
           <w:lang w:val="en-GB"/>
         </w:rPr>
-        <w:t xml:space="preserve"> 279 objective, 97 negative and 27 </w:t>
-      </w:r>
-      <w:proofErr w:type="gramStart"/>
-      <w:r>
-        <w:rPr>
-          <w:lang w:val="en-GB"/>
-        </w:rPr>
-        <w:t>positive</w:t>
-      </w:r>
-      <w:proofErr w:type="gramEnd"/>
-      <w:r>
-        <w:rPr>
-          <w:lang w:val="en-GB"/>
-        </w:rPr>
-        <w:t xml:space="preserve">. At this juncture that was no reason to count improperly marked. </w:t>
+        <w:t xml:space="preserve"> 279 objective, 97 negative and 27 positive. At this juncture that was no reason to count improperly marked. </w:t>
       </w:r>
     </w:p>
     <w:p>
@@ -2254,333 +1958,123 @@
       <w:r>
         <w:rPr>
           <w:noProof/>
-          <w:lang w:val="en-GB"/>
-        </w:rPr>
-        <mc:AlternateContent>
-          <mc:Choice Requires="wps">
-            <w:drawing>
-              <wp:anchor distT="91440" distB="91440" distL="114300" distR="114300" simplePos="0" relativeHeight="251659264" behindDoc="0" locked="0" layoutInCell="1" allowOverlap="1" wp14:anchorId="77839978" wp14:editId="0EA37B85">
-                <wp:simplePos x="0" y="0"/>
-                <wp:positionH relativeFrom="page">
-                  <wp:align>center</wp:align>
-                </wp:positionH>
-                <wp:positionV relativeFrom="paragraph">
-                  <wp:posOffset>274320</wp:posOffset>
-                </wp:positionV>
-                <wp:extent cx="3474720" cy="1403985"/>
-                <wp:effectExtent l="0" t="0" r="0" b="0"/>
-                <wp:wrapTopAndBottom/>
-                <wp:docPr id="307" name="Text Box 2"/>
-                <wp:cNvGraphicFramePr>
-                  <a:graphicFrameLocks xmlns:a="http://schemas.openxmlformats.org/drawingml/2006/main"/>
-                </wp:cNvGraphicFramePr>
-                <a:graphic xmlns:a="http://schemas.openxmlformats.org/drawingml/2006/main">
-                  <a:graphicData uri="http://schemas.microsoft.com/office/word/2010/wordprocessingShape">
-                    <wps:wsp>
-                      <wps:cNvSpPr txBox="1">
-                        <a:spLocks noChangeArrowheads="1"/>
-                      </wps:cNvSpPr>
-                      <wps:spPr bwMode="auto">
-                        <a:xfrm>
-                          <a:off x="0" y="0"/>
-                          <a:ext cx="3474720" cy="1403985"/>
-                        </a:xfrm>
-                        <a:prstGeom prst="rect">
-                          <a:avLst/>
-                        </a:prstGeom>
-                        <a:noFill/>
-                        <a:ln w="9525">
-                          <a:noFill/>
-                          <a:miter lim="800000"/>
-                          <a:headEnd/>
-                          <a:tailEnd/>
-                        </a:ln>
-                      </wps:spPr>
-                      <wps:txbx>
-                        <w:txbxContent>
-                          <w:p>
-                            <w:pPr>
-                              <w:pBdr>
-                                <w:top w:val="single" w:sz="24" w:space="8" w:color="4472C4" w:themeColor="accent1"/>
-                                <w:bottom w:val="single" w:sz="24" w:space="8" w:color="4472C4" w:themeColor="accent1"/>
-                              </w:pBdr>
-                              <w:spacing w:after="0"/>
-                              <w:rPr>
-                                <w:i/>
-                                <w:iCs/>
-                                <w:color w:val="4472C4" w:themeColor="accent1"/>
-                                <w:sz w:val="24"/>
-                                <w:szCs w:val="24"/>
-                              </w:rPr>
-                            </w:pPr>
-                            <w:r>
-                              <w:rPr>
-                                <w:i/>
-                                <w:iCs/>
-                                <w:color w:val="4472C4" w:themeColor="accent1"/>
-                                <w:sz w:val="24"/>
-                                <w:szCs w:val="24"/>
-                              </w:rPr>
-                              <w:t xml:space="preserve">    Kao ekspert za analizu sentimenta, analizirajte sledeći tekst na srpskom jeziku i odredite njegov sentiment. </w:t>
-                            </w:r>
-                          </w:p>
-                          <w:p>
-                            <w:pPr>
-                              <w:pBdr>
-                                <w:top w:val="single" w:sz="24" w:space="8" w:color="4472C4" w:themeColor="accent1"/>
-                                <w:bottom w:val="single" w:sz="24" w:space="8" w:color="4472C4" w:themeColor="accent1"/>
-                              </w:pBdr>
-                              <w:spacing w:after="0"/>
-                              <w:rPr>
-                                <w:i/>
-                                <w:iCs/>
-                                <w:color w:val="4472C4" w:themeColor="accent1"/>
-                                <w:sz w:val="24"/>
-                                <w:szCs w:val="24"/>
-                              </w:rPr>
-                            </w:pPr>
-                            <w:r>
-                              <w:rPr>
-                                <w:i/>
-                                <w:iCs/>
-                                <w:color w:val="4472C4" w:themeColor="accent1"/>
-                                <w:sz w:val="24"/>
-                                <w:szCs w:val="24"/>
-                              </w:rPr>
-                              <w:t xml:space="preserve">    Sentiment treba da bude striktno klasifikovan kao "pozitivan", "negativan", ili "objektivan". Nijedan drugi odgovor neće biti prihvaćen.</w:t>
-                            </w:r>
-                          </w:p>
-                          <w:p>
-                            <w:pPr>
-                              <w:pBdr>
-                                <w:top w:val="single" w:sz="24" w:space="8" w:color="4472C4" w:themeColor="accent1"/>
-                                <w:bottom w:val="single" w:sz="24" w:space="8" w:color="4472C4" w:themeColor="accent1"/>
-                              </w:pBdr>
-                              <w:spacing w:after="0"/>
-                              <w:rPr>
-                                <w:i/>
-                                <w:iCs/>
-                                <w:color w:val="4472C4" w:themeColor="accent1"/>
-                                <w:sz w:val="24"/>
-                                <w:szCs w:val="24"/>
-                              </w:rPr>
-                            </w:pPr>
-                            <w:r>
-                              <w:rPr>
-                                <w:i/>
-                                <w:iCs/>
-                                <w:color w:val="4472C4" w:themeColor="accent1"/>
-                                <w:sz w:val="24"/>
-                                <w:szCs w:val="24"/>
-                              </w:rPr>
-                              <w:t xml:space="preserve">    Tekst: {</w:t>
-                            </w:r>
-                            <w:proofErr w:type="spellStart"/>
-                            <w:r>
-                              <w:rPr>
-                                <w:i/>
-                                <w:iCs/>
-                                <w:color w:val="4472C4" w:themeColor="accent1"/>
-                                <w:sz w:val="24"/>
-                                <w:szCs w:val="24"/>
-                              </w:rPr>
-                              <w:t>text</w:t>
-                            </w:r>
-                            <w:proofErr w:type="spellEnd"/>
-                            <w:r>
-                              <w:rPr>
-                                <w:i/>
-                                <w:iCs/>
-                                <w:color w:val="4472C4" w:themeColor="accent1"/>
-                                <w:sz w:val="24"/>
-                                <w:szCs w:val="24"/>
-                              </w:rPr>
-                              <w:t>}</w:t>
-                            </w:r>
-                          </w:p>
-                          <w:p>
-                            <w:pPr>
-                              <w:pBdr>
-                                <w:top w:val="single" w:sz="24" w:space="8" w:color="4472C4" w:themeColor="accent1"/>
-                                <w:bottom w:val="single" w:sz="24" w:space="8" w:color="4472C4" w:themeColor="accent1"/>
-                              </w:pBdr>
-                              <w:spacing w:after="0"/>
-                              <w:rPr>
-                                <w:i/>
-                                <w:iCs/>
-                                <w:color w:val="4472C4" w:themeColor="accent1"/>
-                                <w:sz w:val="24"/>
-                              </w:rPr>
-                            </w:pPr>
-                            <w:r>
-                              <w:rPr>
-                                <w:i/>
-                                <w:iCs/>
-                                <w:color w:val="4472C4" w:themeColor="accent1"/>
-                                <w:sz w:val="24"/>
-                                <w:szCs w:val="24"/>
-                              </w:rPr>
-                              <w:t xml:space="preserve">    Sentiment:</w:t>
-                            </w:r>
-                          </w:p>
-                        </w:txbxContent>
-                      </wps:txbx>
-                      <wps:bodyPr rot="0" vert="horz" wrap="square" lIns="91440" tIns="45720" rIns="91440" bIns="45720" anchor="t" anchorCtr="0">
-                        <a:spAutoFit/>
-                      </wps:bodyPr>
-                    </wps:wsp>
-                  </a:graphicData>
-                </a:graphic>
-                <wp14:sizeRelH relativeFrom="margin">
-                  <wp14:pctWidth>58500</wp14:pctWidth>
-                </wp14:sizeRelH>
-                <wp14:sizeRelV relativeFrom="margin">
-                  <wp14:pctHeight>20000</wp14:pctHeight>
-                </wp14:sizeRelV>
-              </wp:anchor>
-            </w:drawing>
-          </mc:Choice>
-          <mc:Fallback>
-            <w:pict>
-              <v:shapetype w14:anchorId="77839978" id="_x0000_t202" coordsize="21600,21600" o:spt="202" path="m,l,21600r21600,l21600,xe">
-                <v:stroke joinstyle="miter"/>
-                <v:path gradientshapeok="t" o:connecttype="rect"/>
-              </v:shapetype>
-              <v:shape id="Text Box 2" o:spid="_x0000_s1026" type="#_x0000_t202" style="position:absolute;margin-left:0;margin-top:21.6pt;width:273.6pt;height:110.55pt;z-index:251659264;visibility:visible;mso-wrap-style:square;mso-width-percent:585;mso-height-percent:200;mso-wrap-distance-left:9pt;mso-wrap-distance-top:7.2pt;mso-wrap-distance-right:9pt;mso-wrap-distance-bottom:7.2pt;mso-position-horizontal:center;mso-position-horizontal-relative:page;mso-position-vertical:absolute;mso-position-vertical-relative:text;mso-width-percent:585;mso-height-percent:200;mso-width-relative:margin;mso-height-relative:margin;v-text-anchor:top" o:gfxdata="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" filled="f" stroked="f">
-                <v:textbox style="mso-fit-shape-to-text:t">
-                  <w:txbxContent>
-                    <w:p>
-                      <w:pPr>
-                        <w:pBdr>
-                          <w:top w:val="single" w:sz="24" w:space="8" w:color="4472C4" w:themeColor="accent1"/>
-                          <w:bottom w:val="single" w:sz="24" w:space="8" w:color="4472C4" w:themeColor="accent1"/>
-                        </w:pBdr>
-                        <w:spacing w:after="0"/>
-                        <w:rPr>
-                          <w:i/>
-                          <w:iCs/>
-                          <w:color w:val="4472C4" w:themeColor="accent1"/>
-                          <w:sz w:val="24"/>
-                          <w:szCs w:val="24"/>
-                        </w:rPr>
-                      </w:pPr>
-                      <w:r>
-                        <w:rPr>
-                          <w:i/>
-                          <w:iCs/>
-                          <w:color w:val="4472C4" w:themeColor="accent1"/>
-                          <w:sz w:val="24"/>
-                          <w:szCs w:val="24"/>
-                        </w:rPr>
-                        <w:t xml:space="preserve">    Kao ekspert za analizu sentimenta, analizirajte sledeći tekst na srpskom jeziku i odredite njegov sentiment. </w:t>
-                      </w:r>
-                    </w:p>
-                    <w:p>
-                      <w:pPr>
-                        <w:pBdr>
-                          <w:top w:val="single" w:sz="24" w:space="8" w:color="4472C4" w:themeColor="accent1"/>
-                          <w:bottom w:val="single" w:sz="24" w:space="8" w:color="4472C4" w:themeColor="accent1"/>
-                        </w:pBdr>
-                        <w:spacing w:after="0"/>
-                        <w:rPr>
-                          <w:i/>
-                          <w:iCs/>
-                          <w:color w:val="4472C4" w:themeColor="accent1"/>
-                          <w:sz w:val="24"/>
-                          <w:szCs w:val="24"/>
-                        </w:rPr>
-                      </w:pPr>
-                      <w:r>
-                        <w:rPr>
-                          <w:i/>
-                          <w:iCs/>
-                          <w:color w:val="4472C4" w:themeColor="accent1"/>
-                          <w:sz w:val="24"/>
-                          <w:szCs w:val="24"/>
-                        </w:rPr>
-                        <w:t xml:space="preserve">    Sentiment treba da bude striktno klasifikovan kao "pozitivan", "negativan", ili "objektivan". Nijedan drugi odgovor neće biti prihvaćen.</w:t>
-                      </w:r>
-                    </w:p>
-                    <w:p>
-                      <w:pPr>
-                        <w:pBdr>
-                          <w:top w:val="single" w:sz="24" w:space="8" w:color="4472C4" w:themeColor="accent1"/>
-                          <w:bottom w:val="single" w:sz="24" w:space="8" w:color="4472C4" w:themeColor="accent1"/>
-                        </w:pBdr>
-                        <w:spacing w:after="0"/>
-                        <w:rPr>
-                          <w:i/>
-                          <w:iCs/>
-                          <w:color w:val="4472C4" w:themeColor="accent1"/>
-                          <w:sz w:val="24"/>
-                          <w:szCs w:val="24"/>
-                        </w:rPr>
-                      </w:pPr>
-                      <w:r>
-                        <w:rPr>
-                          <w:i/>
-                          <w:iCs/>
-                          <w:color w:val="4472C4" w:themeColor="accent1"/>
-                          <w:sz w:val="24"/>
-                          <w:szCs w:val="24"/>
-                        </w:rPr>
-                        <w:t xml:space="preserve">    Tekst: {</w:t>
-                      </w:r>
-                      <w:proofErr w:type="spellStart"/>
-                      <w:r>
-                        <w:rPr>
-                          <w:i/>
-                          <w:iCs/>
-                          <w:color w:val="4472C4" w:themeColor="accent1"/>
-                          <w:sz w:val="24"/>
-                          <w:szCs w:val="24"/>
-                        </w:rPr>
-                        <w:t>text</w:t>
-                      </w:r>
-                      <w:proofErr w:type="spellEnd"/>
-                      <w:r>
-                        <w:rPr>
-                          <w:i/>
-                          <w:iCs/>
-                          <w:color w:val="4472C4" w:themeColor="accent1"/>
-                          <w:sz w:val="24"/>
-                          <w:szCs w:val="24"/>
-                        </w:rPr>
-                        <w:t>}</w:t>
-                      </w:r>
-                    </w:p>
-                    <w:p>
-                      <w:pPr>
-                        <w:pBdr>
-                          <w:top w:val="single" w:sz="24" w:space="8" w:color="4472C4" w:themeColor="accent1"/>
-                          <w:bottom w:val="single" w:sz="24" w:space="8" w:color="4472C4" w:themeColor="accent1"/>
-                        </w:pBdr>
-                        <w:spacing w:after="0"/>
-                        <w:rPr>
-                          <w:i/>
-                          <w:iCs/>
-                          <w:color w:val="4472C4" w:themeColor="accent1"/>
-                          <w:sz w:val="24"/>
-                        </w:rPr>
-                      </w:pPr>
-                      <w:r>
-                        <w:rPr>
-                          <w:i/>
-                          <w:iCs/>
-                          <w:color w:val="4472C4" w:themeColor="accent1"/>
-                          <w:sz w:val="24"/>
-                          <w:szCs w:val="24"/>
-                        </w:rPr>
-                        <w:t xml:space="preserve">    Sentiment:</w:t>
-                      </w:r>
-                    </w:p>
-                  </w:txbxContent>
-                </v:textbox>
-                <w10:wrap type="topAndBottom" anchorx="page"/>
-              </v:shape>
-            </w:pict>
-          </mc:Fallback>
-        </mc:AlternateContent>
+        </w:rPr>
+        <w:pict w14:anchorId="29A78B87">
+          <v:shapetype id="_x0000_t202" coordsize="21600,21600" o:spt="202" path="m,l,21600r21600,l21600,xe">
+            <v:stroke joinstyle="miter"/>
+            <v:path gradientshapeok="t" o:connecttype="rect"/>
+          </v:shapetype>
+          <v:shape id="Text Box 2" o:spid="_x0000_s1028" type="#_x0000_t202" style="position:absolute;margin-left:0;margin-top:21.6pt;width:273.6pt;height:110.55pt;z-index:251659264;visibility:visible;mso-wrap-style:square;mso-width-percent:585;mso-height-percent:200;mso-wrap-distance-left:9pt;mso-wrap-distance-top:7.2pt;mso-wrap-distance-right:9pt;mso-wrap-distance-bottom:7.2pt;mso-position-horizontal:center;mso-position-horizontal-relative:page;mso-position-vertical:absolute;mso-position-vertical-relative:text;mso-width-percent:585;mso-height-percent:200;mso-width-relative:margin;mso-height-relative:margin;v-text-anchor:top" o:gfxdata="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" filled="f" stroked="f">
+            <v:textbox style="mso-fit-shape-to-text:t">
+              <w:txbxContent>
+                <w:p>
+                  <w:pPr>
+                    <w:pBdr>
+                      <w:top w:val="single" w:sz="24" w:space="8" w:color="4472C4" w:themeColor="accent1"/>
+                      <w:bottom w:val="single" w:sz="24" w:space="8" w:color="4472C4" w:themeColor="accent1"/>
+                    </w:pBdr>
+                    <w:spacing w:after="0"/>
+                    <w:rPr>
+                      <w:i/>
+                      <w:iCs/>
+                      <w:color w:val="4472C4" w:themeColor="accent1"/>
+                      <w:sz w:val="24"/>
+                      <w:szCs w:val="24"/>
+                    </w:rPr>
+                  </w:pPr>
+                  <w:r>
+                    <w:rPr>
+                      <w:i/>
+                      <w:iCs/>
+                      <w:color w:val="4472C4" w:themeColor="accent1"/>
+                      <w:sz w:val="24"/>
+                      <w:szCs w:val="24"/>
+                    </w:rPr>
+                    <w:t xml:space="preserve">    Kao ekspert za analizu sentimenta, analizirajte sledeći tekst na srpskom jeziku i odredite njegov sentiment. </w:t>
+                  </w:r>
+                </w:p>
+                <w:p>
+                  <w:pPr>
+                    <w:pBdr>
+                      <w:top w:val="single" w:sz="24" w:space="8" w:color="4472C4" w:themeColor="accent1"/>
+                      <w:bottom w:val="single" w:sz="24" w:space="8" w:color="4472C4" w:themeColor="accent1"/>
+                    </w:pBdr>
+                    <w:spacing w:after="0"/>
+                    <w:rPr>
+                      <w:i/>
+                      <w:iCs/>
+                      <w:color w:val="4472C4" w:themeColor="accent1"/>
+                      <w:sz w:val="24"/>
+                      <w:szCs w:val="24"/>
+                    </w:rPr>
+                  </w:pPr>
+                  <w:r>
+                    <w:rPr>
+                      <w:i/>
+                      <w:iCs/>
+                      <w:color w:val="4472C4" w:themeColor="accent1"/>
+                      <w:sz w:val="24"/>
+                      <w:szCs w:val="24"/>
+                    </w:rPr>
+                    <w:t xml:space="preserve">    Sentiment treba da bude striktno klasifikovan kao "pozitivan", "negativan", ili "objektivan". Nijedan drugi odgovor neće biti prihvaćen.</w:t>
+                  </w:r>
+                </w:p>
+                <w:p>
+                  <w:pPr>
+                    <w:pBdr>
+                      <w:top w:val="single" w:sz="24" w:space="8" w:color="4472C4" w:themeColor="accent1"/>
+                      <w:bottom w:val="single" w:sz="24" w:space="8" w:color="4472C4" w:themeColor="accent1"/>
+                    </w:pBdr>
+                    <w:spacing w:after="0"/>
+                    <w:rPr>
+                      <w:i/>
+                      <w:iCs/>
+                      <w:color w:val="4472C4" w:themeColor="accent1"/>
+                      <w:sz w:val="24"/>
+                      <w:szCs w:val="24"/>
+                    </w:rPr>
+                  </w:pPr>
+                  <w:r>
+                    <w:rPr>
+                      <w:i/>
+                      <w:iCs/>
+                      <w:color w:val="4472C4" w:themeColor="accent1"/>
+                      <w:sz w:val="24"/>
+                      <w:szCs w:val="24"/>
+                    </w:rPr>
+                    <w:t xml:space="preserve">    Tekst: {text}</w:t>
+                  </w:r>
+                </w:p>
+                <w:p>
+                  <w:pPr>
+                    <w:pBdr>
+                      <w:top w:val="single" w:sz="24" w:space="8" w:color="4472C4" w:themeColor="accent1"/>
+                      <w:bottom w:val="single" w:sz="24" w:space="8" w:color="4472C4" w:themeColor="accent1"/>
+                    </w:pBdr>
+                    <w:spacing w:after="0"/>
+                    <w:rPr>
+                      <w:i/>
+                      <w:iCs/>
+                      <w:color w:val="4472C4" w:themeColor="accent1"/>
+                      <w:sz w:val="24"/>
+                    </w:rPr>
+                  </w:pPr>
+                  <w:r>
+                    <w:rPr>
+                      <w:i/>
+                      <w:iCs/>
+                      <w:color w:val="4472C4" w:themeColor="accent1"/>
+                      <w:sz w:val="24"/>
+                      <w:szCs w:val="24"/>
+                    </w:rPr>
+                    <w:t xml:space="preserve">    Sentiment:</w:t>
+                  </w:r>
+                </w:p>
+              </w:txbxContent>
+            </v:textbox>
+            <w10:wrap type="topAndBottom" anchorx="page"/>
+          </v:shape>
+        </w:pict>
       </w:r>
     </w:p>
     <w:p>
@@ -2606,16 +2100,8 @@
         <w:rPr>
           <w:lang w:val="en-GB"/>
         </w:rPr>
-        <w:t xml:space="preserve"> for determining </w:t>
-      </w:r>
-      <w:proofErr w:type="gramStart"/>
-      <w:r>
-        <w:rPr>
-          <w:lang w:val="en-GB"/>
-        </w:rPr>
-        <w:t>polarity</w:t>
-      </w:r>
-      <w:proofErr w:type="gramEnd"/>
+        <w:t xml:space="preserve"> for determining polarity</w:t>
+      </w:r>
     </w:p>
     <w:p>
       <w:pPr>
@@ -2671,21 +2157,7 @@
         <w:rPr>
           <w:lang w:val="en-GB"/>
         </w:rPr>
-        <w:t xml:space="preserve">The prompt templates were experimentally designed, by trying several possibilities, and incremental changes on few small </w:t>
-      </w:r>
-      <w:proofErr w:type="gramStart"/>
-      <w:r>
-        <w:rPr>
-          <w:lang w:val="en-GB"/>
-        </w:rPr>
-        <w:t>set</w:t>
-      </w:r>
-      <w:proofErr w:type="gramEnd"/>
-      <w:r>
-        <w:rPr>
-          <w:lang w:val="en-GB"/>
-        </w:rPr>
-        <w:t xml:space="preserve"> of synset definition from Serbian Wordnet.  </w:t>
+        <w:t xml:space="preserve">The prompt templates were experimentally designed, by trying several possibilities, and incremental changes on few small set of synset definition from Serbian Wordnet.  </w:t>
       </w:r>
     </w:p>
     <w:p>
@@ -2760,382 +2232,145 @@
       <w:r>
         <w:rPr>
           <w:noProof/>
-          <w:lang w:val="en-GB"/>
-        </w:rPr>
-        <w:lastRenderedPageBreak/>
-        <mc:AlternateContent>
-          <mc:Choice Requires="wps">
-            <w:drawing>
-              <wp:anchor distT="91440" distB="91440" distL="114300" distR="114300" simplePos="0" relativeHeight="251661312" behindDoc="0" locked="0" layoutInCell="1" allowOverlap="1" wp14:anchorId="1AE1E6C8" wp14:editId="675F43CC">
-                <wp:simplePos x="0" y="0"/>
-                <wp:positionH relativeFrom="page">
-                  <wp:align>center</wp:align>
-                </wp:positionH>
-                <wp:positionV relativeFrom="paragraph">
-                  <wp:posOffset>274320</wp:posOffset>
-                </wp:positionV>
-                <wp:extent cx="3474720" cy="1403985"/>
-                <wp:effectExtent l="0" t="0" r="0" b="0"/>
-                <wp:wrapTopAndBottom/>
-                <wp:docPr id="1439443238" name="Text Box 2"/>
-                <wp:cNvGraphicFramePr>
-                  <a:graphicFrameLocks xmlns:a="http://schemas.openxmlformats.org/drawingml/2006/main"/>
-                </wp:cNvGraphicFramePr>
-                <a:graphic xmlns:a="http://schemas.openxmlformats.org/drawingml/2006/main">
-                  <a:graphicData uri="http://schemas.microsoft.com/office/word/2010/wordprocessingShape">
-                    <wps:wsp>
-                      <wps:cNvSpPr txBox="1">
-                        <a:spLocks noChangeArrowheads="1"/>
-                      </wps:cNvSpPr>
-                      <wps:spPr bwMode="auto">
-                        <a:xfrm>
-                          <a:off x="0" y="0"/>
-                          <a:ext cx="3474720" cy="1403985"/>
-                        </a:xfrm>
-                        <a:prstGeom prst="rect">
-                          <a:avLst/>
-                        </a:prstGeom>
-                        <a:noFill/>
-                        <a:ln w="9525">
-                          <a:noFill/>
-                          <a:miter lim="800000"/>
-                          <a:headEnd/>
-                          <a:tailEnd/>
-                        </a:ln>
-                      </wps:spPr>
-                      <wps:txbx>
-                        <w:txbxContent>
-                          <w:p>
-                            <w:pPr>
-                              <w:pBdr>
-                                <w:top w:val="single" w:sz="24" w:space="8" w:color="4472C4" w:themeColor="accent1"/>
-                                <w:bottom w:val="single" w:sz="24" w:space="8" w:color="4472C4" w:themeColor="accent1"/>
-                              </w:pBdr>
-                              <w:spacing w:after="0"/>
-                              <w:rPr>
-                                <w:i/>
-                                <w:iCs/>
-                                <w:color w:val="4472C4" w:themeColor="accent1"/>
-                                <w:sz w:val="24"/>
-                                <w:szCs w:val="24"/>
-                              </w:rPr>
-                            </w:pPr>
-                            <w:r>
-                              <w:rPr>
-                                <w:i/>
-                                <w:iCs/>
-                                <w:color w:val="4472C4" w:themeColor="accent1"/>
-                                <w:sz w:val="24"/>
-                                <w:szCs w:val="24"/>
-                              </w:rPr>
-                              <w:t xml:space="preserve">    Kao ekspert za analizu sentimenta, analizirajte sledeći tekst na srpskom jeziku i odredite da li ima pozitivan sentiment.</w:t>
-                            </w:r>
-                          </w:p>
-                          <w:p>
-                            <w:pPr>
-                              <w:pBdr>
-                                <w:top w:val="single" w:sz="24" w:space="8" w:color="4472C4" w:themeColor="accent1"/>
-                                <w:bottom w:val="single" w:sz="24" w:space="8" w:color="4472C4" w:themeColor="accent1"/>
-                              </w:pBdr>
-                              <w:spacing w:after="0"/>
-                              <w:rPr>
-                                <w:i/>
-                                <w:iCs/>
-                                <w:color w:val="4472C4" w:themeColor="accent1"/>
-                                <w:sz w:val="24"/>
-                                <w:szCs w:val="24"/>
-                              </w:rPr>
-                            </w:pPr>
-                            <w:r>
-                              <w:rPr>
-                                <w:i/>
-                                <w:iCs/>
-                                <w:color w:val="4472C4" w:themeColor="accent1"/>
-                                <w:sz w:val="24"/>
-                                <w:szCs w:val="24"/>
-                              </w:rPr>
-                              <w:t xml:space="preserve">    Sentiment treba da bude striktno klasifikovan kao "nije pozitivan", "slabo pozitivan", "umereno pozitivan", "veoma pozitivan", ili "ekstremno pozitivan". Nijedan drugi odgovor neće biti prihvaćen. </w:t>
-                            </w:r>
-                          </w:p>
-                          <w:p>
-                            <w:pPr>
-                              <w:pBdr>
-                                <w:top w:val="single" w:sz="24" w:space="8" w:color="4472C4" w:themeColor="accent1"/>
-                                <w:bottom w:val="single" w:sz="24" w:space="8" w:color="4472C4" w:themeColor="accent1"/>
-                              </w:pBdr>
-                              <w:spacing w:after="0"/>
-                              <w:rPr>
-                                <w:i/>
-                                <w:iCs/>
-                                <w:color w:val="4472C4" w:themeColor="accent1"/>
-                                <w:sz w:val="24"/>
-                                <w:szCs w:val="24"/>
-                              </w:rPr>
-                            </w:pPr>
-                            <w:r>
-                              <w:rPr>
-                                <w:i/>
-                                <w:iCs/>
-                                <w:color w:val="4472C4" w:themeColor="accent1"/>
-                                <w:sz w:val="24"/>
-                                <w:szCs w:val="24"/>
-                              </w:rPr>
-                              <w:t xml:space="preserve">    Nijedan drugi odgovor neće biti prihvaćen.  </w:t>
-                            </w:r>
-                          </w:p>
-                          <w:p>
-                            <w:pPr>
-                              <w:pBdr>
-                                <w:top w:val="single" w:sz="24" w:space="8" w:color="4472C4" w:themeColor="accent1"/>
-                                <w:bottom w:val="single" w:sz="24" w:space="8" w:color="4472C4" w:themeColor="accent1"/>
-                              </w:pBdr>
-                              <w:spacing w:after="0"/>
-                              <w:rPr>
-                                <w:i/>
-                                <w:iCs/>
-                                <w:color w:val="4472C4" w:themeColor="accent1"/>
-                                <w:sz w:val="24"/>
-                                <w:szCs w:val="24"/>
-                              </w:rPr>
-                            </w:pPr>
-                            <w:r>
-                              <w:rPr>
-                                <w:i/>
-                                <w:iCs/>
-                                <w:color w:val="4472C4" w:themeColor="accent1"/>
-                                <w:sz w:val="24"/>
-                                <w:szCs w:val="24"/>
-                              </w:rPr>
-                              <w:t xml:space="preserve">    Tekst: {</w:t>
-                            </w:r>
-                            <w:proofErr w:type="spellStart"/>
-                            <w:r>
-                              <w:rPr>
-                                <w:i/>
-                                <w:iCs/>
-                                <w:color w:val="4472C4" w:themeColor="accent1"/>
-                                <w:sz w:val="24"/>
-                                <w:szCs w:val="24"/>
-                              </w:rPr>
-                              <w:t>text</w:t>
-                            </w:r>
-                            <w:proofErr w:type="spellEnd"/>
-                            <w:r>
-                              <w:rPr>
-                                <w:i/>
-                                <w:iCs/>
-                                <w:color w:val="4472C4" w:themeColor="accent1"/>
-                                <w:sz w:val="24"/>
-                                <w:szCs w:val="24"/>
-                              </w:rPr>
-                              <w:t>}</w:t>
-                            </w:r>
-                          </w:p>
-                          <w:p>
-                            <w:pPr>
-                              <w:pBdr>
-                                <w:top w:val="single" w:sz="24" w:space="8" w:color="4472C4" w:themeColor="accent1"/>
-                                <w:bottom w:val="single" w:sz="24" w:space="8" w:color="4472C4" w:themeColor="accent1"/>
-                              </w:pBdr>
-                              <w:spacing w:after="0"/>
-                              <w:rPr>
-                                <w:i/>
-                                <w:iCs/>
-                                <w:color w:val="4472C4" w:themeColor="accent1"/>
-                                <w:sz w:val="24"/>
-                              </w:rPr>
-                            </w:pPr>
-                            <w:r>
-                              <w:rPr>
-                                <w:i/>
-                                <w:iCs/>
-                                <w:color w:val="4472C4" w:themeColor="accent1"/>
-                                <w:sz w:val="24"/>
-                                <w:szCs w:val="24"/>
-                              </w:rPr>
-                              <w:t xml:space="preserve">    Pozitivan sentiment:</w:t>
-                            </w:r>
-                          </w:p>
-                        </w:txbxContent>
-                      </wps:txbx>
-                      <wps:bodyPr rot="0" vert="horz" wrap="square" lIns="91440" tIns="45720" rIns="91440" bIns="45720" anchor="t" anchorCtr="0">
-                        <a:spAutoFit/>
-                      </wps:bodyPr>
-                    </wps:wsp>
-                  </a:graphicData>
-                </a:graphic>
-                <wp14:sizeRelH relativeFrom="margin">
-                  <wp14:pctWidth>58500</wp14:pctWidth>
-                </wp14:sizeRelH>
-                <wp14:sizeRelV relativeFrom="margin">
-                  <wp14:pctHeight>20000</wp14:pctHeight>
-                </wp14:sizeRelV>
-              </wp:anchor>
-            </w:drawing>
-          </mc:Choice>
-          <mc:Fallback>
-            <w:pict>
-              <v:shape w14:anchorId="1AE1E6C8" id="_x0000_s1027" type="#_x0000_t202" style="position:absolute;margin-left:0;margin-top:21.6pt;width:273.6pt;height:110.55pt;z-index:251661312;visibility:visible;mso-wrap-style:square;mso-width-percent:585;mso-height-percent:200;mso-wrap-distance-left:9pt;mso-wrap-distance-top:7.2pt;mso-wrap-distance-right:9pt;mso-wrap-distance-bottom:7.2pt;mso-position-horizontal:center;mso-position-horizontal-relative:page;mso-position-vertical:absolute;mso-position-vertical-relative:text;mso-width-percent:585;mso-height-percent:200;mso-width-relative:margin;mso-height-relative:margin;v-text-anchor:top" o:gfxdata="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" filled="f" stroked="f">
-                <v:textbox style="mso-fit-shape-to-text:t">
-                  <w:txbxContent>
-                    <w:p>
-                      <w:pPr>
-                        <w:pBdr>
-                          <w:top w:val="single" w:sz="24" w:space="8" w:color="4472C4" w:themeColor="accent1"/>
-                          <w:bottom w:val="single" w:sz="24" w:space="8" w:color="4472C4" w:themeColor="accent1"/>
-                        </w:pBdr>
-                        <w:spacing w:after="0"/>
-                        <w:rPr>
-                          <w:i/>
-                          <w:iCs/>
-                          <w:color w:val="4472C4" w:themeColor="accent1"/>
-                          <w:sz w:val="24"/>
-                          <w:szCs w:val="24"/>
-                        </w:rPr>
-                      </w:pPr>
-                      <w:r>
-                        <w:rPr>
-                          <w:i/>
-                          <w:iCs/>
-                          <w:color w:val="4472C4" w:themeColor="accent1"/>
-                          <w:sz w:val="24"/>
-                          <w:szCs w:val="24"/>
-                        </w:rPr>
-                        <w:t xml:space="preserve">    Kao ekspert za analizu sentimenta, analizirajte sledeći tekst na srpskom jeziku i odredite da li ima pozitivan sentiment.</w:t>
-                      </w:r>
-                    </w:p>
-                    <w:p>
-                      <w:pPr>
-                        <w:pBdr>
-                          <w:top w:val="single" w:sz="24" w:space="8" w:color="4472C4" w:themeColor="accent1"/>
-                          <w:bottom w:val="single" w:sz="24" w:space="8" w:color="4472C4" w:themeColor="accent1"/>
-                        </w:pBdr>
-                        <w:spacing w:after="0"/>
-                        <w:rPr>
-                          <w:i/>
-                          <w:iCs/>
-                          <w:color w:val="4472C4" w:themeColor="accent1"/>
-                          <w:sz w:val="24"/>
-                          <w:szCs w:val="24"/>
-                        </w:rPr>
-                      </w:pPr>
-                      <w:r>
-                        <w:rPr>
-                          <w:i/>
-                          <w:iCs/>
-                          <w:color w:val="4472C4" w:themeColor="accent1"/>
-                          <w:sz w:val="24"/>
-                          <w:szCs w:val="24"/>
-                        </w:rPr>
-                        <w:t xml:space="preserve">    Sentiment treba da bude striktno klasifikovan kao "nije pozitivan", "slabo pozitivan", "umereno pozitivan", "veoma pozitivan", ili "ekstremno pozitivan". Nijedan drugi odgovor neće biti prihvaćen. </w:t>
-                      </w:r>
-                    </w:p>
-                    <w:p>
-                      <w:pPr>
-                        <w:pBdr>
-                          <w:top w:val="single" w:sz="24" w:space="8" w:color="4472C4" w:themeColor="accent1"/>
-                          <w:bottom w:val="single" w:sz="24" w:space="8" w:color="4472C4" w:themeColor="accent1"/>
-                        </w:pBdr>
-                        <w:spacing w:after="0"/>
-                        <w:rPr>
-                          <w:i/>
-                          <w:iCs/>
-                          <w:color w:val="4472C4" w:themeColor="accent1"/>
-                          <w:sz w:val="24"/>
-                          <w:szCs w:val="24"/>
-                        </w:rPr>
-                      </w:pPr>
-                      <w:r>
-                        <w:rPr>
-                          <w:i/>
-                          <w:iCs/>
-                          <w:color w:val="4472C4" w:themeColor="accent1"/>
-                          <w:sz w:val="24"/>
-                          <w:szCs w:val="24"/>
-                        </w:rPr>
-                        <w:t xml:space="preserve">    Nijedan drugi odgovor neće biti prihvaćen.  </w:t>
-                      </w:r>
-                    </w:p>
-                    <w:p>
-                      <w:pPr>
-                        <w:pBdr>
-                          <w:top w:val="single" w:sz="24" w:space="8" w:color="4472C4" w:themeColor="accent1"/>
-                          <w:bottom w:val="single" w:sz="24" w:space="8" w:color="4472C4" w:themeColor="accent1"/>
-                        </w:pBdr>
-                        <w:spacing w:after="0"/>
-                        <w:rPr>
-                          <w:i/>
-                          <w:iCs/>
-                          <w:color w:val="4472C4" w:themeColor="accent1"/>
-                          <w:sz w:val="24"/>
-                          <w:szCs w:val="24"/>
-                        </w:rPr>
-                      </w:pPr>
-                      <w:r>
-                        <w:rPr>
-                          <w:i/>
-                          <w:iCs/>
-                          <w:color w:val="4472C4" w:themeColor="accent1"/>
-                          <w:sz w:val="24"/>
-                          <w:szCs w:val="24"/>
-                        </w:rPr>
-                        <w:t xml:space="preserve">    Tekst: {</w:t>
-                      </w:r>
-                      <w:proofErr w:type="spellStart"/>
-                      <w:r>
-                        <w:rPr>
-                          <w:i/>
-                          <w:iCs/>
-                          <w:color w:val="4472C4" w:themeColor="accent1"/>
-                          <w:sz w:val="24"/>
-                          <w:szCs w:val="24"/>
-                        </w:rPr>
-                        <w:t>text</w:t>
-                      </w:r>
-                      <w:proofErr w:type="spellEnd"/>
-                      <w:r>
-                        <w:rPr>
-                          <w:i/>
-                          <w:iCs/>
-                          <w:color w:val="4472C4" w:themeColor="accent1"/>
-                          <w:sz w:val="24"/>
-                          <w:szCs w:val="24"/>
-                        </w:rPr>
-                        <w:t>}</w:t>
-                      </w:r>
-                    </w:p>
-                    <w:p>
-                      <w:pPr>
-                        <w:pBdr>
-                          <w:top w:val="single" w:sz="24" w:space="8" w:color="4472C4" w:themeColor="accent1"/>
-                          <w:bottom w:val="single" w:sz="24" w:space="8" w:color="4472C4" w:themeColor="accent1"/>
-                        </w:pBdr>
-                        <w:spacing w:after="0"/>
-                        <w:rPr>
-                          <w:i/>
-                          <w:iCs/>
-                          <w:color w:val="4472C4" w:themeColor="accent1"/>
-                          <w:sz w:val="24"/>
-                        </w:rPr>
-                      </w:pPr>
-                      <w:r>
-                        <w:rPr>
-                          <w:i/>
-                          <w:iCs/>
-                          <w:color w:val="4472C4" w:themeColor="accent1"/>
-                          <w:sz w:val="24"/>
-                          <w:szCs w:val="24"/>
-                        </w:rPr>
-                        <w:t xml:space="preserve">    Pozitivan sentiment:</w:t>
-                      </w:r>
-                    </w:p>
-                  </w:txbxContent>
-                </v:textbox>
-                <w10:wrap type="topAndBottom" anchorx="page"/>
-              </v:shape>
-            </w:pict>
-          </mc:Fallback>
-        </mc:AlternateContent>
+        </w:rPr>
+        <w:pict w14:anchorId="5039021C">
+          <v:shape id="_x0000_s1027" type="#_x0000_t202" style="position:absolute;margin-left:0;margin-top:21.6pt;width:273.6pt;height:110.55pt;z-index:251661312;visibility:visible;mso-wrap-style:square;mso-width-percent:585;mso-height-percent:200;mso-wrap-distance-left:9pt;mso-wrap-distance-top:7.2pt;mso-wrap-distance-right:9pt;mso-wrap-distance-bottom:7.2pt;mso-position-horizontal:center;mso-position-horizontal-relative:page;mso-position-vertical:absolute;mso-position-vertical-relative:text;mso-width-percent:585;mso-height-percent:200;mso-width-relative:margin;mso-height-relative:margin;v-text-anchor:top" o:gfxdata="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" filled="f" stroked="f">
+            <v:textbox style="mso-fit-shape-to-text:t">
+              <w:txbxContent>
+                <w:p>
+                  <w:pPr>
+                    <w:pBdr>
+                      <w:top w:val="single" w:sz="24" w:space="8" w:color="4472C4" w:themeColor="accent1"/>
+                      <w:bottom w:val="single" w:sz="24" w:space="8" w:color="4472C4" w:themeColor="accent1"/>
+                    </w:pBdr>
+                    <w:spacing w:after="0"/>
+                    <w:rPr>
+                      <w:i/>
+                      <w:iCs/>
+                      <w:color w:val="4472C4" w:themeColor="accent1"/>
+                      <w:sz w:val="24"/>
+                      <w:szCs w:val="24"/>
+                    </w:rPr>
+                  </w:pPr>
+                  <w:r>
+                    <w:rPr>
+                      <w:i/>
+                      <w:iCs/>
+                      <w:color w:val="4472C4" w:themeColor="accent1"/>
+                      <w:sz w:val="24"/>
+                      <w:szCs w:val="24"/>
+                    </w:rPr>
+                    <w:t xml:space="preserve">    Kao ekspert za analizu sentimenta, analizirajte sledeći tekst na srpskom jeziku i odredite da li ima pozitivan sentiment.</w:t>
+                  </w:r>
+                </w:p>
+                <w:p>
+                  <w:pPr>
+                    <w:pBdr>
+                      <w:top w:val="single" w:sz="24" w:space="8" w:color="4472C4" w:themeColor="accent1"/>
+                      <w:bottom w:val="single" w:sz="24" w:space="8" w:color="4472C4" w:themeColor="accent1"/>
+                    </w:pBdr>
+                    <w:spacing w:after="0"/>
+                    <w:rPr>
+                      <w:i/>
+                      <w:iCs/>
+                      <w:color w:val="4472C4" w:themeColor="accent1"/>
+                      <w:sz w:val="24"/>
+                      <w:szCs w:val="24"/>
+                    </w:rPr>
+                  </w:pPr>
+                  <w:r>
+                    <w:rPr>
+                      <w:i/>
+                      <w:iCs/>
+                      <w:color w:val="4472C4" w:themeColor="accent1"/>
+                      <w:sz w:val="24"/>
+                      <w:szCs w:val="24"/>
+                    </w:rPr>
+                    <w:t xml:space="preserve">    Sentiment treba da bude striktno klasifikovan kao "nije pozitivan", "slabo pozitivan", "umereno pozitivan", "veoma pozitivan", ili "ekstremno pozitivan". Nijedan drugi odgovor neće biti prihvaćen. </w:t>
+                  </w:r>
+                </w:p>
+                <w:p>
+                  <w:pPr>
+                    <w:pBdr>
+                      <w:top w:val="single" w:sz="24" w:space="8" w:color="4472C4" w:themeColor="accent1"/>
+                      <w:bottom w:val="single" w:sz="24" w:space="8" w:color="4472C4" w:themeColor="accent1"/>
+                    </w:pBdr>
+                    <w:spacing w:after="0"/>
+                    <w:rPr>
+                      <w:i/>
+                      <w:iCs/>
+                      <w:color w:val="4472C4" w:themeColor="accent1"/>
+                      <w:sz w:val="24"/>
+                      <w:szCs w:val="24"/>
+                    </w:rPr>
+                  </w:pPr>
+                  <w:r>
+                    <w:rPr>
+                      <w:i/>
+                      <w:iCs/>
+                      <w:color w:val="4472C4" w:themeColor="accent1"/>
+                      <w:sz w:val="24"/>
+                      <w:szCs w:val="24"/>
+                    </w:rPr>
+                    <w:t xml:space="preserve">    Nijedan drugi odgovor neće biti prihvaćen.  </w:t>
+                  </w:r>
+                </w:p>
+                <w:p>
+                  <w:pPr>
+                    <w:pBdr>
+                      <w:top w:val="single" w:sz="24" w:space="8" w:color="4472C4" w:themeColor="accent1"/>
+                      <w:bottom w:val="single" w:sz="24" w:space="8" w:color="4472C4" w:themeColor="accent1"/>
+                    </w:pBdr>
+                    <w:spacing w:after="0"/>
+                    <w:rPr>
+                      <w:i/>
+                      <w:iCs/>
+                      <w:color w:val="4472C4" w:themeColor="accent1"/>
+                      <w:sz w:val="24"/>
+                      <w:szCs w:val="24"/>
+                    </w:rPr>
+                  </w:pPr>
+                  <w:r>
+                    <w:rPr>
+                      <w:i/>
+                      <w:iCs/>
+                      <w:color w:val="4472C4" w:themeColor="accent1"/>
+                      <w:sz w:val="24"/>
+                      <w:szCs w:val="24"/>
+                    </w:rPr>
+                    <w:t xml:space="preserve">    Tekst: {text}</w:t>
+                  </w:r>
+                </w:p>
+                <w:p>
+                  <w:pPr>
+                    <w:pBdr>
+                      <w:top w:val="single" w:sz="24" w:space="8" w:color="4472C4" w:themeColor="accent1"/>
+                      <w:bottom w:val="single" w:sz="24" w:space="8" w:color="4472C4" w:themeColor="accent1"/>
+                    </w:pBdr>
+                    <w:spacing w:after="0"/>
+                    <w:rPr>
+                      <w:i/>
+                      <w:iCs/>
+                      <w:color w:val="4472C4" w:themeColor="accent1"/>
+                      <w:sz w:val="24"/>
+                    </w:rPr>
+                  </w:pPr>
+                  <w:r>
+                    <w:rPr>
+                      <w:i/>
+                      <w:iCs/>
+                      <w:color w:val="4472C4" w:themeColor="accent1"/>
+                      <w:sz w:val="24"/>
+                      <w:szCs w:val="24"/>
+                    </w:rPr>
+                    <w:t xml:space="preserve">    Pozitivan sentiment:</w:t>
+                  </w:r>
+                </w:p>
+              </w:txbxContent>
+            </v:textbox>
+            <w10:wrap type="topAndBottom" anchorx="page"/>
+          </v:shape>
+        </w:pict>
       </w:r>
     </w:p>
     <w:p>
@@ -3168,16 +2403,8 @@
         <w:rPr>
           <w:lang w:val="en-GB"/>
         </w:rPr>
-        <w:t xml:space="preserve"> for fine marking of positive </w:t>
-      </w:r>
-      <w:proofErr w:type="gramStart"/>
-      <w:r>
-        <w:rPr>
-          <w:lang w:val="en-GB"/>
-        </w:rPr>
-        <w:t>sentiment</w:t>
-      </w:r>
-      <w:proofErr w:type="gramEnd"/>
+        <w:t xml:space="preserve"> for fine marking of positive sentiment</w:t>
+      </w:r>
     </w:p>
     <w:bookmarkEnd w:id="7"/>
     <w:p>
@@ -3190,381 +2417,145 @@
       <w:r>
         <w:rPr>
           <w:noProof/>
-          <w:lang w:val="en-GB"/>
-        </w:rPr>
-        <mc:AlternateContent>
-          <mc:Choice Requires="wps">
-            <w:drawing>
-              <wp:anchor distT="91440" distB="91440" distL="114300" distR="114300" simplePos="0" relativeHeight="251663360" behindDoc="0" locked="0" layoutInCell="1" allowOverlap="1" wp14:anchorId="3EEECD6C" wp14:editId="6A4B71BD">
-                <wp:simplePos x="0" y="0"/>
-                <wp:positionH relativeFrom="page">
-                  <wp:align>center</wp:align>
-                </wp:positionH>
-                <wp:positionV relativeFrom="paragraph">
-                  <wp:posOffset>274320</wp:posOffset>
-                </wp:positionV>
-                <wp:extent cx="3474720" cy="1403985"/>
-                <wp:effectExtent l="0" t="0" r="0" b="0"/>
-                <wp:wrapTopAndBottom/>
-                <wp:docPr id="1382468389" name="Text Box 2"/>
-                <wp:cNvGraphicFramePr>
-                  <a:graphicFrameLocks xmlns:a="http://schemas.openxmlformats.org/drawingml/2006/main"/>
-                </wp:cNvGraphicFramePr>
-                <a:graphic xmlns:a="http://schemas.openxmlformats.org/drawingml/2006/main">
-                  <a:graphicData uri="http://schemas.microsoft.com/office/word/2010/wordprocessingShape">
-                    <wps:wsp>
-                      <wps:cNvSpPr txBox="1">
-                        <a:spLocks noChangeArrowheads="1"/>
-                      </wps:cNvSpPr>
-                      <wps:spPr bwMode="auto">
-                        <a:xfrm>
-                          <a:off x="0" y="0"/>
-                          <a:ext cx="3474720" cy="1403985"/>
-                        </a:xfrm>
-                        <a:prstGeom prst="rect">
-                          <a:avLst/>
-                        </a:prstGeom>
-                        <a:noFill/>
-                        <a:ln w="9525">
-                          <a:noFill/>
-                          <a:miter lim="800000"/>
-                          <a:headEnd/>
-                          <a:tailEnd/>
-                        </a:ln>
-                      </wps:spPr>
-                      <wps:txbx>
-                        <w:txbxContent>
-                          <w:p>
-                            <w:pPr>
-                              <w:pBdr>
-                                <w:top w:val="single" w:sz="24" w:space="8" w:color="4472C4" w:themeColor="accent1"/>
-                                <w:bottom w:val="single" w:sz="24" w:space="8" w:color="4472C4" w:themeColor="accent1"/>
-                              </w:pBdr>
-                              <w:spacing w:after="0"/>
-                              <w:rPr>
-                                <w:i/>
-                                <w:iCs/>
-                                <w:color w:val="4472C4" w:themeColor="accent1"/>
-                                <w:sz w:val="24"/>
-                                <w:szCs w:val="24"/>
-                              </w:rPr>
-                            </w:pPr>
-                            <w:r>
-                              <w:rPr>
-                                <w:i/>
-                                <w:iCs/>
-                                <w:color w:val="4472C4" w:themeColor="accent1"/>
-                                <w:sz w:val="24"/>
-                                <w:szCs w:val="24"/>
-                              </w:rPr>
-                              <w:t xml:space="preserve">    Kao ekspert za analizu sentimenta, analizirajte sledeći tekst na srpskom jeziku i odredite da li ima negativan sentiment.</w:t>
-                            </w:r>
-                          </w:p>
-                          <w:p>
-                            <w:pPr>
-                              <w:pBdr>
-                                <w:top w:val="single" w:sz="24" w:space="8" w:color="4472C4" w:themeColor="accent1"/>
-                                <w:bottom w:val="single" w:sz="24" w:space="8" w:color="4472C4" w:themeColor="accent1"/>
-                              </w:pBdr>
-                              <w:spacing w:after="0"/>
-                              <w:rPr>
-                                <w:i/>
-                                <w:iCs/>
-                                <w:color w:val="4472C4" w:themeColor="accent1"/>
-                                <w:sz w:val="24"/>
-                                <w:szCs w:val="24"/>
-                              </w:rPr>
-                            </w:pPr>
-                            <w:r>
-                              <w:rPr>
-                                <w:i/>
-                                <w:iCs/>
-                                <w:color w:val="4472C4" w:themeColor="accent1"/>
-                                <w:sz w:val="24"/>
-                                <w:szCs w:val="24"/>
-                              </w:rPr>
-                              <w:t xml:space="preserve">    Sentiment treba da bude striktno klasifikovan kao "nije negativan", "slabo negativan", "umereno negativan", "veoma negativan", ili "ekstremno negativan". Nijedan drugi odgovor neće biti prihvaćen. </w:t>
-                            </w:r>
-                          </w:p>
-                          <w:p>
-                            <w:pPr>
-                              <w:pBdr>
-                                <w:top w:val="single" w:sz="24" w:space="8" w:color="4472C4" w:themeColor="accent1"/>
-                                <w:bottom w:val="single" w:sz="24" w:space="8" w:color="4472C4" w:themeColor="accent1"/>
-                              </w:pBdr>
-                              <w:spacing w:after="0"/>
-                              <w:rPr>
-                                <w:i/>
-                                <w:iCs/>
-                                <w:color w:val="4472C4" w:themeColor="accent1"/>
-                                <w:sz w:val="24"/>
-                                <w:szCs w:val="24"/>
-                              </w:rPr>
-                            </w:pPr>
-                            <w:r>
-                              <w:rPr>
-                                <w:i/>
-                                <w:iCs/>
-                                <w:color w:val="4472C4" w:themeColor="accent1"/>
-                                <w:sz w:val="24"/>
-                                <w:szCs w:val="24"/>
-                              </w:rPr>
-                              <w:t xml:space="preserve">    Nijedan drugi odgovor neće biti prihvaćen.  </w:t>
-                            </w:r>
-                          </w:p>
-                          <w:p>
-                            <w:pPr>
-                              <w:pBdr>
-                                <w:top w:val="single" w:sz="24" w:space="8" w:color="4472C4" w:themeColor="accent1"/>
-                                <w:bottom w:val="single" w:sz="24" w:space="8" w:color="4472C4" w:themeColor="accent1"/>
-                              </w:pBdr>
-                              <w:spacing w:after="0"/>
-                              <w:rPr>
-                                <w:i/>
-                                <w:iCs/>
-                                <w:color w:val="4472C4" w:themeColor="accent1"/>
-                                <w:sz w:val="24"/>
-                                <w:szCs w:val="24"/>
-                              </w:rPr>
-                            </w:pPr>
-                            <w:r>
-                              <w:rPr>
-                                <w:i/>
-                                <w:iCs/>
-                                <w:color w:val="4472C4" w:themeColor="accent1"/>
-                                <w:sz w:val="24"/>
-                                <w:szCs w:val="24"/>
-                              </w:rPr>
-                              <w:t xml:space="preserve">    Tekst: {</w:t>
-                            </w:r>
-                            <w:proofErr w:type="spellStart"/>
-                            <w:r>
-                              <w:rPr>
-                                <w:i/>
-                                <w:iCs/>
-                                <w:color w:val="4472C4" w:themeColor="accent1"/>
-                                <w:sz w:val="24"/>
-                                <w:szCs w:val="24"/>
-                              </w:rPr>
-                              <w:t>text</w:t>
-                            </w:r>
-                            <w:proofErr w:type="spellEnd"/>
-                            <w:r>
-                              <w:rPr>
-                                <w:i/>
-                                <w:iCs/>
-                                <w:color w:val="4472C4" w:themeColor="accent1"/>
-                                <w:sz w:val="24"/>
-                                <w:szCs w:val="24"/>
-                              </w:rPr>
-                              <w:t>}</w:t>
-                            </w:r>
-                          </w:p>
-                          <w:p>
-                            <w:pPr>
-                              <w:pBdr>
-                                <w:top w:val="single" w:sz="24" w:space="8" w:color="4472C4" w:themeColor="accent1"/>
-                                <w:bottom w:val="single" w:sz="24" w:space="8" w:color="4472C4" w:themeColor="accent1"/>
-                              </w:pBdr>
-                              <w:spacing w:after="0"/>
-                              <w:rPr>
-                                <w:i/>
-                                <w:iCs/>
-                                <w:color w:val="4472C4" w:themeColor="accent1"/>
-                                <w:sz w:val="24"/>
-                              </w:rPr>
-                            </w:pPr>
-                            <w:r>
-                              <w:rPr>
-                                <w:i/>
-                                <w:iCs/>
-                                <w:color w:val="4472C4" w:themeColor="accent1"/>
-                                <w:sz w:val="24"/>
-                                <w:szCs w:val="24"/>
-                              </w:rPr>
-                              <w:t xml:space="preserve">    Negativan sentiment:</w:t>
-                            </w:r>
-                          </w:p>
-                        </w:txbxContent>
-                      </wps:txbx>
-                      <wps:bodyPr rot="0" vert="horz" wrap="square" lIns="91440" tIns="45720" rIns="91440" bIns="45720" anchor="t" anchorCtr="0">
-                        <a:spAutoFit/>
-                      </wps:bodyPr>
-                    </wps:wsp>
-                  </a:graphicData>
-                </a:graphic>
-                <wp14:sizeRelH relativeFrom="margin">
-                  <wp14:pctWidth>58500</wp14:pctWidth>
-                </wp14:sizeRelH>
-                <wp14:sizeRelV relativeFrom="margin">
-                  <wp14:pctHeight>20000</wp14:pctHeight>
-                </wp14:sizeRelV>
-              </wp:anchor>
-            </w:drawing>
-          </mc:Choice>
-          <mc:Fallback>
-            <w:pict>
-              <v:shape w14:anchorId="3EEECD6C" id="_x0000_s1028" type="#_x0000_t202" style="position:absolute;left:0;text-align:left;margin-left:0;margin-top:21.6pt;width:273.6pt;height:110.55pt;z-index:251663360;visibility:visible;mso-wrap-style:square;mso-width-percent:585;mso-height-percent:200;mso-wrap-distance-left:9pt;mso-wrap-distance-top:7.2pt;mso-wrap-distance-right:9pt;mso-wrap-distance-bottom:7.2pt;mso-position-horizontal:center;mso-position-horizontal-relative:page;mso-position-vertical:absolute;mso-position-vertical-relative:text;mso-width-percent:585;mso-height-percent:200;mso-width-relative:margin;mso-height-relative:margin;v-text-anchor:top" o:gfxdata="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" filled="f" stroked="f">
-                <v:textbox style="mso-fit-shape-to-text:t">
-                  <w:txbxContent>
-                    <w:p>
-                      <w:pPr>
-                        <w:pBdr>
-                          <w:top w:val="single" w:sz="24" w:space="8" w:color="4472C4" w:themeColor="accent1"/>
-                          <w:bottom w:val="single" w:sz="24" w:space="8" w:color="4472C4" w:themeColor="accent1"/>
-                        </w:pBdr>
-                        <w:spacing w:after="0"/>
-                        <w:rPr>
-                          <w:i/>
-                          <w:iCs/>
-                          <w:color w:val="4472C4" w:themeColor="accent1"/>
-                          <w:sz w:val="24"/>
-                          <w:szCs w:val="24"/>
-                        </w:rPr>
-                      </w:pPr>
-                      <w:r>
-                        <w:rPr>
-                          <w:i/>
-                          <w:iCs/>
-                          <w:color w:val="4472C4" w:themeColor="accent1"/>
-                          <w:sz w:val="24"/>
-                          <w:szCs w:val="24"/>
-                        </w:rPr>
-                        <w:t xml:space="preserve">    Kao ekspert za analizu sentimenta, analizirajte sledeći tekst na srpskom jeziku i odredite da li ima negativan sentiment.</w:t>
-                      </w:r>
-                    </w:p>
-                    <w:p>
-                      <w:pPr>
-                        <w:pBdr>
-                          <w:top w:val="single" w:sz="24" w:space="8" w:color="4472C4" w:themeColor="accent1"/>
-                          <w:bottom w:val="single" w:sz="24" w:space="8" w:color="4472C4" w:themeColor="accent1"/>
-                        </w:pBdr>
-                        <w:spacing w:after="0"/>
-                        <w:rPr>
-                          <w:i/>
-                          <w:iCs/>
-                          <w:color w:val="4472C4" w:themeColor="accent1"/>
-                          <w:sz w:val="24"/>
-                          <w:szCs w:val="24"/>
-                        </w:rPr>
-                      </w:pPr>
-                      <w:r>
-                        <w:rPr>
-                          <w:i/>
-                          <w:iCs/>
-                          <w:color w:val="4472C4" w:themeColor="accent1"/>
-                          <w:sz w:val="24"/>
-                          <w:szCs w:val="24"/>
-                        </w:rPr>
-                        <w:t xml:space="preserve">    Sentiment treba da bude striktno klasifikovan kao "nije negativan", "slabo negativan", "umereno negativan", "veoma negativan", ili "ekstremno negativan". Nijedan drugi odgovor neće biti prihvaćen. </w:t>
-                      </w:r>
-                    </w:p>
-                    <w:p>
-                      <w:pPr>
-                        <w:pBdr>
-                          <w:top w:val="single" w:sz="24" w:space="8" w:color="4472C4" w:themeColor="accent1"/>
-                          <w:bottom w:val="single" w:sz="24" w:space="8" w:color="4472C4" w:themeColor="accent1"/>
-                        </w:pBdr>
-                        <w:spacing w:after="0"/>
-                        <w:rPr>
-                          <w:i/>
-                          <w:iCs/>
-                          <w:color w:val="4472C4" w:themeColor="accent1"/>
-                          <w:sz w:val="24"/>
-                          <w:szCs w:val="24"/>
-                        </w:rPr>
-                      </w:pPr>
-                      <w:r>
-                        <w:rPr>
-                          <w:i/>
-                          <w:iCs/>
-                          <w:color w:val="4472C4" w:themeColor="accent1"/>
-                          <w:sz w:val="24"/>
-                          <w:szCs w:val="24"/>
-                        </w:rPr>
-                        <w:t xml:space="preserve">    Nijedan drugi odgovor neće biti prihvaćen.  </w:t>
-                      </w:r>
-                    </w:p>
-                    <w:p>
-                      <w:pPr>
-                        <w:pBdr>
-                          <w:top w:val="single" w:sz="24" w:space="8" w:color="4472C4" w:themeColor="accent1"/>
-                          <w:bottom w:val="single" w:sz="24" w:space="8" w:color="4472C4" w:themeColor="accent1"/>
-                        </w:pBdr>
-                        <w:spacing w:after="0"/>
-                        <w:rPr>
-                          <w:i/>
-                          <w:iCs/>
-                          <w:color w:val="4472C4" w:themeColor="accent1"/>
-                          <w:sz w:val="24"/>
-                          <w:szCs w:val="24"/>
-                        </w:rPr>
-                      </w:pPr>
-                      <w:r>
-                        <w:rPr>
-                          <w:i/>
-                          <w:iCs/>
-                          <w:color w:val="4472C4" w:themeColor="accent1"/>
-                          <w:sz w:val="24"/>
-                          <w:szCs w:val="24"/>
-                        </w:rPr>
-                        <w:t xml:space="preserve">    Tekst: {</w:t>
-                      </w:r>
-                      <w:proofErr w:type="spellStart"/>
-                      <w:r>
-                        <w:rPr>
-                          <w:i/>
-                          <w:iCs/>
-                          <w:color w:val="4472C4" w:themeColor="accent1"/>
-                          <w:sz w:val="24"/>
-                          <w:szCs w:val="24"/>
-                        </w:rPr>
-                        <w:t>text</w:t>
-                      </w:r>
-                      <w:proofErr w:type="spellEnd"/>
-                      <w:r>
-                        <w:rPr>
-                          <w:i/>
-                          <w:iCs/>
-                          <w:color w:val="4472C4" w:themeColor="accent1"/>
-                          <w:sz w:val="24"/>
-                          <w:szCs w:val="24"/>
-                        </w:rPr>
-                        <w:t>}</w:t>
-                      </w:r>
-                    </w:p>
-                    <w:p>
-                      <w:pPr>
-                        <w:pBdr>
-                          <w:top w:val="single" w:sz="24" w:space="8" w:color="4472C4" w:themeColor="accent1"/>
-                          <w:bottom w:val="single" w:sz="24" w:space="8" w:color="4472C4" w:themeColor="accent1"/>
-                        </w:pBdr>
-                        <w:spacing w:after="0"/>
-                        <w:rPr>
-                          <w:i/>
-                          <w:iCs/>
-                          <w:color w:val="4472C4" w:themeColor="accent1"/>
-                          <w:sz w:val="24"/>
-                        </w:rPr>
-                      </w:pPr>
-                      <w:r>
-                        <w:rPr>
-                          <w:i/>
-                          <w:iCs/>
-                          <w:color w:val="4472C4" w:themeColor="accent1"/>
-                          <w:sz w:val="24"/>
-                          <w:szCs w:val="24"/>
-                        </w:rPr>
-                        <w:t xml:space="preserve">    Negativan sentiment:</w:t>
-                      </w:r>
-                    </w:p>
-                  </w:txbxContent>
-                </v:textbox>
-                <w10:wrap type="topAndBottom" anchorx="page"/>
-              </v:shape>
-            </w:pict>
-          </mc:Fallback>
-        </mc:AlternateContent>
+        </w:rPr>
+        <w:pict w14:anchorId="4E35E655">
+          <v:shape id="_x0000_s1026" type="#_x0000_t202" style="position:absolute;left:0;text-align:left;margin-left:0;margin-top:21.6pt;width:273.6pt;height:110.55pt;z-index:251663360;visibility:visible;mso-wrap-style:square;mso-width-percent:585;mso-height-percent:200;mso-wrap-distance-left:9pt;mso-wrap-distance-top:7.2pt;mso-wrap-distance-right:9pt;mso-wrap-distance-bottom:7.2pt;mso-position-horizontal:center;mso-position-horizontal-relative:page;mso-position-vertical:absolute;mso-position-vertical-relative:text;mso-width-percent:585;mso-height-percent:200;mso-width-relative:margin;mso-height-relative:margin;v-text-anchor:top" o:gfxdata="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" filled="f" stroked="f">
+            <v:textbox style="mso-fit-shape-to-text:t">
+              <w:txbxContent>
+                <w:p>
+                  <w:pPr>
+                    <w:pBdr>
+                      <w:top w:val="single" w:sz="24" w:space="8" w:color="4472C4" w:themeColor="accent1"/>
+                      <w:bottom w:val="single" w:sz="24" w:space="8" w:color="4472C4" w:themeColor="accent1"/>
+                    </w:pBdr>
+                    <w:spacing w:after="0"/>
+                    <w:rPr>
+                      <w:i/>
+                      <w:iCs/>
+                      <w:color w:val="4472C4" w:themeColor="accent1"/>
+                      <w:sz w:val="24"/>
+                      <w:szCs w:val="24"/>
+                    </w:rPr>
+                  </w:pPr>
+                  <w:r>
+                    <w:rPr>
+                      <w:i/>
+                      <w:iCs/>
+                      <w:color w:val="4472C4" w:themeColor="accent1"/>
+                      <w:sz w:val="24"/>
+                      <w:szCs w:val="24"/>
+                    </w:rPr>
+                    <w:t xml:space="preserve">    Kao ekspert za analizu sentimenta, analizirajte sledeći tekst na srpskom jeziku i odredite da li ima negativan sentiment.</w:t>
+                  </w:r>
+                </w:p>
+                <w:p>
+                  <w:pPr>
+                    <w:pBdr>
+                      <w:top w:val="single" w:sz="24" w:space="8" w:color="4472C4" w:themeColor="accent1"/>
+                      <w:bottom w:val="single" w:sz="24" w:space="8" w:color="4472C4" w:themeColor="accent1"/>
+                    </w:pBdr>
+                    <w:spacing w:after="0"/>
+                    <w:rPr>
+                      <w:i/>
+                      <w:iCs/>
+                      <w:color w:val="4472C4" w:themeColor="accent1"/>
+                      <w:sz w:val="24"/>
+                      <w:szCs w:val="24"/>
+                    </w:rPr>
+                  </w:pPr>
+                  <w:r>
+                    <w:rPr>
+                      <w:i/>
+                      <w:iCs/>
+                      <w:color w:val="4472C4" w:themeColor="accent1"/>
+                      <w:sz w:val="24"/>
+                      <w:szCs w:val="24"/>
+                    </w:rPr>
+                    <w:t xml:space="preserve">    Sentiment treba da bude striktno klasifikovan kao "nije negativan", "slabo negativan", "umereno negativan", "veoma negativan", ili "ekstremno negativan". Nijedan drugi odgovor neće biti prihvaćen. </w:t>
+                  </w:r>
+                </w:p>
+                <w:p>
+                  <w:pPr>
+                    <w:pBdr>
+                      <w:top w:val="single" w:sz="24" w:space="8" w:color="4472C4" w:themeColor="accent1"/>
+                      <w:bottom w:val="single" w:sz="24" w:space="8" w:color="4472C4" w:themeColor="accent1"/>
+                    </w:pBdr>
+                    <w:spacing w:after="0"/>
+                    <w:rPr>
+                      <w:i/>
+                      <w:iCs/>
+                      <w:color w:val="4472C4" w:themeColor="accent1"/>
+                      <w:sz w:val="24"/>
+                      <w:szCs w:val="24"/>
+                    </w:rPr>
+                  </w:pPr>
+                  <w:r>
+                    <w:rPr>
+                      <w:i/>
+                      <w:iCs/>
+                      <w:color w:val="4472C4" w:themeColor="accent1"/>
+                      <w:sz w:val="24"/>
+                      <w:szCs w:val="24"/>
+                    </w:rPr>
+                    <w:t xml:space="preserve">    Nijedan drugi odgovor neće biti prihvaćen.  </w:t>
+                  </w:r>
+                </w:p>
+                <w:p>
+                  <w:pPr>
+                    <w:pBdr>
+                      <w:top w:val="single" w:sz="24" w:space="8" w:color="4472C4" w:themeColor="accent1"/>
+                      <w:bottom w:val="single" w:sz="24" w:space="8" w:color="4472C4" w:themeColor="accent1"/>
+                    </w:pBdr>
+                    <w:spacing w:after="0"/>
+                    <w:rPr>
+                      <w:i/>
+                      <w:iCs/>
+                      <w:color w:val="4472C4" w:themeColor="accent1"/>
+                      <w:sz w:val="24"/>
+                      <w:szCs w:val="24"/>
+                    </w:rPr>
+                  </w:pPr>
+                  <w:r>
+                    <w:rPr>
+                      <w:i/>
+                      <w:iCs/>
+                      <w:color w:val="4472C4" w:themeColor="accent1"/>
+                      <w:sz w:val="24"/>
+                      <w:szCs w:val="24"/>
+                    </w:rPr>
+                    <w:t xml:space="preserve">    Tekst: {text}</w:t>
+                  </w:r>
+                </w:p>
+                <w:p>
+                  <w:pPr>
+                    <w:pBdr>
+                      <w:top w:val="single" w:sz="24" w:space="8" w:color="4472C4" w:themeColor="accent1"/>
+                      <w:bottom w:val="single" w:sz="24" w:space="8" w:color="4472C4" w:themeColor="accent1"/>
+                    </w:pBdr>
+                    <w:spacing w:after="0"/>
+                    <w:rPr>
+                      <w:i/>
+                      <w:iCs/>
+                      <w:color w:val="4472C4" w:themeColor="accent1"/>
+                      <w:sz w:val="24"/>
+                    </w:rPr>
+                  </w:pPr>
+                  <w:r>
+                    <w:rPr>
+                      <w:i/>
+                      <w:iCs/>
+                      <w:color w:val="4472C4" w:themeColor="accent1"/>
+                      <w:sz w:val="24"/>
+                      <w:szCs w:val="24"/>
+                    </w:rPr>
+                    <w:t xml:space="preserve">    Negativan sentiment:</w:t>
+                  </w:r>
+                </w:p>
+              </w:txbxContent>
+            </v:textbox>
+            <w10:wrap type="topAndBottom" anchorx="page"/>
+          </v:shape>
+        </w:pict>
       </w:r>
     </w:p>
     <w:p>
@@ -3602,16 +2593,8 @@
         <w:rPr>
           <w:lang w:val="en-GB"/>
         </w:rPr>
-        <w:t xml:space="preserve"> </w:t>
-      </w:r>
-      <w:proofErr w:type="gramStart"/>
-      <w:r>
-        <w:rPr>
-          <w:lang w:val="en-GB"/>
-        </w:rPr>
-        <w:t>sentiment</w:t>
-      </w:r>
-      <w:proofErr w:type="gramEnd"/>
+        <w:t xml:space="preserve"> sentiment</w:t>
+      </w:r>
     </w:p>
     <w:p>
       <w:pPr>
@@ -3780,7 +2763,6 @@
         <w:rPr>
           <w:lang w:val="en-GB"/>
         </w:rPr>
-        <w:lastRenderedPageBreak/>
         <w:t>For negative:</w:t>
       </w:r>
     </w:p>
@@ -3975,21 +2957,7 @@
         <w:rPr>
           <w:lang w:val="en-GB"/>
         </w:rPr>
-        <w:t xml:space="preserve">: Inter-Lingual Index, which connects the synset to its equivalents in other languages' </w:t>
-      </w:r>
-      <w:proofErr w:type="spellStart"/>
-      <w:r>
-        <w:rPr>
-          <w:lang w:val="en-GB"/>
-        </w:rPr>
-        <w:t>WordNets</w:t>
-      </w:r>
-      <w:proofErr w:type="spellEnd"/>
-      <w:r>
-        <w:rPr>
-          <w:lang w:val="en-GB"/>
-        </w:rPr>
-        <w:t>.</w:t>
+        <w:t>: Inter-Lingual Index, which connects the synset to its equivalents in other languages' WordNets.</w:t>
       </w:r>
     </w:p>
     <w:p>
@@ -4027,7 +2995,6 @@
           <w:lang w:val="en-GB"/>
         </w:rPr>
       </w:pPr>
-      <w:proofErr w:type="spellStart"/>
       <w:r>
         <w:rPr>
           <w:b/>
@@ -4036,7 +3003,6 @@
         </w:rPr>
         <w:t>Lemma_names</w:t>
       </w:r>
-      <w:proofErr w:type="spellEnd"/>
       <w:r>
         <w:rPr>
           <w:lang w:val="en-GB"/>
@@ -4054,7 +3020,6 @@
           <w:lang w:val="en-GB"/>
         </w:rPr>
       </w:pPr>
-      <w:proofErr w:type="spellStart"/>
       <w:r>
         <w:rPr>
           <w:b/>
@@ -4063,26 +3028,11 @@
         </w:rPr>
         <w:t>Sentiment_SWN</w:t>
       </w:r>
-      <w:proofErr w:type="spellEnd"/>
-      <w:r>
-        <w:rPr>
-          <w:lang w:val="en-GB"/>
-        </w:rPr>
-        <w:t xml:space="preserve">: The sentiment value mapped from </w:t>
-      </w:r>
-      <w:proofErr w:type="spellStart"/>
-      <w:r>
-        <w:rPr>
-          <w:lang w:val="en-GB"/>
-        </w:rPr>
-        <w:t>SentiWordNet</w:t>
-      </w:r>
-      <w:proofErr w:type="spellEnd"/>
-      <w:r>
-        <w:rPr>
-          <w:lang w:val="en-GB"/>
-        </w:rPr>
-        <w:t xml:space="preserve"> (SWN), indicating the original sentiment score in the English version.</w:t>
+      <w:r>
+        <w:rPr>
+          <w:lang w:val="en-GB"/>
+        </w:rPr>
+        <w:t>: The sentiment value mapped from SentiWordNet (SWN), indicating the original sentiment score in the English version.</w:t>
       </w:r>
     </w:p>
     <w:p>
@@ -4095,7 +3045,6 @@
           <w:lang w:val="en-GB"/>
         </w:rPr>
       </w:pPr>
-      <w:proofErr w:type="spellStart"/>
       <w:r>
         <w:rPr>
           <w:b/>
@@ -4104,7 +3053,6 @@
         </w:rPr>
         <w:t>Sentiment_lexicon</w:t>
       </w:r>
-      <w:proofErr w:type="spellEnd"/>
       <w:r>
         <w:rPr>
           <w:lang w:val="en-GB"/>
@@ -4122,7 +3070,6 @@
           <w:lang w:val="en-GB"/>
         </w:rPr>
       </w:pPr>
-      <w:proofErr w:type="spellStart"/>
       <w:r>
         <w:rPr>
           <w:b/>
@@ -4131,7 +3078,6 @@
         </w:rPr>
         <w:t>Sentiment_sa</w:t>
       </w:r>
-      <w:proofErr w:type="spellEnd"/>
       <w:r>
         <w:rPr>
           <w:lang w:val="en-GB"/>
@@ -4149,7 +3095,6 @@
           <w:lang w:val="en-GB"/>
         </w:rPr>
       </w:pPr>
-      <w:proofErr w:type="spellStart"/>
       <w:r>
         <w:rPr>
           <w:b/>
@@ -4158,7 +3103,6 @@
         </w:rPr>
         <w:t>Sentiment_sa_positive</w:t>
       </w:r>
-      <w:proofErr w:type="spellEnd"/>
       <w:r>
         <w:rPr>
           <w:lang w:val="en-GB"/>
@@ -4176,7 +3120,6 @@
           <w:lang w:val="en-GB"/>
         </w:rPr>
       </w:pPr>
-      <w:proofErr w:type="spellStart"/>
       <w:r>
         <w:rPr>
           <w:b/>
@@ -4185,7 +3128,6 @@
         </w:rPr>
         <w:t>Sentiment_sa_negative</w:t>
       </w:r>
-      <w:proofErr w:type="spellEnd"/>
       <w:r>
         <w:rPr>
           <w:lang w:val="en-GB"/>
@@ -4318,6 +3260,13 @@
         </w:rPr>
         <w:t xml:space="preserve"> are shown on Table 1 and 2. </w:t>
       </w:r>
+    </w:p>
+    <w:p>
+      <w:pPr>
+        <w:rPr>
+          <w:lang w:val="en-GB"/>
+        </w:rPr>
+      </w:pPr>
     </w:p>
     <w:p>
       <w:pPr>
@@ -4366,7 +3315,6 @@
                 <w14:ligatures w14:val="none"/>
               </w:rPr>
             </w:pPr>
-            <w:proofErr w:type="spellStart"/>
             <w:r>
               <w:rPr>
                 <w:rFonts w:ascii="Calibri" w:eastAsia="Times New Roman" w:hAnsi="Calibri" w:cs="Calibri"/>
@@ -4377,35 +3325,8 @@
                 <w:lang w:eastAsia="sr-Latn-RS"/>
                 <w14:ligatures w14:val="none"/>
               </w:rPr>
-              <w:t>Row</w:t>
+              <w:t>Row Labels</w:t>
             </w:r>
-            <w:proofErr w:type="spellEnd"/>
-            <w:r>
-              <w:rPr>
-                <w:rFonts w:ascii="Calibri" w:eastAsia="Times New Roman" w:hAnsi="Calibri" w:cs="Calibri"/>
-                <w:b/>
-                <w:bCs/>
-                <w:color w:val="000000"/>
-                <w:kern w:val="0"/>
-                <w:lang w:eastAsia="sr-Latn-RS"/>
-                <w14:ligatures w14:val="none"/>
-              </w:rPr>
-              <w:t xml:space="preserve"> </w:t>
-            </w:r>
-            <w:proofErr w:type="spellStart"/>
-            <w:r>
-              <w:rPr>
-                <w:rFonts w:ascii="Calibri" w:eastAsia="Times New Roman" w:hAnsi="Calibri" w:cs="Calibri"/>
-                <w:b/>
-                <w:bCs/>
-                <w:color w:val="000000"/>
-                <w:kern w:val="0"/>
-                <w:lang w:eastAsia="sr-Latn-RS"/>
-                <w14:ligatures w14:val="none"/>
-              </w:rPr>
-              <w:t>Labels</w:t>
-            </w:r>
-            <w:proofErr w:type="spellEnd"/>
           </w:p>
         </w:tc>
         <w:tc>
@@ -4435,7 +3356,6 @@
                 <w14:ligatures w14:val="none"/>
               </w:rPr>
             </w:pPr>
-            <w:proofErr w:type="spellStart"/>
             <w:r>
               <w:rPr>
                 <w:rFonts w:ascii="Calibri" w:eastAsia="Times New Roman" w:hAnsi="Calibri" w:cs="Calibri"/>
@@ -4446,61 +3366,8 @@
                 <w:lang w:eastAsia="sr-Latn-RS"/>
                 <w14:ligatures w14:val="none"/>
               </w:rPr>
-              <w:t>Count</w:t>
+              <w:t>Count of sentiment_sa_negative</w:t>
             </w:r>
-            <w:proofErr w:type="spellEnd"/>
-            <w:r>
-              <w:rPr>
-                <w:rFonts w:ascii="Calibri" w:eastAsia="Times New Roman" w:hAnsi="Calibri" w:cs="Calibri"/>
-                <w:b/>
-                <w:bCs/>
-                <w:color w:val="000000"/>
-                <w:kern w:val="0"/>
-                <w:lang w:eastAsia="sr-Latn-RS"/>
-                <w14:ligatures w14:val="none"/>
-              </w:rPr>
-              <w:t xml:space="preserve"> </w:t>
-            </w:r>
-            <w:proofErr w:type="spellStart"/>
-            <w:r>
-              <w:rPr>
-                <w:rFonts w:ascii="Calibri" w:eastAsia="Times New Roman" w:hAnsi="Calibri" w:cs="Calibri"/>
-                <w:b/>
-                <w:bCs/>
-                <w:color w:val="000000"/>
-                <w:kern w:val="0"/>
-                <w:lang w:eastAsia="sr-Latn-RS"/>
-                <w14:ligatures w14:val="none"/>
-              </w:rPr>
-              <w:t>of</w:t>
-            </w:r>
-            <w:proofErr w:type="spellEnd"/>
-            <w:r>
-              <w:rPr>
-                <w:rFonts w:ascii="Calibri" w:eastAsia="Times New Roman" w:hAnsi="Calibri" w:cs="Calibri"/>
-                <w:b/>
-                <w:bCs/>
-                <w:color w:val="000000"/>
-                <w:kern w:val="0"/>
-                <w:lang w:eastAsia="sr-Latn-RS"/>
-                <w14:ligatures w14:val="none"/>
-              </w:rPr>
-              <w:t xml:space="preserve"> </w:t>
-            </w:r>
-            <w:proofErr w:type="spellStart"/>
-            <w:r>
-              <w:rPr>
-                <w:rFonts w:ascii="Calibri" w:eastAsia="Times New Roman" w:hAnsi="Calibri" w:cs="Calibri"/>
-                <w:b/>
-                <w:bCs/>
-                <w:color w:val="000000"/>
-                <w:kern w:val="0"/>
-                <w:lang w:eastAsia="sr-Latn-RS"/>
-                <w14:ligatures w14:val="none"/>
-              </w:rPr>
-              <w:t>sentiment_sa_negative</w:t>
-            </w:r>
-            <w:proofErr w:type="spellEnd"/>
           </w:p>
         </w:tc>
       </w:tr>
@@ -4541,7 +3408,6 @@
                 <w:lang w:eastAsia="sr-Latn-RS"/>
                 <w14:ligatures w14:val="none"/>
               </w:rPr>
-              <w:lastRenderedPageBreak/>
               <w:t>ekstremno negativan</w:t>
             </w:r>
           </w:p>
@@ -4774,7 +3640,6 @@
                 <w14:ligatures w14:val="none"/>
               </w:rPr>
             </w:pPr>
-            <w:proofErr w:type="spellStart"/>
             <w:r>
               <w:rPr>
                 <w:rFonts w:ascii="Calibri" w:eastAsia="Times New Roman" w:hAnsi="Calibri" w:cs="Calibri"/>
@@ -4783,18 +3648,7 @@
                 <w:lang w:eastAsia="sr-Latn-RS"/>
                 <w14:ligatures w14:val="none"/>
               </w:rPr>
-              <w:t>umjereno</w:t>
-            </w:r>
-            <w:proofErr w:type="spellEnd"/>
-            <w:r>
-              <w:rPr>
-                <w:rFonts w:ascii="Calibri" w:eastAsia="Times New Roman" w:hAnsi="Calibri" w:cs="Calibri"/>
-                <w:color w:val="000000"/>
-                <w:kern w:val="0"/>
-                <w:lang w:eastAsia="sr-Latn-RS"/>
-                <w14:ligatures w14:val="none"/>
-              </w:rPr>
-              <w:t xml:space="preserve"> negativan</w:t>
+              <w:t>umjereno negativan</w:t>
             </w:r>
           </w:p>
         </w:tc>
@@ -5066,7 +3920,6 @@
                 <w14:ligatures w14:val="none"/>
               </w:rPr>
             </w:pPr>
-            <w:proofErr w:type="spellStart"/>
             <w:r>
               <w:rPr>
                 <w:rFonts w:ascii="Calibri" w:eastAsia="Times New Roman" w:hAnsi="Calibri" w:cs="Calibri"/>
@@ -5077,35 +3930,8 @@
                 <w:lang w:eastAsia="sr-Latn-RS"/>
                 <w14:ligatures w14:val="none"/>
               </w:rPr>
-              <w:t>Row</w:t>
+              <w:t>Row Labels</w:t>
             </w:r>
-            <w:proofErr w:type="spellEnd"/>
-            <w:r>
-              <w:rPr>
-                <w:rFonts w:ascii="Calibri" w:eastAsia="Times New Roman" w:hAnsi="Calibri" w:cs="Calibri"/>
-                <w:b/>
-                <w:bCs/>
-                <w:color w:val="000000"/>
-                <w:kern w:val="0"/>
-                <w:lang w:eastAsia="sr-Latn-RS"/>
-                <w14:ligatures w14:val="none"/>
-              </w:rPr>
-              <w:t xml:space="preserve"> </w:t>
-            </w:r>
-            <w:proofErr w:type="spellStart"/>
-            <w:r>
-              <w:rPr>
-                <w:rFonts w:ascii="Calibri" w:eastAsia="Times New Roman" w:hAnsi="Calibri" w:cs="Calibri"/>
-                <w:b/>
-                <w:bCs/>
-                <w:color w:val="000000"/>
-                <w:kern w:val="0"/>
-                <w:lang w:eastAsia="sr-Latn-RS"/>
-                <w14:ligatures w14:val="none"/>
-              </w:rPr>
-              <w:t>Labels</w:t>
-            </w:r>
-            <w:proofErr w:type="spellEnd"/>
           </w:p>
         </w:tc>
         <w:tc>
@@ -5135,7 +3961,6 @@
                 <w14:ligatures w14:val="none"/>
               </w:rPr>
             </w:pPr>
-            <w:proofErr w:type="spellStart"/>
             <w:r>
               <w:rPr>
                 <w:rFonts w:ascii="Calibri" w:eastAsia="Times New Roman" w:hAnsi="Calibri" w:cs="Calibri"/>
@@ -5146,35 +3971,8 @@
                 <w:lang w:eastAsia="sr-Latn-RS"/>
                 <w14:ligatures w14:val="none"/>
               </w:rPr>
-              <w:t>Count</w:t>
+              <w:t>Count of sentiment_sa_positive</w:t>
             </w:r>
-            <w:proofErr w:type="spellEnd"/>
-            <w:r>
-              <w:rPr>
-                <w:rFonts w:ascii="Calibri" w:eastAsia="Times New Roman" w:hAnsi="Calibri" w:cs="Calibri"/>
-                <w:b/>
-                <w:bCs/>
-                <w:color w:val="000000"/>
-                <w:kern w:val="0"/>
-                <w:lang w:eastAsia="sr-Latn-RS"/>
-                <w14:ligatures w14:val="none"/>
-              </w:rPr>
-              <w:t xml:space="preserve"> of </w:t>
-            </w:r>
-            <w:proofErr w:type="spellStart"/>
-            <w:r>
-              <w:rPr>
-                <w:rFonts w:ascii="Calibri" w:eastAsia="Times New Roman" w:hAnsi="Calibri" w:cs="Calibri"/>
-                <w:b/>
-                <w:bCs/>
-                <w:color w:val="000000"/>
-                <w:kern w:val="0"/>
-                <w:lang w:eastAsia="sr-Latn-RS"/>
-                <w14:ligatures w14:val="none"/>
-              </w:rPr>
-              <w:t>sentiment_sa_positive</w:t>
-            </w:r>
-            <w:proofErr w:type="spellEnd"/>
           </w:p>
         </w:tc>
       </w:tr>
@@ -5695,20 +4493,8 @@
                 <w:lang w:eastAsia="sr-Latn-RS"/>
                 <w14:ligatures w14:val="none"/>
               </w:rPr>
-              <w:t xml:space="preserve">Umereno pozitivan </w:t>
+              <w:t>Umereno pozitivan The</w:t>
             </w:r>
-            <w:proofErr w:type="spellStart"/>
-            <w:r>
-              <w:rPr>
-                <w:rFonts w:ascii="Calibri" w:eastAsia="Times New Roman" w:hAnsi="Calibri" w:cs="Calibri"/>
-                <w:color w:val="000000"/>
-                <w:kern w:val="0"/>
-                <w:lang w:eastAsia="sr-Latn-RS"/>
-                <w14:ligatures w14:val="none"/>
-              </w:rPr>
-              <w:t>The</w:t>
-            </w:r>
-            <w:proofErr w:type="spellEnd"/>
           </w:p>
         </w:tc>
         <w:tc>
@@ -5779,7 +4565,6 @@
                 <w14:ligatures w14:val="none"/>
               </w:rPr>
             </w:pPr>
-            <w:proofErr w:type="spellStart"/>
             <w:r>
               <w:rPr>
                 <w:rFonts w:ascii="Calibri" w:eastAsia="Times New Roman" w:hAnsi="Calibri" w:cs="Calibri"/>
@@ -5788,18 +4573,7 @@
                 <w:lang w:eastAsia="sr-Latn-RS"/>
                 <w14:ligatures w14:val="none"/>
               </w:rPr>
-              <w:t>Umjereno</w:t>
-            </w:r>
-            <w:proofErr w:type="spellEnd"/>
-            <w:r>
-              <w:rPr>
-                <w:rFonts w:ascii="Calibri" w:eastAsia="Times New Roman" w:hAnsi="Calibri" w:cs="Calibri"/>
-                <w:color w:val="000000"/>
-                <w:kern w:val="0"/>
-                <w:lang w:eastAsia="sr-Latn-RS"/>
-                <w14:ligatures w14:val="none"/>
-              </w:rPr>
-              <w:t xml:space="preserve"> pozitivan</w:t>
+              <w:t>Umjereno pozitivan</w:t>
             </w:r>
           </w:p>
         </w:tc>
@@ -6332,9 +5106,8 @@
           <w:lang w:eastAsia="sr-Latn-RS"/>
           <w14:ligatures w14:val="none"/>
         </w:rPr>
-        <w:t xml:space="preserve">Učimo se </w:t>
-      </w:r>
-      <w:proofErr w:type="gramStart"/>
+        <w:t>Učimo se držati</w:t>
+      </w:r>
       <w:r>
         <w:rPr>
           <w:rFonts w:ascii="Calibri" w:eastAsia="Times New Roman" w:hAnsi="Calibri" w:cs="Calibri"/>
@@ -6343,28 +5116,7 @@
           <w:lang w:eastAsia="sr-Latn-RS"/>
           <w14:ligatures w14:val="none"/>
         </w:rPr>
-        <w:t>držati</w:t>
-      </w:r>
-      <w:r>
-        <w:rPr>
-          <w:rFonts w:ascii="Calibri" w:eastAsia="Times New Roman" w:hAnsi="Calibri" w:cs="Calibri"/>
-          <w:color w:val="000000"/>
-          <w:kern w:val="0"/>
-          <w:lang w:eastAsia="sr-Latn-RS"/>
-          <w14:ligatures w14:val="none"/>
-        </w:rPr>
-        <w:t>“</w:t>
-      </w:r>
-      <w:proofErr w:type="gramEnd"/>
-      <w:r>
-        <w:rPr>
-          <w:rFonts w:ascii="Calibri" w:eastAsia="Times New Roman" w:hAnsi="Calibri" w:cs="Calibri"/>
-          <w:color w:val="000000"/>
-          <w:kern w:val="0"/>
-          <w:lang w:eastAsia="sr-Latn-RS"/>
-          <w14:ligatures w14:val="none"/>
-        </w:rPr>
-        <w:t xml:space="preserve">, </w:t>
+        <w:t xml:space="preserve">“, </w:t>
       </w:r>
       <w:r>
         <w:rPr>
@@ -6735,14 +5487,7 @@
         <w:rPr>
           <w:lang w:val="en-GB"/>
         </w:rPr>
-        <w:t xml:space="preserve">Given the substantial number of synsets accurately labelled throughout our sentiment analysis process, we present a selection of illustrative examples below. These examples are intended to </w:t>
-      </w:r>
-      <w:r>
-        <w:rPr>
-          <w:lang w:val="en-GB"/>
-        </w:rPr>
-        <w:lastRenderedPageBreak/>
-        <w:t>demonstrate the criteria for what is considered correct labelling in the sentiment classifications of positive, negative, and neutral sentiments.</w:t>
+        <w:t>Given the substantial number of synsets accurately labelled throughout our sentiment analysis process, we present a selection of illustrative examples below. These examples are intended to demonstrate the criteria for what is considered correct labelling in the sentiment classifications of positive, negative, and neutral sentiments.</w:t>
       </w:r>
     </w:p>
     <w:p>
@@ -6781,49 +5526,7 @@
         <w:rPr>
           <w:lang w:val="en-GB"/>
         </w:rPr>
-        <w:t>: Synset associated with actions like '</w:t>
-      </w:r>
-      <w:proofErr w:type="spellStart"/>
-      <w:r>
-        <w:rPr>
-          <w:lang w:val="en-GB"/>
-        </w:rPr>
-        <w:t>kleveta</w:t>
-      </w:r>
-      <w:proofErr w:type="spellEnd"/>
-      <w:r>
-        <w:rPr>
-          <w:lang w:val="en-GB"/>
-        </w:rPr>
-        <w:t>' (defamation), '</w:t>
-      </w:r>
-      <w:proofErr w:type="spellStart"/>
-      <w:r>
-        <w:rPr>
-          <w:lang w:val="en-GB"/>
-        </w:rPr>
-        <w:t>klevetanje</w:t>
-      </w:r>
-      <w:proofErr w:type="spellEnd"/>
-      <w:r>
-        <w:rPr>
-          <w:lang w:val="en-GB"/>
-        </w:rPr>
-        <w:t>' (slander), and '</w:t>
-      </w:r>
-      <w:proofErr w:type="spellStart"/>
-      <w:r>
-        <w:rPr>
-          <w:lang w:val="en-GB"/>
-        </w:rPr>
-        <w:t>omalovažavanje</w:t>
-      </w:r>
-      <w:proofErr w:type="spellEnd"/>
-      <w:r>
-        <w:rPr>
-          <w:lang w:val="en-GB"/>
-        </w:rPr>
-        <w:t>' (disparagement), described as "</w:t>
+        <w:t>: Synset associated with actions like 'kleveta' (defamation), 'klevetanje' (slander), and 'omalovažavanje' (disparagement), described as "</w:t>
       </w:r>
       <w:r>
         <w:t>oštar napad na čiju ličnost ili dobro ime</w:t>
@@ -6832,63 +5535,7 @@
         <w:rPr>
           <w:lang w:val="en-GB"/>
         </w:rPr>
-        <w:t>" (a harsh attack on someone's personality or good name). This synset's sentiment was finely graded as "</w:t>
-      </w:r>
-      <w:proofErr w:type="spellStart"/>
-      <w:r>
-        <w:rPr>
-          <w:lang w:val="en-GB"/>
-        </w:rPr>
-        <w:t>Nije</w:t>
-      </w:r>
-      <w:proofErr w:type="spellEnd"/>
-      <w:r>
-        <w:rPr>
-          <w:lang w:val="en-GB"/>
-        </w:rPr>
-        <w:t xml:space="preserve"> </w:t>
-      </w:r>
-      <w:proofErr w:type="spellStart"/>
-      <w:r>
-        <w:rPr>
-          <w:lang w:val="en-GB"/>
-        </w:rPr>
-        <w:t>pozitivan</w:t>
-      </w:r>
-      <w:proofErr w:type="spellEnd"/>
-      <w:r>
-        <w:rPr>
-          <w:lang w:val="en-GB"/>
-        </w:rPr>
-        <w:t>" (Not positive), reflecting the absence of positive sentiment, and more precisely, "</w:t>
-      </w:r>
-      <w:proofErr w:type="spellStart"/>
-      <w:r>
-        <w:rPr>
-          <w:lang w:val="en-GB"/>
-        </w:rPr>
-        <w:t>Ekstremno</w:t>
-      </w:r>
-      <w:proofErr w:type="spellEnd"/>
-      <w:r>
-        <w:rPr>
-          <w:lang w:val="en-GB"/>
-        </w:rPr>
-        <w:t xml:space="preserve"> </w:t>
-      </w:r>
-      <w:proofErr w:type="spellStart"/>
-      <w:r>
-        <w:rPr>
-          <w:lang w:val="en-GB"/>
-        </w:rPr>
-        <w:t>negativan</w:t>
-      </w:r>
-      <w:proofErr w:type="spellEnd"/>
-      <w:r>
-        <w:rPr>
-          <w:lang w:val="en-GB"/>
-        </w:rPr>
-        <w:t>" (Extremely negative), accurately capturing the negative connotations of the described actions.</w:t>
+        <w:t>" (a harsh attack on someone's personality or good name). This synset's sentiment was finely graded as "Nije pozitivan" (Not positive), reflecting the absence of positive sentiment, and more precisely, "Ekstremno negativan" (Extremely negative), accurately capturing the negative connotations of the described actions.</w:t>
       </w:r>
     </w:p>
     <w:p>
@@ -6925,91 +5572,7 @@
         <w:rPr>
           <w:lang w:val="en-GB"/>
         </w:rPr>
-        <w:t>" (a character resembling a star (*) used in printed texts), with lemma names including 'asterisk', '</w:t>
-      </w:r>
-      <w:proofErr w:type="spellStart"/>
-      <w:r>
-        <w:rPr>
-          <w:lang w:val="en-GB"/>
-        </w:rPr>
-        <w:t>zvezdica</w:t>
-      </w:r>
-      <w:proofErr w:type="spellEnd"/>
-      <w:r>
-        <w:rPr>
-          <w:lang w:val="en-GB"/>
-        </w:rPr>
-        <w:t>' (little star), and '</w:t>
-      </w:r>
-      <w:proofErr w:type="spellStart"/>
-      <w:r>
-        <w:rPr>
-          <w:lang w:val="en-GB"/>
-        </w:rPr>
-        <w:t>zvezda</w:t>
-      </w:r>
-      <w:proofErr w:type="spellEnd"/>
-      <w:r>
-        <w:rPr>
-          <w:lang w:val="en-GB"/>
-        </w:rPr>
-        <w:t>' (star). The sentiment for this synset was precisely classified as "</w:t>
-      </w:r>
-      <w:proofErr w:type="spellStart"/>
-      <w:r>
-        <w:rPr>
-          <w:lang w:val="en-GB"/>
-        </w:rPr>
-        <w:t>Nije</w:t>
-      </w:r>
-      <w:proofErr w:type="spellEnd"/>
-      <w:r>
-        <w:rPr>
-          <w:lang w:val="en-GB"/>
-        </w:rPr>
-        <w:t xml:space="preserve"> </w:t>
-      </w:r>
-      <w:proofErr w:type="spellStart"/>
-      <w:r>
-        <w:rPr>
-          <w:lang w:val="en-GB"/>
-        </w:rPr>
-        <w:t>pozitivan</w:t>
-      </w:r>
-      <w:proofErr w:type="spellEnd"/>
-      <w:r>
-        <w:rPr>
-          <w:lang w:val="en-GB"/>
-        </w:rPr>
-        <w:t>" (Not positive) and "</w:t>
-      </w:r>
-      <w:proofErr w:type="spellStart"/>
-      <w:r>
-        <w:rPr>
-          <w:lang w:val="en-GB"/>
-        </w:rPr>
-        <w:t>Nije</w:t>
-      </w:r>
-      <w:proofErr w:type="spellEnd"/>
-      <w:r>
-        <w:rPr>
-          <w:lang w:val="en-GB"/>
-        </w:rPr>
-        <w:t xml:space="preserve"> </w:t>
-      </w:r>
-      <w:proofErr w:type="spellStart"/>
-      <w:r>
-        <w:rPr>
-          <w:lang w:val="en-GB"/>
-        </w:rPr>
-        <w:t>negativan</w:t>
-      </w:r>
-      <w:proofErr w:type="spellEnd"/>
-      <w:r>
-        <w:rPr>
-          <w:lang w:val="en-GB"/>
-        </w:rPr>
-        <w:t>" (Not negative), indicating its objective nature without inherent positive or negative sentiment.</w:t>
+        <w:t>" (a character resembling a star (*) used in printed texts), with lemma names including 'asterisk', 'zvezdica' (little star), and 'zvezda' (star). The sentiment for this synset was precisely classified as "Nije pozitivan" (Not positive) and "Nije negativan" (Not negative), indicating its objective nature without inherent positive or negative sentiment.</w:t>
       </w:r>
     </w:p>
     <w:p>
@@ -7044,152 +5607,109 @@
         <w:rPr>
           <w:lang w:val="en-GB"/>
         </w:rPr>
-        <w:t xml:space="preserve"> (one who loves and defends their country), with lemma names including '</w:t>
-      </w:r>
-      <w:proofErr w:type="spellStart"/>
-      <w:r>
-        <w:rPr>
-          <w:lang w:val="en-GB"/>
-        </w:rPr>
-        <w:t>domoljub</w:t>
-      </w:r>
-      <w:proofErr w:type="spellEnd"/>
-      <w:r>
-        <w:rPr>
-          <w:lang w:val="en-GB"/>
-        </w:rPr>
-        <w:t>' (patriot), '</w:t>
-      </w:r>
-      <w:proofErr w:type="spellStart"/>
-      <w:r>
-        <w:rPr>
-          <w:lang w:val="en-GB"/>
-        </w:rPr>
-        <w:t>patriota</w:t>
-      </w:r>
-      <w:proofErr w:type="spellEnd"/>
-      <w:r>
-        <w:rPr>
-          <w:lang w:val="en-GB"/>
-        </w:rPr>
-        <w:t>' (patriot), and '</w:t>
-      </w:r>
-      <w:proofErr w:type="spellStart"/>
-      <w:r>
-        <w:rPr>
-          <w:lang w:val="en-GB"/>
-        </w:rPr>
-        <w:t>rodoljub</w:t>
-      </w:r>
-      <w:proofErr w:type="spellEnd"/>
-      <w:r>
-        <w:rPr>
-          <w:lang w:val="en-GB"/>
-        </w:rPr>
-        <w:t>' (patriot). This synset's sentiment was finely graded as "</w:t>
-      </w:r>
-      <w:proofErr w:type="spellStart"/>
-      <w:r>
-        <w:rPr>
-          <w:lang w:val="en-GB"/>
-        </w:rPr>
-        <w:t>Veoma</w:t>
-      </w:r>
-      <w:proofErr w:type="spellEnd"/>
+        <w:t xml:space="preserve"> (one who loves and defends their country), with lemma names including 'domoljub' (patriot), 'patriota' (patriot), and 'rodoljub' (patriot). This synset's sentiment was finely graded as "Veoma pozitivan" (Very positive) and "Nije negativan" (Not negative), effectively capturing the positive connotations associated with patriotism.</w:t>
+      </w:r>
+    </w:p>
+    <w:p>
+      <w:pPr>
+        <w:pStyle w:val="Heading1"/>
+        <w:rPr>
+          <w:lang w:val="en-GB"/>
+        </w:rPr>
+      </w:pPr>
+      <w:r>
+        <w:rPr>
+          <w:lang w:val="en-GB"/>
+        </w:rPr>
+        <w:t>Conclusion</w:t>
+      </w:r>
+    </w:p>
+    <w:p>
+      <w:pPr>
+        <w:rPr>
+          <w:lang w:val="en-GB"/>
+        </w:rPr>
+      </w:pPr>
+      <w:r>
+        <w:rPr>
+          <w:lang w:val="en-GB"/>
+        </w:rPr>
+        <w:t>The analysis of the output generated by the LMM, specifically the Mistral model, indicates that 70 out of 75 responses met the acceptability criteria defined for this study. This outcome, representing a substantial majority of the dataset, underscores the Mistral model's reliability and efficacy in performing sentiment classification for the Serbian language. With an approximate success rate of 93.3%, it can be confidently concluded that the dataset is both workable and of sufficient quality for the intended task of evaluating proposed corrections to sentiment polarity within the Serbian WordNet.</w:t>
+      </w:r>
+    </w:p>
+    <w:p>
+      <w:pPr>
+        <w:rPr>
+          <w:lang w:val="en-GB"/>
+        </w:rPr>
+      </w:pPr>
+      <w:r>
+        <w:rPr>
+          <w:lang w:val="en-GB"/>
+        </w:rPr>
+        <w:t>A significant area for future investigation involves the augmentation of prompt templates with specific examples, transitioning the current zero-shot learning approach to a few-shot learning paradigm. This modification is anticipated to refine the model's capacity for nuanced sentiment gradation, offering a more precise and contextually aware analysis. It is particularly recommended that this enhancement be applied selectively to the fine sentiment graduation templates, where the potential for increased accuracy and sensitivity to linguistic subtleties is most pronounced</w:t>
+      </w:r>
       <w:r>
         <w:rPr>
           <w:lang w:val="en-GB"/>
         </w:rPr>
         <w:t xml:space="preserve"> </w:t>
       </w:r>
-      <w:proofErr w:type="spellStart"/>
-      <w:r>
-        <w:rPr>
-          <w:lang w:val="en-GB"/>
-        </w:rPr>
-        <w:t>pozitivan</w:t>
-      </w:r>
-      <w:proofErr w:type="spellEnd"/>
-      <w:r>
-        <w:rPr>
-          <w:lang w:val="en-GB"/>
-        </w:rPr>
-        <w:t>" (Very positive) and "</w:t>
-      </w:r>
-      <w:proofErr w:type="spellStart"/>
-      <w:r>
-        <w:rPr>
-          <w:lang w:val="en-GB"/>
-        </w:rPr>
-        <w:t>Nije</w:t>
-      </w:r>
-      <w:proofErr w:type="spellEnd"/>
+      <w:r>
+        <w:rPr>
+          <w:lang w:val="en-GB"/>
+        </w:rPr>
+        <w:fldChar w:fldCharType="begin"/>
+      </w:r>
+      <w:r>
+        <w:rPr>
+          <w:lang w:val="en-GB"/>
+        </w:rPr>
+        <w:instrText xml:space="preserve"> ADDIN ZOTERO_ITEM CSL_CITATION {"citationID":"hApc6zQU","properties":{"formattedCitation":"(Brown et al., 2020)","plainCitation":"(Brown et al., 2020)","noteIndex":0},"citationItems":[{"id":134,"uris":["http://zotero.org/users/11870508/items/VUMZ8S7S"],"itemData":{"id":134,"type":"article","abstract":"Recent work has demonstrated substantial gains on many NLP tasks and benchmarks by pre-training on a large corpus of text followed by fine-tuning on a specific task. While typically task-agnostic in architecture, this method still requires task-specific fine-tuning datasets of thousands or tens of thousands of examples. By contrast, humans can generally perform a new language task from only a few examples or from simple instructions - something which current NLP systems still largely struggle to do. Here we show that scaling up language models greatly improves task-agnostic, few-shot performance, sometimes even reaching competitiveness with prior state-of-the-art fine-tuning approaches. Specifically, we train GPT-3, an autoregressive language model with 175 billion parameters, 10x more than any previous non-sparse language model, and test its performance in the few-shot setting. For all tasks, GPT-3 is applied without any gradient updates or fine-tuning, with tasks and few-shot demonstrations specified purely via text interaction with the model. GPT-3 achieves strong performance on many NLP datasets, including translation, question-answering, and cloze tasks, as well as several tasks that require on-the-fly reasoning or domain adaptation, such as unscrambling words, using a novel word in a sentence, or performing 3-digit arithmetic. At the same time, we also identify some datasets where GPT-3's few-shot learning still struggles, as well as some datasets where GPT-3 faces methodological issues related to training on large web corpora. Finally, we find that GPT-3 can generate samples of news articles which human evaluators have difficulty distinguishing from articles written by humans. We discuss broader societal impacts of this finding and of GPT-3 in general.","DOI":"10.48550/arXiv.2005.14165","note":"arXiv:2005.14165 [cs]","number":"arXiv:2005.14165","publisher":"arXiv","source":"arXiv.org","title":"Language Models are Few-Shot Learners","URL":"http://arxiv.org/abs/2005.14165","author":[{"family":"Brown","given":"Tom B."},{"family":"Mann","given":"Benjamin"},{"family":"Ryder","given":"Nick"},{"family":"Subbiah","given":"Melanie"},{"family":"Kaplan","given":"Jared"},{"family":"Dhariwal","given":"Prafulla"},{"family":"Neelakantan","given":"Arvind"},{"family":"Shyam","given":"Pranav"},{"family":"Sastry","given":"Girish"},{"family":"Askell","given":"Amanda"},{"family":"Agarwal","given":"Sandhini"},{"family":"Herbert-Voss","given":"Ariel"},{"family":"Krueger","given":"Gretchen"},{"family":"Henighan","given":"Tom"},{"family":"Child","given":"Rewon"},{"family":"Ramesh","given":"Aditya"},{"family":"Ziegler","given":"Daniel M."},{"family":"Wu","given":"Jeffrey"},{"family":"Winter","given":"Clemens"},{"family":"Hesse","given":"Christopher"},{"family":"Chen","given":"Mark"},{"family":"Sigler","given":"Eric"},{"family":"Litwin","given":"Mateusz"},{"family":"Gray","given":"Scott"},{"family":"Chess","given":"Benjamin"},{"family":"Clark","given":"Jack"},{"family":"Berner","given":"Christopher"},{"family":"McCandlish","given":"Sam"},{"family":"Radford","given":"Alec"},{"family":"Sutskever","given":"Ilya"},{"family":"Amodei","given":"Dario"}],"accessed":{"date-parts":[["2024",2,8]]},"issued":{"date-parts":[["2020",7,22]]}}}],"schema":"https://github.com/citation-style-language/schema/raw/master/csl-citation.json"} </w:instrText>
+      </w:r>
+      <w:r>
+        <w:rPr>
+          <w:lang w:val="en-GB"/>
+        </w:rPr>
+        <w:fldChar w:fldCharType="separate"/>
+      </w:r>
+      <w:r>
+        <w:rPr>
+          <w:rFonts w:ascii="Calibri" w:hAnsi="Calibri" w:cs="Calibri"/>
+        </w:rPr>
+        <w:t>(Brown et al., 2020)</w:t>
+      </w:r>
+      <w:r>
+        <w:rPr>
+          <w:lang w:val="en-GB"/>
+        </w:rPr>
+        <w:fldChar w:fldCharType="end"/>
+      </w:r>
+      <w:r>
+        <w:rPr>
+          <w:lang w:val="en-GB"/>
+        </w:rPr>
+        <w:t>.</w:t>
+      </w:r>
+    </w:p>
+    <w:p>
+      <w:pPr>
+        <w:rPr>
+          <w:lang w:val="en-GB"/>
+        </w:rPr>
+      </w:pPr>
+      <w:r>
+        <w:rPr>
+          <w:lang w:val="en-GB"/>
+        </w:rPr>
+        <w:t>Further, the exploration of advanced prompting methodologies, such as the "chain-of-thought" approach, warrants attention. This technique, by facilitating a more structured and logical progression of thought within the model's processing, may significantly improve the model's ability to extract relevant data from responses. The potential of such advanced prompting strategies to overcome the inherent challenges in accurately identifying and classifying sentiment expressions within complex linguistic contexts presents a promising avenue for research</w:t>
+      </w:r>
       <w:r>
         <w:rPr>
           <w:lang w:val="en-GB"/>
         </w:rPr>
         <w:t xml:space="preserve"> </w:t>
       </w:r>
-      <w:proofErr w:type="spellStart"/>
-      <w:r>
-        <w:rPr>
-          <w:lang w:val="en-GB"/>
-        </w:rPr>
-        <w:t>negativan</w:t>
-      </w:r>
-      <w:proofErr w:type="spellEnd"/>
-      <w:r>
-        <w:rPr>
-          <w:lang w:val="en-GB"/>
-        </w:rPr>
-        <w:t>" (Not negative), effectively capturing the positive connotations associated with patriotism.</w:t>
-      </w:r>
-    </w:p>
-    <w:p>
-      <w:pPr>
-        <w:pStyle w:val="Heading1"/>
-        <w:rPr>
-          <w:lang w:val="en-GB"/>
-        </w:rPr>
-      </w:pPr>
-      <w:r>
-        <w:rPr>
-          <w:lang w:val="en-GB"/>
-        </w:rPr>
-        <w:t>Conclusion</w:t>
-      </w:r>
-    </w:p>
-    <w:p>
-      <w:pPr>
-        <w:rPr>
-          <w:lang w:val="en-GB"/>
-        </w:rPr>
-      </w:pPr>
-      <w:r>
-        <w:rPr>
-          <w:lang w:val="en-GB"/>
-        </w:rPr>
-        <w:t>The analysis of the output generated by the LMM, specifically the Mistral model, indicates that 70 out of 75 responses met the acceptability criteria defined for this study. This outcome, representing a substantial majority of the dataset, underscores the Mistral model's reliability and efficacy in performing sentiment classification for the Serbian language. With an approximate success rate of 93.3%, it can be confidently concluded that the dataset is both workable and of sufficient quality for the intended task of evaluating proposed corrections to sentiment polarity within the Serbian WordNet.</w:t>
-      </w:r>
-    </w:p>
-    <w:p>
-      <w:pPr>
-        <w:rPr>
-          <w:lang w:val="en-GB"/>
-        </w:rPr>
-      </w:pPr>
-      <w:r>
-        <w:rPr>
-          <w:lang w:val="en-GB"/>
-        </w:rPr>
-        <w:t>A significant area for future investigation involves the augmentation of prompt templates with specific examples, transitioning the current zero-shot learning approach to a few-shot learning paradigm. This modification is anticipated to refine the model's capacity for nuanced sentiment gradation, offering a more precise and contextually aware analysis. It is particularly recommended that this enhancement be applied selectively to the fine sentiment graduation templates, where the potential for increased accuracy and sensitivity to linguistic subtleties is most pronounced</w:t>
-      </w:r>
-      <w:r>
-        <w:rPr>
-          <w:lang w:val="en-GB"/>
-        </w:rPr>
-        <w:t xml:space="preserve"> </w:t>
-      </w:r>
       <w:r>
         <w:rPr>
           <w:lang w:val="en-GB"/>
@@ -7200,7 +5720,7 @@
         <w:rPr>
           <w:lang w:val="en-GB"/>
         </w:rPr>
-        <w:instrText xml:space="preserve"> ADDIN ZOTERO_ITEM CSL_CITATION {"citationID":"hApc6zQU","properties":{"formattedCitation":"(Brown et al., 2020)","plainCitation":"(Brown et al., 2020)","noteIndex":0},"citationItems":[{"id":134,"uris":["http://zotero.org/users/11870508/items/VUMZ8S7S"],"itemData":{"id":134,"type":"article","abstract":"Recent work has demonstrated substantial gains on many NLP tasks and benchmarks by pre-training on a large corpus of text followed by fine-tuning on a specific task. While typically task-agnostic in architecture, this method still requires task-specific fine-tuning datasets of thousands or tens of thousands of examples. By contrast, humans can generally perform a new language task from only a few examples or from simple instructions - something which current NLP systems still largely struggle to do. Here we show that scaling up language models greatly improves task-agnostic, few-shot performance, sometimes even reaching competitiveness with prior state-of-the-art fine-tuning approaches. Specifically, we train GPT-3, an autoregressive language model with 175 billion parameters, 10x more than any previous non-sparse language model, and test its performance in the few-shot setting. For all tasks, GPT-3 is applied without any gradient updates or fine-tuning, with tasks and few-shot demonstrations specified purely via text interaction with the model. GPT-3 achieves strong performance on many NLP datasets, including translation, question-answering, and cloze tasks, as well as several tasks that require on-the-fly reasoning or domain adaptation, such as unscrambling words, using a novel word in a sentence, or performing 3-digit arithmetic. At the same time, we also identify some datasets where GPT-3's few-shot learning still struggles, as well as some datasets where GPT-3 faces methodological issues related to training on large web corpora. Finally, we find that GPT-3 can generate samples of news articles which human evaluators have difficulty distinguishing from articles written by humans. We discuss broader societal impacts of this finding and of GPT-3 in general.","DOI":"10.48550/arXiv.2005.14165","note":"arXiv:2005.14165 [cs]","number":"arXiv:2005.14165","publisher":"arXiv","source":"arXiv.org","title":"Language Models are Few-Shot Learners","URL":"http://arxiv.org/abs/2005.14165","author":[{"family":"Brown","given":"Tom B."},{"family":"Mann","given":"Benjamin"},{"family":"Ryder","given":"Nick"},{"family":"Subbiah","given":"Melanie"},{"family":"Kaplan","given":"Jared"},{"family":"Dhariwal","given":"Prafulla"},{"family":"Neelakantan","given":"Arvind"},{"family":"Shyam","given":"Pranav"},{"family":"Sastry","given":"Girish"},{"family":"Askell","given":"Amanda"},{"family":"Agarwal","given":"Sandhini"},{"family":"Herbert-Voss","given":"Ariel"},{"family":"Krueger","given":"Gretchen"},{"family":"Henighan","given":"Tom"},{"family":"Child","given":"Rewon"},{"family":"Ramesh","given":"Aditya"},{"family":"Ziegler","given":"Daniel M."},{"family":"Wu","given":"Jeffrey"},{"family":"Winter","given":"Clemens"},{"family":"Hesse","given":"Christopher"},{"family":"Chen","given":"Mark"},{"family":"Sigler","given":"Eric"},{"family":"Litwin","given":"Mateusz"},{"family":"Gray","given":"Scott"},{"family":"Chess","given":"Benjamin"},{"family":"Clark","given":"Jack"},{"family":"Berner","given":"Christopher"},{"family":"McCandlish","given":"Sam"},{"family":"Radford","given":"Alec"},{"family":"Sutskever","given":"Ilya"},{"family":"Amodei","given":"Dario"}],"accessed":{"date-parts":[["2024",2,8]]},"issued":{"date-parts":[["2020",7,22]]}}}],"schema":"https://github.com/citation-style-language/schema/raw/master/csl-citation.json"} </w:instrText>
+        <w:instrText xml:space="preserve"> ADDIN ZOTERO_ITEM CSL_CITATION {"citationID":"6IJdFwUr","properties":{"formattedCitation":"(Amatriain, 2024)","plainCitation":"(Amatriain, 2024)","noteIndex":0},"citationItems":[{"id":129,"uris":["http://zotero.org/users/11870508/items/XXKFPK76"],"itemData":{"id":129,"type":"article","abstract":"Prompt design and engineering has become an important discipline in just the past few months. In this paper, we provide an introduction to the main concepts and design approaches. We also provide more advanced techniques all the way to those needed to design LLM-based agents. We finish by providing a list of existing tools for prompt engineering.","DOI":"10.48550/arXiv.2401.14423","note":"arXiv:2401.14423 [cs]","number":"arXiv:2401.14423","publisher":"arXiv","source":"arXiv.org","title":"Prompt Design and Engineering: Introduction and Advanced Methods","title-short":"Prompt Design and Engineering","URL":"http://arxiv.org/abs/2401.14423","author":[{"family":"Amatriain","given":"Xavier"}],"accessed":{"date-parts":[["2024",2,7]]},"issued":{"date-parts":[["2024",1,30]]}}}],"schema":"https://github.com/citation-style-language/schema/raw/master/csl-citation.json"} </w:instrText>
       </w:r>
       <w:r>
         <w:rPr>
@@ -7212,7 +5732,7 @@
         <w:rPr>
           <w:rFonts w:ascii="Calibri" w:hAnsi="Calibri" w:cs="Calibri"/>
         </w:rPr>
-        <w:t>(Brown et al., 2020)</w:t>
+        <w:t>(Amatriain, 2024)</w:t>
       </w:r>
       <w:r>
         <w:rPr>
@@ -7237,69 +5757,7 @@
         <w:rPr>
           <w:lang w:val="en-GB"/>
         </w:rPr>
-        <w:t>Further, the exploration of advanced prompting methodologies, such as the "chain-of-thought" approach, warrants attention. This technique, by facilitating a more structured and logical progression of thought within the model's processing, may significantly improve the model's ability to extract relevant data from responses. The potential of such advanced prompting strategies to overcome the inherent challenges in accurately identifying and classifying sentiment expressions within complex linguistic contexts presents a promising avenue for research</w:t>
-      </w:r>
-      <w:r>
-        <w:rPr>
-          <w:lang w:val="en-GB"/>
-        </w:rPr>
-        <w:t xml:space="preserve"> </w:t>
-      </w:r>
-      <w:r>
-        <w:rPr>
-          <w:lang w:val="en-GB"/>
-        </w:rPr>
-        <w:fldChar w:fldCharType="begin"/>
-      </w:r>
-      <w:r>
-        <w:rPr>
-          <w:lang w:val="en-GB"/>
-        </w:rPr>
-        <w:instrText xml:space="preserve"> ADDIN ZOTERO_ITEM CSL_CITATION {"citationID":"6IJdFwUr","properties":{"formattedCitation":"(Amatriain, 2024)","plainCitation":"(Amatriain, 2024)","noteIndex":0},"citationItems":[{"id":129,"uris":["http://zotero.org/users/11870508/items/XXKFPK76"],"itemData":{"id":129,"type":"article","abstract":"Prompt design and engineering has become an important discipline in just the past few months. In this paper, we provide an introduction to the main concepts and design approaches. We also provide more advanced techniques all the way to those needed to design LLM-based agents. We finish by providing a list of existing tools for prompt engineering.","DOI":"10.48550/arXiv.2401.14423","note":"arXiv:2401.14423 [cs]","number":"arXiv:2401.14423","publisher":"arXiv","source":"arXiv.org","title":"Prompt Design and Engineering: Introduction and Advanced Methods","title-short":"Prompt Design and Engineering","URL":"http://arxiv.org/abs/2401.14423","author":[{"family":"Amatriain","given":"Xavier"}],"accessed":{"date-parts":[["2024",2,7]]},"issued":{"date-parts":[["2024",1,30]]}}}],"schema":"https://github.com/citation-style-language/schema/raw/master/csl-citation.json"} </w:instrText>
-      </w:r>
-      <w:r>
-        <w:rPr>
-          <w:lang w:val="en-GB"/>
-        </w:rPr>
-        <w:fldChar w:fldCharType="separate"/>
-      </w:r>
-      <w:r>
-        <w:rPr>
-          <w:rFonts w:ascii="Calibri" w:hAnsi="Calibri" w:cs="Calibri"/>
-        </w:rPr>
-        <w:t>(Amatriain, 2024)</w:t>
-      </w:r>
-      <w:r>
-        <w:rPr>
-          <w:lang w:val="en-GB"/>
-        </w:rPr>
-        <w:fldChar w:fldCharType="end"/>
-      </w:r>
-      <w:r>
-        <w:rPr>
-          <w:lang w:val="en-GB"/>
-        </w:rPr>
-        <w:t>.</w:t>
-      </w:r>
-    </w:p>
-    <w:p>
-      <w:pPr>
-        <w:rPr>
-          <w:lang w:val="en-GB"/>
-        </w:rPr>
-      </w:pPr>
-      <w:r>
-        <w:rPr>
-          <w:lang w:val="en-GB"/>
-        </w:rPr>
-        <w:t xml:space="preserve">This study serves as a "proof-of-concept" for utilizing the Mistral model to generate additional synthetic datasets for Serbian, particularly in areas where resources are scarce or challenging to acquire from natural corpora. The morphological richness of the Serbian language, characterized by </w:t>
-      </w:r>
-      <w:r>
-        <w:rPr>
-          <w:lang w:val="en-GB"/>
-        </w:rPr>
-        <w:lastRenderedPageBreak/>
-        <w:t>its extensive inflectional system, poses a significant challenge in accurately capturing named entities across all possible flexions. The successful application of the Mistral model for sentiment analysis underscores its potential as a valuable tool in addressing these challenges.</w:t>
+        <w:t>This study serves as a "proof-of-concept" for utilizing the Mistral model to generate additional synthetic datasets for Serbian, particularly in areas where resources are scarce or challenging to acquire from natural corpora. The morphological richness of the Serbian language, characterized by its extensive inflectional system, poses a significant challenge in accurately capturing named entities across all possible flexions. The successful application of the Mistral model for sentiment analysis underscores its potential as a valuable tool in addressing these challenges.</w:t>
       </w:r>
     </w:p>
     <w:p>
@@ -7562,7 +6020,6 @@
         <w:rPr>
           <w:rFonts w:ascii="Calibri" w:hAnsi="Calibri" w:cs="Calibri"/>
         </w:rPr>
-        <w:lastRenderedPageBreak/>
         <w:t xml:space="preserve">Lu, Y., Shen, M., Wang, H., Wang, X., Rechem, C. van, &amp; Wei, W. (2024). </w:t>
       </w:r>
       <w:r>
@@ -7702,7 +6159,7 @@
 </file>
 
 <file path=word/endnotes.xml><?xml version="1.0" encoding="utf-8"?>
-<w:endnotes xmlns:wpc="http://schemas.microsoft.com/office/word/2010/wordprocessingCanvas" xmlns:cx="http://schemas.microsoft.com/office/drawing/2014/chartex" xmlns:cx1="http://schemas.microsoft.com/office/drawing/2015/9/8/chartex" xmlns:cx2="http://schemas.microsoft.com/office/drawing/2015/10/21/chartex" xmlns:cx3="http://schemas.microsoft.com/office/drawing/2016/5/9/chartex" xmlns:cx4="http://schemas.microsoft.com/office/drawing/2016/5/10/chartex" xmlns:cx5="http://schemas.microsoft.com/office/drawing/2016/5/11/chartex" xmlns:cx6="http://schemas.microsoft.com/office/drawing/2016/5/12/chartex" xmlns:cx7="http://schemas.microsoft.com/office/drawing/2016/5/13/chartex" xmlns:cx8="http://schemas.microsoft.com/office/drawing/2016/5/14/chartex" xmlns:mc="http://schemas.openxmlformats.org/markup-compatibility/2006" xmlns:aink="http://schemas.microsoft.com/office/drawing/2016/ink" xmlns:am3d="http://schemas.microsoft.com/office/drawing/2017/model3d" xmlns:o="urn:schemas-microsoft-com:office:office" xmlns:oel="http://schemas.microsoft.com/office/2019/extlst" xmlns:r="http://schemas.openxmlformats.org/officeDocument/2006/relationships" xmlns:m="http://schemas.openxmlformats.org/officeDocument/2006/math" xmlns:v="urn:schemas-microsoft-com:vml" xmlns:wp14="http://schemas.microsoft.com/office/word/2010/wordprocessingDrawing" xmlns:wp="http://schemas.openxmlformats.org/drawingml/2006/wordprocessingDrawing" xmlns:w10="urn:schemas-microsoft-com:office:word" xmlns:w="http://schemas.openxmlformats.org/wordprocessingml/2006/main" xmlns:w14="http://schemas.microsoft.com/office/word/2010/wordml" xmlns:w15="http://schemas.microsoft.com/office/word/2012/wordml" xmlns:w16cex="http://schemas.microsoft.com/office/word/2018/wordml/cex" xmlns:w16cid="http://schemas.microsoft.com/office/word/2016/wordml/cid" xmlns:w16="http://schemas.microsoft.com/office/word/2018/wordml" xmlns:w16sdtdh="http://schemas.microsoft.com/office/word/2020/wordml/sdtdatahash" xmlns:w16se="http://schemas.microsoft.com/office/word/2015/wordml/symex" xmlns:wpg="http://schemas.microsoft.com/office/word/2010/wordprocessingGroup" xmlns:wpi="http://schemas.microsoft.com/office/word/2010/wordprocessingInk" xmlns:wne="http://schemas.microsoft.com/office/word/2006/wordml" xmlns:wps="http://schemas.microsoft.com/office/word/2010/wordprocessingShape" mc:Ignorable="w14 w15 w16se w16cid w16 w16cex w16sdtdh wp14">
+<w:endnotes xmlns:wpc="http://schemas.microsoft.com/office/word/2010/wordprocessingCanvas" xmlns:cx="http://schemas.microsoft.com/office/drawing/2014/chartex" xmlns:cx1="http://schemas.microsoft.com/office/drawing/2015/9/8/chartex" xmlns:cx2="http://schemas.microsoft.com/office/drawing/2015/10/21/chartex" xmlns:cx3="http://schemas.microsoft.com/office/drawing/2016/5/9/chartex" xmlns:cx4="http://schemas.microsoft.com/office/drawing/2016/5/10/chartex" xmlns:cx5="http://schemas.microsoft.com/office/drawing/2016/5/11/chartex" xmlns:cx6="http://schemas.microsoft.com/office/drawing/2016/5/12/chartex" xmlns:cx7="http://schemas.microsoft.com/office/drawing/2016/5/13/chartex" xmlns:cx8="http://schemas.microsoft.com/office/drawing/2016/5/14/chartex" xmlns:mc="http://schemas.openxmlformats.org/markup-compatibility/2006" xmlns:aink="http://schemas.microsoft.com/office/drawing/2016/ink" xmlns:am3d="http://schemas.microsoft.com/office/drawing/2017/model3d" xmlns:o="urn:schemas-microsoft-com:office:office" xmlns:oel="http://schemas.microsoft.com/office/2019/extlst" xmlns:r="http://schemas.openxmlformats.org/officeDocument/2006/relationships" xmlns:m="http://schemas.openxmlformats.org/officeDocument/2006/math" xmlns:v="urn:schemas-microsoft-com:vml" xmlns:wp14="http://schemas.microsoft.com/office/word/2010/wordprocessingDrawing" xmlns:wp="http://schemas.openxmlformats.org/drawingml/2006/wordprocessingDrawing" xmlns:w10="urn:schemas-microsoft-com:office:word" xmlns:w="http://schemas.openxmlformats.org/wordprocessingml/2006/main" xmlns:w14="http://schemas.microsoft.com/office/word/2010/wordml" xmlns:w15="http://schemas.microsoft.com/office/word/2012/wordml" xmlns:w16cex="http://schemas.microsoft.com/office/word/2018/wordml/cex" xmlns:w16cid="http://schemas.microsoft.com/office/word/2016/wordml/cid" xmlns:w16="http://schemas.microsoft.com/office/word/2018/wordml" xmlns:w16du="http://schemas.microsoft.com/office/word/2023/wordml/word16du" xmlns:w16sdtdh="http://schemas.microsoft.com/office/word/2020/wordml/sdtdatahash" xmlns:w16se="http://schemas.microsoft.com/office/word/2015/wordml/symex" xmlns:wpg="http://schemas.microsoft.com/office/word/2010/wordprocessingGroup" xmlns:wpi="http://schemas.microsoft.com/office/word/2010/wordprocessingInk" xmlns:wne="http://schemas.microsoft.com/office/word/2006/wordml" xmlns:wps="http://schemas.microsoft.com/office/word/2010/wordprocessingShape" mc:Ignorable="w14 w15 w16se w16cid w16 w16cex w16sdtdh w16du wp14">
   <w:endnote w:type="separator" w:id="-1">
     <w:p>
       <w:pPr>
@@ -7727,7 +6184,7 @@
 </file>
 
 <file path=word/footnotes.xml><?xml version="1.0" encoding="utf-8"?>
-<w:footnotes xmlns:wpc="http://schemas.microsoft.com/office/word/2010/wordprocessingCanvas" xmlns:cx="http://schemas.microsoft.com/office/drawing/2014/chartex" xmlns:cx1="http://schemas.microsoft.com/office/drawing/2015/9/8/chartex" xmlns:cx2="http://schemas.microsoft.com/office/drawing/2015/10/21/chartex" xmlns:cx3="http://schemas.microsoft.com/office/drawing/2016/5/9/chartex" xmlns:cx4="http://schemas.microsoft.com/office/drawing/2016/5/10/chartex" xmlns:cx5="http://schemas.microsoft.com/office/drawing/2016/5/11/chartex" xmlns:cx6="http://schemas.microsoft.com/office/drawing/2016/5/12/chartex" xmlns:cx7="http://schemas.microsoft.com/office/drawing/2016/5/13/chartex" xmlns:cx8="http://schemas.microsoft.com/office/drawing/2016/5/14/chartex" xmlns:mc="http://schemas.openxmlformats.org/markup-compatibility/2006" xmlns:aink="http://schemas.microsoft.com/office/drawing/2016/ink" xmlns:am3d="http://schemas.microsoft.com/office/drawing/2017/model3d" xmlns:o="urn:schemas-microsoft-com:office:office" xmlns:oel="http://schemas.microsoft.com/office/2019/extlst" xmlns:r="http://schemas.openxmlformats.org/officeDocument/2006/relationships" xmlns:m="http://schemas.openxmlformats.org/officeDocument/2006/math" xmlns:v="urn:schemas-microsoft-com:vml" xmlns:wp14="http://schemas.microsoft.com/office/word/2010/wordprocessingDrawing" xmlns:wp="http://schemas.openxmlformats.org/drawingml/2006/wordprocessingDrawing" xmlns:w10="urn:schemas-microsoft-com:office:word" xmlns:w="http://schemas.openxmlformats.org/wordprocessingml/2006/main" xmlns:w14="http://schemas.microsoft.com/office/word/2010/wordml" xmlns:w15="http://schemas.microsoft.com/office/word/2012/wordml" xmlns:w16cex="http://schemas.microsoft.com/office/word/2018/wordml/cex" xmlns:w16cid="http://schemas.microsoft.com/office/word/2016/wordml/cid" xmlns:w16="http://schemas.microsoft.com/office/word/2018/wordml" xmlns:w16sdtdh="http://schemas.microsoft.com/office/word/2020/wordml/sdtdatahash" xmlns:w16se="http://schemas.microsoft.com/office/word/2015/wordml/symex" xmlns:wpg="http://schemas.microsoft.com/office/word/2010/wordprocessingGroup" xmlns:wpi="http://schemas.microsoft.com/office/word/2010/wordprocessingInk" xmlns:wne="http://schemas.microsoft.com/office/word/2006/wordml" xmlns:wps="http://schemas.microsoft.com/office/word/2010/wordprocessingShape" mc:Ignorable="w14 w15 w16se w16cid w16 w16cex w16sdtdh wp14">
+<w:footnotes xmlns:wpc="http://schemas.microsoft.com/office/word/2010/wordprocessingCanvas" xmlns:cx="http://schemas.microsoft.com/office/drawing/2014/chartex" xmlns:cx1="http://schemas.microsoft.com/office/drawing/2015/9/8/chartex" xmlns:cx2="http://schemas.microsoft.com/office/drawing/2015/10/21/chartex" xmlns:cx3="http://schemas.microsoft.com/office/drawing/2016/5/9/chartex" xmlns:cx4="http://schemas.microsoft.com/office/drawing/2016/5/10/chartex" xmlns:cx5="http://schemas.microsoft.com/office/drawing/2016/5/11/chartex" xmlns:cx6="http://schemas.microsoft.com/office/drawing/2016/5/12/chartex" xmlns:cx7="http://schemas.microsoft.com/office/drawing/2016/5/13/chartex" xmlns:cx8="http://schemas.microsoft.com/office/drawing/2016/5/14/chartex" xmlns:mc="http://schemas.openxmlformats.org/markup-compatibility/2006" xmlns:aink="http://schemas.microsoft.com/office/drawing/2016/ink" xmlns:am3d="http://schemas.microsoft.com/office/drawing/2017/model3d" xmlns:o="urn:schemas-microsoft-com:office:office" xmlns:oel="http://schemas.microsoft.com/office/2019/extlst" xmlns:r="http://schemas.openxmlformats.org/officeDocument/2006/relationships" xmlns:m="http://schemas.openxmlformats.org/officeDocument/2006/math" xmlns:v="urn:schemas-microsoft-com:vml" xmlns:wp14="http://schemas.microsoft.com/office/word/2010/wordprocessingDrawing" xmlns:wp="http://schemas.openxmlformats.org/drawingml/2006/wordprocessingDrawing" xmlns:w10="urn:schemas-microsoft-com:office:word" xmlns:w="http://schemas.openxmlformats.org/wordprocessingml/2006/main" xmlns:w14="http://schemas.microsoft.com/office/word/2010/wordml" xmlns:w15="http://schemas.microsoft.com/office/word/2012/wordml" xmlns:w16cex="http://schemas.microsoft.com/office/word/2018/wordml/cex" xmlns:w16cid="http://schemas.microsoft.com/office/word/2016/wordml/cid" xmlns:w16="http://schemas.microsoft.com/office/word/2018/wordml" xmlns:w16du="http://schemas.microsoft.com/office/word/2023/wordml/word16du" xmlns:w16sdtdh="http://schemas.microsoft.com/office/word/2020/wordml/sdtdatahash" xmlns:w16se="http://schemas.microsoft.com/office/word/2015/wordml/symex" xmlns:wpg="http://schemas.microsoft.com/office/word/2010/wordprocessingGroup" xmlns:wpi="http://schemas.microsoft.com/office/word/2010/wordprocessingInk" xmlns:wne="http://schemas.microsoft.com/office/word/2006/wordml" xmlns:wps="http://schemas.microsoft.com/office/word/2010/wordprocessingShape" mc:Ignorable="w14 w15 w16se w16cid w16 w16cex w16sdtdh w16du wp14">
   <w:footnote w:type="separator" w:id="-1">
     <w:p>
       <w:pPr>
@@ -7816,7 +6273,7 @@
       <w:pPr>
         <w:pStyle w:val="FootnoteText"/>
         <w:rPr>
-          <w:lang w:val="en-GB"/>
+          <w:lang w:val="it-IT"/>
         </w:rPr>
       </w:pPr>
       <w:r>
@@ -7828,42 +6285,17 @@
       </w:r>
       <w:r>
         <w:rPr>
-          <w:lang w:val="en-GB"/>
+          <w:lang w:val="it-IT"/>
         </w:rPr>
         <w:t xml:space="preserve"> </w:t>
       </w:r>
       <w:hyperlink r:id="rId3" w:history="1">
-        <w:proofErr w:type="spellStart"/>
         <w:r>
           <w:rPr>
             <w:rStyle w:val="Hyperlink"/>
-            <w:lang w:val="en-GB"/>
+            <w:lang w:val="it-IT"/>
           </w:rPr>
-          <w:t>microsoft</w:t>
-        </w:r>
-        <w:proofErr w:type="spellEnd"/>
-        <w:r>
-          <w:rPr>
-            <w:rStyle w:val="Hyperlink"/>
-            <w:lang w:val="en-GB"/>
-          </w:rPr>
-          <w:t>/</w:t>
-        </w:r>
-        <w:proofErr w:type="spellStart"/>
-        <w:r>
-          <w:rPr>
-            <w:rStyle w:val="Hyperlink"/>
-            <w:lang w:val="en-GB"/>
-          </w:rPr>
-          <w:t>vscode</w:t>
-        </w:r>
-        <w:proofErr w:type="spellEnd"/>
-        <w:r>
-          <w:rPr>
-            <w:rStyle w:val="Hyperlink"/>
-            <w:lang w:val="en-GB"/>
-          </w:rPr>
-          <w:t>-data-wrangler (github.com)</w:t>
+          <w:t>microsoft/vscode-data-wrangler (github.com)</w:t>
         </w:r>
       </w:hyperlink>
     </w:p>
@@ -7872,7 +6304,7 @@
 </file>
 
 <file path=word/numbering.xml><?xml version="1.0" encoding="utf-8"?>
-<w:numbering xmlns:wpc="http://schemas.microsoft.com/office/word/2010/wordprocessingCanvas" xmlns:cx="http://schemas.microsoft.com/office/drawing/2014/chartex" xmlns:cx1="http://schemas.microsoft.com/office/drawing/2015/9/8/chartex" xmlns:cx2="http://schemas.microsoft.com/office/drawing/2015/10/21/chartex" xmlns:cx3="http://schemas.microsoft.com/office/drawing/2016/5/9/chartex" xmlns:cx4="http://schemas.microsoft.com/office/drawing/2016/5/10/chartex" xmlns:cx5="http://schemas.microsoft.com/office/drawing/2016/5/11/chartex" xmlns:cx6="http://schemas.microsoft.com/office/drawing/2016/5/12/chartex" xmlns:cx7="http://schemas.microsoft.com/office/drawing/2016/5/13/chartex" xmlns:cx8="http://schemas.microsoft.com/office/drawing/2016/5/14/chartex" xmlns:mc="http://schemas.openxmlformats.org/markup-compatibility/2006" xmlns:aink="http://schemas.microsoft.com/office/drawing/2016/ink" xmlns:am3d="http://schemas.microsoft.com/office/drawing/2017/model3d" xmlns:o="urn:schemas-microsoft-com:office:office" xmlns:oel="http://schemas.microsoft.com/office/2019/extlst" xmlns:r="http://schemas.openxmlformats.org/officeDocument/2006/relationships" xmlns:m="http://schemas.openxmlformats.org/officeDocument/2006/math" xmlns:v="urn:schemas-microsoft-com:vml" xmlns:wp14="http://schemas.microsoft.com/office/word/2010/wordprocessingDrawing" xmlns:wp="http://schemas.openxmlformats.org/drawingml/2006/wordprocessingDrawing" xmlns:w10="urn:schemas-microsoft-com:office:word" xmlns:w="http://schemas.openxmlformats.org/wordprocessingml/2006/main" xmlns:w14="http://schemas.microsoft.com/office/word/2010/wordml" xmlns:w15="http://schemas.microsoft.com/office/word/2012/wordml" xmlns:w16cex="http://schemas.microsoft.com/office/word/2018/wordml/cex" xmlns:w16cid="http://schemas.microsoft.com/office/word/2016/wordml/cid" xmlns:w16="http://schemas.microsoft.com/office/word/2018/wordml" xmlns:w16sdtdh="http://schemas.microsoft.com/office/word/2020/wordml/sdtdatahash" xmlns:w16se="http://schemas.microsoft.com/office/word/2015/wordml/symex" xmlns:wpg="http://schemas.microsoft.com/office/word/2010/wordprocessingGroup" xmlns:wpi="http://schemas.microsoft.com/office/word/2010/wordprocessingInk" xmlns:wne="http://schemas.microsoft.com/office/word/2006/wordml" xmlns:wps="http://schemas.microsoft.com/office/word/2010/wordprocessingShape" mc:Ignorable="w14 w15 w16se w16cid w16 w16cex w16sdtdh wp14">
+<w:numbering xmlns:wpc="http://schemas.microsoft.com/office/word/2010/wordprocessingCanvas" xmlns:cx="http://schemas.microsoft.com/office/drawing/2014/chartex" xmlns:cx1="http://schemas.microsoft.com/office/drawing/2015/9/8/chartex" xmlns:cx2="http://schemas.microsoft.com/office/drawing/2015/10/21/chartex" xmlns:cx3="http://schemas.microsoft.com/office/drawing/2016/5/9/chartex" xmlns:cx4="http://schemas.microsoft.com/office/drawing/2016/5/10/chartex" xmlns:cx5="http://schemas.microsoft.com/office/drawing/2016/5/11/chartex" xmlns:cx6="http://schemas.microsoft.com/office/drawing/2016/5/12/chartex" xmlns:cx7="http://schemas.microsoft.com/office/drawing/2016/5/13/chartex" xmlns:cx8="http://schemas.microsoft.com/office/drawing/2016/5/14/chartex" xmlns:mc="http://schemas.openxmlformats.org/markup-compatibility/2006" xmlns:aink="http://schemas.microsoft.com/office/drawing/2016/ink" xmlns:am3d="http://schemas.microsoft.com/office/drawing/2017/model3d" xmlns:o="urn:schemas-microsoft-com:office:office" xmlns:oel="http://schemas.microsoft.com/office/2019/extlst" xmlns:r="http://schemas.openxmlformats.org/officeDocument/2006/relationships" xmlns:m="http://schemas.openxmlformats.org/officeDocument/2006/math" xmlns:v="urn:schemas-microsoft-com:vml" xmlns:wp14="http://schemas.microsoft.com/office/word/2010/wordprocessingDrawing" xmlns:wp="http://schemas.openxmlformats.org/drawingml/2006/wordprocessingDrawing" xmlns:w10="urn:schemas-microsoft-com:office:word" xmlns:w="http://schemas.openxmlformats.org/wordprocessingml/2006/main" xmlns:w14="http://schemas.microsoft.com/office/word/2010/wordml" xmlns:w15="http://schemas.microsoft.com/office/word/2012/wordml" xmlns:w16cex="http://schemas.microsoft.com/office/word/2018/wordml/cex" xmlns:w16cid="http://schemas.microsoft.com/office/word/2016/wordml/cid" xmlns:w16="http://schemas.microsoft.com/office/word/2018/wordml" xmlns:w16du="http://schemas.microsoft.com/office/word/2023/wordml/word16du" xmlns:w16sdtdh="http://schemas.microsoft.com/office/word/2020/wordml/sdtdatahash" xmlns:w16se="http://schemas.microsoft.com/office/word/2015/wordml/symex" xmlns:wpg="http://schemas.microsoft.com/office/word/2010/wordprocessingGroup" xmlns:wpi="http://schemas.microsoft.com/office/word/2010/wordprocessingInk" xmlns:wne="http://schemas.microsoft.com/office/word/2006/wordml" xmlns:wps="http://schemas.microsoft.com/office/word/2010/wordprocessingShape" mc:Ignorable="w14 w15 w16se w16cid w16 w16cex w16sdtdh w16du wp14">
   <w:abstractNum w:abstractNumId="0" w15:restartNumberingAfterBreak="0">
     <w:nsid w:val="0D633479"/>
     <w:multiLevelType w:val="multilevel"/>
@@ -10075,7 +8507,7 @@
 </file>
 
 <file path=word/styles.xml><?xml version="1.0" encoding="utf-8"?>
-<w:styles xmlns:mc="http://schemas.openxmlformats.org/markup-compatibility/2006" xmlns:r="http://schemas.openxmlformats.org/officeDocument/2006/relationships" xmlns:w="http://schemas.openxmlformats.org/wordprocessingml/2006/main" xmlns:w14="http://schemas.microsoft.com/office/word/2010/wordml" xmlns:w15="http://schemas.microsoft.com/office/word/2012/wordml" xmlns:w16cex="http://schemas.microsoft.com/office/word/2018/wordml/cex" xmlns:w16cid="http://schemas.microsoft.com/office/word/2016/wordml/cid" xmlns:w16="http://schemas.microsoft.com/office/word/2018/wordml" xmlns:w16sdtdh="http://schemas.microsoft.com/office/word/2020/wordml/sdtdatahash" xmlns:w16se="http://schemas.microsoft.com/office/word/2015/wordml/symex" mc:Ignorable="w14 w15 w16se w16cid w16 w16cex w16sdtdh">
+<w:styles xmlns:mc="http://schemas.openxmlformats.org/markup-compatibility/2006" xmlns:r="http://schemas.openxmlformats.org/officeDocument/2006/relationships" xmlns:w="http://schemas.openxmlformats.org/wordprocessingml/2006/main" xmlns:w14="http://schemas.microsoft.com/office/word/2010/wordml" xmlns:w15="http://schemas.microsoft.com/office/word/2012/wordml" xmlns:w16cex="http://schemas.microsoft.com/office/word/2018/wordml/cex" xmlns:w16cid="http://schemas.microsoft.com/office/word/2016/wordml/cid" xmlns:w16="http://schemas.microsoft.com/office/word/2018/wordml" xmlns:w16du="http://schemas.microsoft.com/office/word/2023/wordml/word16du" xmlns:w16sdtdh="http://schemas.microsoft.com/office/word/2020/wordml/sdtdatahash" xmlns:w16se="http://schemas.microsoft.com/office/word/2015/wordml/symex" mc:Ignorable="w14 w15 w16se w16cid w16 w16cex w16sdtdh w16du">
   <w:docDefaults>
     <w:rPrDefault>
       <w:rPr>
@@ -10677,6 +9109,7 @@
   <w:style w:type="character" w:default="1" w:styleId="DefaultParagraphFont">
     <w:name w:val="Default Paragraph Font"/>
     <w:uiPriority w:val="1"/>
+    <w:semiHidden/>
     <w:unhideWhenUsed/>
   </w:style>
   <w:style w:type="table" w:default="1" w:styleId="TableNormal">

</xml_diff>